<commit_message>
docs: Email-Copys.docx — body como texto de corrido (sin '>')
Antes: cada linea del body aparecia con el '>' literal de markdown
y se leia "bot-like". Feedback Nicolas 2026-06-24.

Ahora: cada linea del body es un parrafo italic + gris suave,
sin el '>'. Se lee como mail real (saludo, body, closing, boton)
en lugar de raw source.
</commit_message>
<xml_diff>
--- a/docs/email-review/Email-Copys.docx
+++ b/docs/email-review/Email-Copys.docx
@@ -13,33 +13,39 @@
     <w:p/>
     <w:p>
       <w:pPr>
+        <w:spacing w:after="80"/>
         <w:ind w:left="480"/>
       </w:pPr>
       <w:r>
         <w:rPr>
-          <w:color w:val="444444"/>
+          <w:i/>
+          <w:color w:val="555555"/>
         </w:rPr>
         <w:t>Listado plano de todos los emails transaccionales que manda el ATS.</w:t>
       </w:r>
     </w:p>
     <w:p>
       <w:pPr>
+        <w:spacing w:after="80"/>
         <w:ind w:left="480"/>
       </w:pPr>
       <w:r>
         <w:rPr>
-          <w:color w:val="444444"/>
+          <w:i/>
+          <w:color w:val="555555"/>
         </w:rPr>
         <w:t>Variables entre {llaves} se reemplazan en tiempo de envío.</w:t>
       </w:r>
     </w:p>
     <w:p>
       <w:pPr>
+        <w:spacing w:after="80"/>
         <w:ind w:left="480"/>
       </w:pPr>
       <w:r>
         <w:rPr>
-          <w:color w:val="444444"/>
+          <w:i/>
+          <w:color w:val="555555"/>
         </w:rPr>
         <w:t>Todos estos están live en producción ahora mismo.</w:t>
       </w:r>
@@ -47,22 +53,26 @@
     <w:p/>
     <w:p>
       <w:pPr>
+        <w:spacing w:after="80"/>
         <w:ind w:left="480"/>
       </w:pPr>
       <w:r>
         <w:rPr>
-          <w:color w:val="444444"/>
+          <w:i/>
+          <w:color w:val="555555"/>
         </w:rPr>
         <w:t>Para revisar y cambiar con Ari. Cuando definan los nuevos copys,</w:t>
       </w:r>
     </w:p>
     <w:p>
       <w:pPr>
+        <w:spacing w:after="80"/>
         <w:ind w:left="480"/>
       </w:pPr>
       <w:r>
         <w:rPr>
-          <w:color w:val="444444"/>
+          <w:i/>
+          <w:color w:val="555555"/>
         </w:rPr>
         <w:t>los cambio en lib/email.ts en un solo PR.</w:t>
       </w:r>
@@ -116,23 +126,55 @@
       </w:r>
     </w:p>
     <w:p>
-      <w:r>
-        <w:t xml:space="preserve">  &gt; Hi {firstName},</w:t>
-      </w:r>
-    </w:p>
-    <w:p>
-      <w:r>
-        <w:t xml:space="preserve">  &gt; Thanks for signing up. Click the button to confirm this is your email.</w:t>
-      </w:r>
-    </w:p>
-    <w:p>
-      <w:r>
-        <w:t xml:space="preserve">  &gt; This link expires in 24 hours.</w:t>
-      </w:r>
-    </w:p>
-    <w:p>
-      <w:r>
-        <w:t xml:space="preserve">  &gt; [Button: Verify Email]</w:t>
+      <w:pPr>
+        <w:spacing w:after="80"/>
+        <w:ind w:left="480"/>
+      </w:pPr>
+      <w:r>
+        <w:rPr>
+          <w:i/>
+          <w:color w:val="555555"/>
+        </w:rPr>
+        <w:t>Hi {firstName},</w:t>
+      </w:r>
+    </w:p>
+    <w:p>
+      <w:pPr>
+        <w:spacing w:after="80"/>
+        <w:ind w:left="480"/>
+      </w:pPr>
+      <w:r>
+        <w:rPr>
+          <w:i/>
+          <w:color w:val="555555"/>
+        </w:rPr>
+        <w:t>Thanks for signing up. Click the button to confirm this is your email.</w:t>
+      </w:r>
+    </w:p>
+    <w:p>
+      <w:pPr>
+        <w:spacing w:after="80"/>
+        <w:ind w:left="480"/>
+      </w:pPr>
+      <w:r>
+        <w:rPr>
+          <w:i/>
+          <w:color w:val="555555"/>
+        </w:rPr>
+        <w:t>This link expires in 24 hours.</w:t>
+      </w:r>
+    </w:p>
+    <w:p>
+      <w:pPr>
+        <w:spacing w:after="80"/>
+        <w:ind w:left="480"/>
+      </w:pPr>
+      <w:r>
+        <w:rPr>
+          <w:i/>
+          <w:color w:val="555555"/>
+        </w:rPr>
+        <w:t>[Button: Verify Email]</w:t>
       </w:r>
     </w:p>
     <w:p/>
@@ -169,28 +211,68 @@
       </w:r>
     </w:p>
     <w:p>
-      <w:r>
-        <w:t xml:space="preserve">  &gt; You're in, {firstName}</w:t>
-      </w:r>
-    </w:p>
-    <w:p>
-      <w:r>
-        <w:t xml:space="preserve">  &gt; {orgName} is live on Recruiting ATS. Take a look around — we'll send you a short getting-started note in a bit.</w:t>
-      </w:r>
-    </w:p>
-    <w:p>
-      <w:r>
-        <w:t xml:space="preserve">  &gt; Your free trial runs until {date}. We won't charge until it ends — cancel any time before then and you won't be billed.</w:t>
-      </w:r>
-    </w:p>
-    <w:p>
-      <w:r>
-        <w:t xml:space="preserve">  &gt; Reply to this email if anything's confusing or missing — we read every message.</w:t>
-      </w:r>
-    </w:p>
-    <w:p>
-      <w:r>
-        <w:t xml:space="preserve">  &gt; [Button: Open Dashboard]</w:t>
+      <w:pPr>
+        <w:spacing w:after="80"/>
+        <w:ind w:left="480"/>
+      </w:pPr>
+      <w:r>
+        <w:rPr>
+          <w:i/>
+          <w:color w:val="555555"/>
+        </w:rPr>
+        <w:t>You're in, {firstName}</w:t>
+      </w:r>
+    </w:p>
+    <w:p>
+      <w:pPr>
+        <w:spacing w:after="80"/>
+        <w:ind w:left="480"/>
+      </w:pPr>
+      <w:r>
+        <w:rPr>
+          <w:i/>
+          <w:color w:val="555555"/>
+        </w:rPr>
+        <w:t>{orgName} is live on Recruiting ATS. Take a look around — we'll send you a short getting-started note in a bit.</w:t>
+      </w:r>
+    </w:p>
+    <w:p>
+      <w:pPr>
+        <w:spacing w:after="80"/>
+        <w:ind w:left="480"/>
+      </w:pPr>
+      <w:r>
+        <w:rPr>
+          <w:i/>
+          <w:color w:val="555555"/>
+        </w:rPr>
+        <w:t>Your free trial runs until {date}. We won't charge until it ends — cancel any time before then and you won't be billed.</w:t>
+      </w:r>
+    </w:p>
+    <w:p>
+      <w:pPr>
+        <w:spacing w:after="80"/>
+        <w:ind w:left="480"/>
+      </w:pPr>
+      <w:r>
+        <w:rPr>
+          <w:i/>
+          <w:color w:val="555555"/>
+        </w:rPr>
+        <w:t>Reply to this email if anything's confusing or missing — we read every message.</w:t>
+      </w:r>
+    </w:p>
+    <w:p>
+      <w:pPr>
+        <w:spacing w:after="80"/>
+        <w:ind w:left="480"/>
+      </w:pPr>
+      <w:r>
+        <w:rPr>
+          <w:i/>
+          <w:color w:val="555555"/>
+        </w:rPr>
+        <w:t>[Button: Open Dashboard]</w:t>
       </w:r>
     </w:p>
     <w:p/>
@@ -227,38 +309,94 @@
       </w:r>
     </w:p>
     <w:p>
-      <w:r>
-        <w:t xml:space="preserve">  &gt; {firstName}, here's the fastest path to your first placement</w:t>
-      </w:r>
-    </w:p>
-    <w:p>
-      <w:r>
-        <w:t xml:space="preserve">  &gt; Now that you've had a chance to look around {orgName}, three things worth doing this week:</w:t>
-      </w:r>
-    </w:p>
-    <w:p>
-      <w:r>
-        <w:t xml:space="preserve">  &gt; 1. Add your first client — set fee structure + payment terms once, reuse for every search.</w:t>
-      </w:r>
-    </w:p>
-    <w:p>
-      <w:r>
-        <w:t xml:space="preserve">  &gt; 2. Post your first job — upload the JD and the parser fills the form for you.</w:t>
-      </w:r>
-    </w:p>
-    <w:p>
-      <w:r>
-        <w:t xml:space="preserve">  &gt; 3. Invite a teammate — collaborate on the same pipeline + share notes.</w:t>
-      </w:r>
-    </w:p>
-    <w:p>
-      <w:r>
-        <w:t xml:space="preserve">  &gt; Reply to this email if anything's confusing or missing — we read every message and ship fast.</w:t>
-      </w:r>
-    </w:p>
-    <w:p>
-      <w:r>
-        <w:t xml:space="preserve">  &gt; [Button: Open Dashboard]</w:t>
+      <w:pPr>
+        <w:spacing w:after="80"/>
+        <w:ind w:left="480"/>
+      </w:pPr>
+      <w:r>
+        <w:rPr>
+          <w:i/>
+          <w:color w:val="555555"/>
+        </w:rPr>
+        <w:t>{firstName}, here's the fastest path to your first placement</w:t>
+      </w:r>
+    </w:p>
+    <w:p>
+      <w:pPr>
+        <w:spacing w:after="80"/>
+        <w:ind w:left="480"/>
+      </w:pPr>
+      <w:r>
+        <w:rPr>
+          <w:i/>
+          <w:color w:val="555555"/>
+        </w:rPr>
+        <w:t>Now that you've had a chance to look around {orgName}, three things worth doing this week:</w:t>
+      </w:r>
+    </w:p>
+    <w:p>
+      <w:pPr>
+        <w:spacing w:after="80"/>
+        <w:ind w:left="480"/>
+      </w:pPr>
+      <w:r>
+        <w:rPr>
+          <w:i/>
+          <w:color w:val="555555"/>
+        </w:rPr>
+        <w:t>1. Add your first client — set fee structure + payment terms once, reuse for every search.</w:t>
+      </w:r>
+    </w:p>
+    <w:p>
+      <w:pPr>
+        <w:spacing w:after="80"/>
+        <w:ind w:left="480"/>
+      </w:pPr>
+      <w:r>
+        <w:rPr>
+          <w:i/>
+          <w:color w:val="555555"/>
+        </w:rPr>
+        <w:t>2. Post your first job — upload the JD and the parser fills the form for you.</w:t>
+      </w:r>
+    </w:p>
+    <w:p>
+      <w:pPr>
+        <w:spacing w:after="80"/>
+        <w:ind w:left="480"/>
+      </w:pPr>
+      <w:r>
+        <w:rPr>
+          <w:i/>
+          <w:color w:val="555555"/>
+        </w:rPr>
+        <w:t>3. Invite a teammate — collaborate on the same pipeline + share notes.</w:t>
+      </w:r>
+    </w:p>
+    <w:p>
+      <w:pPr>
+        <w:spacing w:after="80"/>
+        <w:ind w:left="480"/>
+      </w:pPr>
+      <w:r>
+        <w:rPr>
+          <w:i/>
+          <w:color w:val="555555"/>
+        </w:rPr>
+        <w:t>Reply to this email if anything's confusing or missing — we read every message and ship fast.</w:t>
+      </w:r>
+    </w:p>
+    <w:p>
+      <w:pPr>
+        <w:spacing w:after="80"/>
+        <w:ind w:left="480"/>
+      </w:pPr>
+      <w:r>
+        <w:rPr>
+          <w:i/>
+          <w:color w:val="555555"/>
+        </w:rPr>
+        <w:t>[Button: Open Dashboard]</w:t>
       </w:r>
     </w:p>
     <w:p/>
@@ -295,23 +433,55 @@
       </w:r>
     </w:p>
     <w:p>
-      <w:r>
-        <w:t xml:space="preserve">  &gt; Hi {firstName},</w:t>
-      </w:r>
-    </w:p>
-    <w:p>
-      <w:r>
-        <w:t xml:space="preserve">  &gt; We received a request to reset your Recruiting ATS password. Click the button below to choose a new one. This link expires in 1 hour.</w:t>
-      </w:r>
-    </w:p>
-    <w:p>
-      <w:r>
-        <w:t xml:space="preserve">  &gt; If you didn't request this, ignore — your password stays unchanged.</w:t>
-      </w:r>
-    </w:p>
-    <w:p>
-      <w:r>
-        <w:t xml:space="preserve">  &gt; [Button: Reset Password]</w:t>
+      <w:pPr>
+        <w:spacing w:after="80"/>
+        <w:ind w:left="480"/>
+      </w:pPr>
+      <w:r>
+        <w:rPr>
+          <w:i/>
+          <w:color w:val="555555"/>
+        </w:rPr>
+        <w:t>Hi {firstName},</w:t>
+      </w:r>
+    </w:p>
+    <w:p>
+      <w:pPr>
+        <w:spacing w:after="80"/>
+        <w:ind w:left="480"/>
+      </w:pPr>
+      <w:r>
+        <w:rPr>
+          <w:i/>
+          <w:color w:val="555555"/>
+        </w:rPr>
+        <w:t>We received a request to reset your Recruiting ATS password. Click the button below to choose a new one. This link expires in 1 hour.</w:t>
+      </w:r>
+    </w:p>
+    <w:p>
+      <w:pPr>
+        <w:spacing w:after="80"/>
+        <w:ind w:left="480"/>
+      </w:pPr>
+      <w:r>
+        <w:rPr>
+          <w:i/>
+          <w:color w:val="555555"/>
+        </w:rPr>
+        <w:t>If you didn't request this, ignore — your password stays unchanged.</w:t>
+      </w:r>
+    </w:p>
+    <w:p>
+      <w:pPr>
+        <w:spacing w:after="80"/>
+        <w:ind w:left="480"/>
+      </w:pPr>
+      <w:r>
+        <w:rPr>
+          <w:i/>
+          <w:color w:val="555555"/>
+        </w:rPr>
+        <w:t>[Button: Reset Password]</w:t>
       </w:r>
     </w:p>
     <w:p/>
@@ -363,42 +533,81 @@
       </w:r>
     </w:p>
     <w:p>
-      <w:r>
-        <w:t xml:space="preserve">  &gt; You've been invited to join {orgName}</w:t>
-      </w:r>
-    </w:p>
-    <w:p>
-      <w:r>
-        <w:t xml:space="preserve">  &gt; Hi {firstName},</w:t>
-      </w:r>
-    </w:p>
-    <w:p>
-      <w:r>
-        <w:t xml:space="preserve">  &gt; </w:t>
-      </w:r>
+      <w:pPr>
+        <w:spacing w:after="80"/>
+        <w:ind w:left="480"/>
+      </w:pPr>
       <w:r>
         <w:rPr>
-          <w:b/>
+          <w:i/>
+          <w:color w:val="555555"/>
         </w:rPr>
-        <w:t>{inviterName}</w:t>
-      </w:r>
-      <w:r>
-        <w:t xml:space="preserve"> invited you to collaborate on Recruiting ATS.</w:t>
-      </w:r>
-    </w:p>
-    <w:p>
-      <w:r>
-        <w:t xml:space="preserve">  &gt; Recruiting ATS is where {orgName} runs their searches — accept to join the team there.</w:t>
-      </w:r>
-    </w:p>
-    <w:p>
-      <w:r>
-        <w:t xml:space="preserve">  &gt; This link expires in 7 days.</w:t>
-      </w:r>
-    </w:p>
-    <w:p>
-      <w:r>
-        <w:t xml:space="preserve">  &gt; [Button: Accept Invitation]</w:t>
+        <w:t>You've been invited to join {orgName}</w:t>
+      </w:r>
+    </w:p>
+    <w:p>
+      <w:pPr>
+        <w:spacing w:after="80"/>
+        <w:ind w:left="480"/>
+      </w:pPr>
+      <w:r>
+        <w:rPr>
+          <w:i/>
+          <w:color w:val="555555"/>
+        </w:rPr>
+        <w:t>Hi {firstName},</w:t>
+      </w:r>
+    </w:p>
+    <w:p>
+      <w:pPr>
+        <w:spacing w:after="80"/>
+        <w:ind w:left="480"/>
+      </w:pPr>
+      <w:r>
+        <w:rPr>
+          <w:i/>
+          <w:color w:val="555555"/>
+        </w:rPr>
+        <w:t>{inviterName} invited you to collaborate on Recruiting ATS.</w:t>
+      </w:r>
+    </w:p>
+    <w:p>
+      <w:pPr>
+        <w:spacing w:after="80"/>
+        <w:ind w:left="480"/>
+      </w:pPr>
+      <w:r>
+        <w:rPr>
+          <w:i/>
+          <w:color w:val="555555"/>
+        </w:rPr>
+        <w:t>Recruiting ATS is where {orgName} runs their searches — accept to join the team there.</w:t>
+      </w:r>
+    </w:p>
+    <w:p>
+      <w:pPr>
+        <w:spacing w:after="80"/>
+        <w:ind w:left="480"/>
+      </w:pPr>
+      <w:r>
+        <w:rPr>
+          <w:i/>
+          <w:color w:val="555555"/>
+        </w:rPr>
+        <w:t>This link expires in 7 days.</w:t>
+      </w:r>
+    </w:p>
+    <w:p>
+      <w:pPr>
+        <w:spacing w:after="80"/>
+        <w:ind w:left="480"/>
+      </w:pPr>
+      <w:r>
+        <w:rPr>
+          <w:i/>
+          <w:color w:val="555555"/>
+        </w:rPr>
+        <w:t>[Button: Accept Invitation]</w:t>
       </w:r>
     </w:p>
     <w:p/>
@@ -435,37 +644,68 @@
       </w:r>
     </w:p>
     <w:p>
-      <w:r>
-        <w:t xml:space="preserve">  &gt; Welcome to {orgName} on Recruiting ATS</w:t>
-      </w:r>
-    </w:p>
-    <w:p>
-      <w:r>
-        <w:t xml:space="preserve">  &gt; Hi {firstName},</w:t>
-      </w:r>
-    </w:p>
-    <w:p>
-      <w:r>
-        <w:t xml:space="preserve">  &gt; Your Recruiting ATS account at </w:t>
-      </w:r>
+      <w:pPr>
+        <w:spacing w:after="80"/>
+        <w:ind w:left="480"/>
+      </w:pPr>
       <w:r>
         <w:rPr>
-          <w:b/>
+          <w:i/>
+          <w:color w:val="555555"/>
         </w:rPr>
-        <w:t>{orgName}</w:t>
-      </w:r>
-      <w:r>
-        <w:t xml:space="preserve"> is now active and your email has been confirmed. You can sign in any time at the link below.</w:t>
-      </w:r>
-    </w:p>
-    <w:p>
-      <w:r>
-        <w:t xml:space="preserve">  &gt; From the dashboard you'll see the searches you're assigned to, candidates in flight, and your team's recent activity.</w:t>
-      </w:r>
-    </w:p>
-    <w:p>
-      <w:r>
-        <w:t xml:space="preserve">  &gt; [Button: Open Dashboard]</w:t>
+        <w:t>Welcome to {orgName} on Recruiting ATS</w:t>
+      </w:r>
+    </w:p>
+    <w:p>
+      <w:pPr>
+        <w:spacing w:after="80"/>
+        <w:ind w:left="480"/>
+      </w:pPr>
+      <w:r>
+        <w:rPr>
+          <w:i/>
+          <w:color w:val="555555"/>
+        </w:rPr>
+        <w:t>Hi {firstName},</w:t>
+      </w:r>
+    </w:p>
+    <w:p>
+      <w:pPr>
+        <w:spacing w:after="80"/>
+        <w:ind w:left="480"/>
+      </w:pPr>
+      <w:r>
+        <w:rPr>
+          <w:i/>
+          <w:color w:val="555555"/>
+        </w:rPr>
+        <w:t>Your Recruiting ATS account at {orgName} is now active and your email has been confirmed. You can sign in any time at the link below.</w:t>
+      </w:r>
+    </w:p>
+    <w:p>
+      <w:pPr>
+        <w:spacing w:after="80"/>
+        <w:ind w:left="480"/>
+      </w:pPr>
+      <w:r>
+        <w:rPr>
+          <w:i/>
+          <w:color w:val="555555"/>
+        </w:rPr>
+        <w:t>From the dashboard you'll see the searches you're assigned to, candidates in flight, and your team's recent activity.</w:t>
+      </w:r>
+    </w:p>
+    <w:p>
+      <w:pPr>
+        <w:spacing w:after="80"/>
+        <w:ind w:left="480"/>
+      </w:pPr>
+      <w:r>
+        <w:rPr>
+          <w:i/>
+          <w:color w:val="555555"/>
+        </w:rPr>
+        <w:t>[Button: Open Dashboard]</w:t>
       </w:r>
     </w:p>
     <w:p/>
@@ -502,51 +742,81 @@
       </w:r>
     </w:p>
     <w:p>
-      <w:r>
-        <w:t xml:space="preserve">  &gt; 🎉 {newMemberName} accepted your invite</w:t>
-      </w:r>
-    </w:p>
-    <w:p>
-      <w:r>
-        <w:t xml:space="preserve">  &gt; Hi {firstName},</w:t>
-      </w:r>
-    </w:p>
-    <w:p>
-      <w:r>
-        <w:t xml:space="preserve">  &gt; </w:t>
-      </w:r>
+      <w:pPr>
+        <w:spacing w:after="80"/>
+        <w:ind w:left="480"/>
+      </w:pPr>
       <w:r>
         <w:rPr>
-          <w:b/>
+          <w:i/>
+          <w:color w:val="555555"/>
         </w:rPr>
-        <w:t>{newMemberName}</w:t>
-      </w:r>
-      <w:r>
-        <w:t xml:space="preserve"> ({email}) just joined </w:t>
-      </w:r>
+        <w:t>🎉 {newMemberName} accepted your invite</w:t>
+      </w:r>
+    </w:p>
+    <w:p>
+      <w:pPr>
+        <w:spacing w:after="80"/>
+        <w:ind w:left="480"/>
+      </w:pPr>
       <w:r>
         <w:rPr>
-          <w:b/>
+          <w:i/>
+          <w:color w:val="555555"/>
         </w:rPr>
-        <w:t>{orgName}</w:t>
-      </w:r>
-      <w:r>
-        <w:t xml:space="preserve"> on Recruiting ATS.</w:t>
-      </w:r>
-    </w:p>
-    <w:p>
-      <w:r>
-        <w:t xml:space="preserve">  &gt; They can now see the searches they're assigned to and collaborate with you on candidates and clients.</w:t>
-      </w:r>
-    </w:p>
-    <w:p>
-      <w:r>
-        <w:t xml:space="preserve">  &gt; Want to keep growing the team? Send another invite from My Team.</w:t>
-      </w:r>
-    </w:p>
-    <w:p>
-      <w:r>
-        <w:t xml:space="preserve">  &gt; [Button: Open My Team]</w:t>
+        <w:t>Hi {firstName},</w:t>
+      </w:r>
+    </w:p>
+    <w:p>
+      <w:pPr>
+        <w:spacing w:after="80"/>
+        <w:ind w:left="480"/>
+      </w:pPr>
+      <w:r>
+        <w:rPr>
+          <w:i/>
+          <w:color w:val="555555"/>
+        </w:rPr>
+        <w:t>{newMemberName} ({email}) just joined {orgName} on Recruiting ATS.</w:t>
+      </w:r>
+    </w:p>
+    <w:p>
+      <w:pPr>
+        <w:spacing w:after="80"/>
+        <w:ind w:left="480"/>
+      </w:pPr>
+      <w:r>
+        <w:rPr>
+          <w:i/>
+          <w:color w:val="555555"/>
+        </w:rPr>
+        <w:t>They can now see the searches they're assigned to and collaborate with you on candidates and clients.</w:t>
+      </w:r>
+    </w:p>
+    <w:p>
+      <w:pPr>
+        <w:spacing w:after="80"/>
+        <w:ind w:left="480"/>
+      </w:pPr>
+      <w:r>
+        <w:rPr>
+          <w:i/>
+          <w:color w:val="555555"/>
+        </w:rPr>
+        <w:t>Want to keep growing the team? Send another invite from My Team.</w:t>
+      </w:r>
+    </w:p>
+    <w:p>
+      <w:pPr>
+        <w:spacing w:after="80"/>
+        <w:ind w:left="480"/>
+      </w:pPr>
+      <w:r>
+        <w:rPr>
+          <w:i/>
+          <w:color w:val="555555"/>
+        </w:rPr>
+        <w:t>[Button: Open My Team]</w:t>
       </w:r>
     </w:p>
     <w:p/>
@@ -583,36 +853,964 @@
       </w:r>
     </w:p>
     <w:p>
-      <w:r>
-        <w:t xml:space="preserve">  &gt; You're now collaborating on {jobTitle}</w:t>
-      </w:r>
-    </w:p>
-    <w:p>
-      <w:r>
-        <w:t xml:space="preserve">  &gt; Hi {firstName},</w:t>
-      </w:r>
-    </w:p>
-    <w:p>
-      <w:r>
-        <w:t xml:space="preserve">  &gt; {assignerName} just added you to the search for </w:t>
-      </w:r>
+      <w:pPr>
+        <w:spacing w:after="80"/>
+        <w:ind w:left="480"/>
+      </w:pPr>
       <w:r>
         <w:rPr>
-          <w:b/>
+          <w:i/>
+          <w:color w:val="555555"/>
+        </w:rPr>
+        <w:t>You're now collaborating on {jobTitle}</w:t>
+      </w:r>
+    </w:p>
+    <w:p>
+      <w:pPr>
+        <w:spacing w:after="80"/>
+        <w:ind w:left="480"/>
+      </w:pPr>
+      <w:r>
+        <w:rPr>
+          <w:i/>
+          <w:color w:val="555555"/>
+        </w:rPr>
+        <w:t>Hi {firstName},</w:t>
+      </w:r>
+    </w:p>
+    <w:p>
+      <w:pPr>
+        <w:spacing w:after="80"/>
+        <w:ind w:left="480"/>
+      </w:pPr>
+      <w:r>
+        <w:rPr>
+          <w:i/>
+          <w:color w:val="555555"/>
+        </w:rPr>
+        <w:t>{assignerName} just added you to the search for {jobTitle} ({role} · {clientName}). Open the job to see the pipeline and start sourcing.</w:t>
+      </w:r>
+    </w:p>
+    <w:p>
+      <w:pPr>
+        <w:spacing w:after="80"/>
+        <w:ind w:left="480"/>
+      </w:pPr>
+      <w:r>
+        <w:rPr>
+          <w:i/>
+          <w:color w:val="555555"/>
+        </w:rPr>
+        <w:t>[Button: Open Job]</w:t>
+      </w:r>
+    </w:p>
+    <w:p/>
+    <w:p>
+      <w:r>
+        <w:t>────────────────────────────────────────</w:t>
+      </w:r>
+    </w:p>
+    <w:p/>
+    <w:p>
+      <w:pPr>
+        <w:pStyle w:val="Heading2"/>
+      </w:pPr>
+      <w:r>
+        <w:t>🏢 Cliente (hiring company) — invitations</w:t>
+      </w:r>
+    </w:p>
+    <w:p/>
+    <w:p>
+      <w:pPr>
+        <w:pStyle w:val="Heading3"/>
+      </w:pPr>
+      <w:r>
+        <w:t>9. Client set-password (primer login)</w:t>
+      </w:r>
+    </w:p>
+    <w:p>
+      <w:pPr>
+        <w:pStyle w:val="ListBullet"/>
+      </w:pPr>
+      <w:r>
+        <w:t>Cuándo: un firm comparte candidatos con un cliente nuevo.</w:t>
+      </w:r>
+    </w:p>
+    <w:p>
+      <w:pPr>
+        <w:pStyle w:val="ListBullet"/>
+      </w:pPr>
+      <w:r>
+        <w:t>Subject: Set up your Recruiting ATS client portal account</w:t>
+      </w:r>
+    </w:p>
+    <w:p>
+      <w:pPr>
+        <w:pStyle w:val="ListBullet"/>
+      </w:pPr>
+      <w:r>
+        <w:t>Body:</w:t>
+      </w:r>
+    </w:p>
+    <w:p>
+      <w:pPr>
+        <w:spacing w:after="80"/>
+        <w:ind w:left="480"/>
+      </w:pPr>
+      <w:r>
+        <w:rPr>
+          <w:i/>
+          <w:color w:val="555555"/>
+        </w:rPr>
+        <w:t>Set up your client portal account</w:t>
+      </w:r>
+    </w:p>
+    <w:p>
+      <w:pPr>
+        <w:spacing w:after="80"/>
+        <w:ind w:left="480"/>
+      </w:pPr>
+      <w:r>
+        <w:rPr>
+          <w:i/>
+          <w:color w:val="555555"/>
+        </w:rPr>
+        <w:t>Hi {clientName},</w:t>
+      </w:r>
+    </w:p>
+    <w:p>
+      <w:pPr>
+        <w:spacing w:after="80"/>
+        <w:ind w:left="480"/>
+      </w:pPr>
+      <w:r>
+        <w:rPr>
+          <w:i/>
+          <w:color w:val="555555"/>
+        </w:rPr>
+        <w:t>{firmName} has shared candidates with you on Recruiting ATS. To review them, you'll need to set a password for your account.</w:t>
+      </w:r>
+    </w:p>
+    <w:p>
+      <w:pPr>
+        <w:spacing w:after="80"/>
+        <w:ind w:left="480"/>
+      </w:pPr>
+      <w:r>
+        <w:rPr>
+          <w:i/>
+          <w:color w:val="555555"/>
+        </w:rPr>
+        <w:t>Click below to set your password and access your portal.</w:t>
+      </w:r>
+    </w:p>
+    <w:p>
+      <w:pPr>
+        <w:spacing w:after="80"/>
+        <w:ind w:left="480"/>
+      </w:pPr>
+      <w:r>
+        <w:rPr>
+          <w:i/>
+          <w:color w:val="555555"/>
+        </w:rPr>
+        <w:t>[Button: Set Password &amp; Sign In]</w:t>
+      </w:r>
+    </w:p>
+    <w:p/>
+    <w:p>
+      <w:pPr>
+        <w:pStyle w:val="Heading3"/>
+      </w:pPr>
+      <w:r>
+        <w:t>10. Client team invite (admin del cliente invita teammates)</w:t>
+      </w:r>
+    </w:p>
+    <w:p>
+      <w:pPr>
+        <w:pStyle w:val="ListBullet"/>
+      </w:pPr>
+      <w:r>
+        <w:t>Cuándo: admin del client portal invita a otro miembro de su equipo.</w:t>
+      </w:r>
+    </w:p>
+    <w:p>
+      <w:pPr>
+        <w:pStyle w:val="ListBullet"/>
+      </w:pPr>
+      <w:r>
+        <w:t>Subject: {inviterName} invited you to {companyName}'s hiring team</w:t>
+      </w:r>
+    </w:p>
+    <w:p>
+      <w:pPr>
+        <w:pStyle w:val="ListBullet"/>
+      </w:pPr>
+      <w:r>
+        <w:t>Body:</w:t>
+      </w:r>
+    </w:p>
+    <w:p>
+      <w:pPr>
+        <w:spacing w:after="80"/>
+        <w:ind w:left="480"/>
+      </w:pPr>
+      <w:r>
+        <w:rPr>
+          <w:i/>
+          <w:color w:val="555555"/>
+        </w:rPr>
+        <w:t>You've been added to {companyName}'s hiring team</w:t>
+      </w:r>
+    </w:p>
+    <w:p>
+      <w:pPr>
+        <w:spacing w:after="80"/>
+        <w:ind w:left="480"/>
+      </w:pPr>
+      <w:r>
+        <w:rPr>
+          <w:i/>
+          <w:color w:val="555555"/>
+        </w:rPr>
+        <w:t>Hi {memberName},</w:t>
+      </w:r>
+    </w:p>
+    <w:p>
+      <w:pPr>
+        <w:spacing w:after="80"/>
+        <w:ind w:left="480"/>
+      </w:pPr>
+      <w:r>
+        <w:rPr>
+          <w:i/>
+          <w:color w:val="555555"/>
+        </w:rPr>
+        <w:t>{inviterName} has invited you to join {companyName}'s hiring team on Recruiting ATS.</w:t>
+      </w:r>
+    </w:p>
+    <w:p>
+      <w:pPr>
+        <w:spacing w:after="80"/>
+        <w:ind w:left="480"/>
+      </w:pPr>
+      <w:r>
+        <w:rPr>
+          <w:i/>
+          <w:color w:val="555555"/>
+        </w:rPr>
+        <w:t>Role: {title}</w:t>
+      </w:r>
+    </w:p>
+    <w:p>
+      <w:pPr>
+        <w:spacing w:after="80"/>
+        <w:ind w:left="480"/>
+      </w:pPr>
+      <w:r>
+        <w:rPr>
+          <w:i/>
+          <w:color w:val="555555"/>
+        </w:rPr>
+        <w:t>With your account, you can:</w:t>
+      </w:r>
+    </w:p>
+    <w:p>
+      <w:pPr>
+        <w:spacing w:after="80"/>
+        <w:ind w:left="480"/>
+      </w:pPr>
+      <w:r>
+        <w:rPr>
+          <w:i/>
+          <w:color w:val="555555"/>
+        </w:rPr>
+        <w:t>- View and post job openings</w:t>
+      </w:r>
+    </w:p>
+    <w:p>
+      <w:pPr>
+        <w:spacing w:after="80"/>
+        <w:ind w:left="480"/>
+      </w:pPr>
+      <w:r>
+        <w:rPr>
+          <w:i/>
+          <w:color w:val="555555"/>
+        </w:rPr>
+        <w:t>- Track recruiting firm activity</w:t>
+      </w:r>
+    </w:p>
+    <w:p>
+      <w:pPr>
+        <w:spacing w:after="80"/>
+        <w:ind w:left="480"/>
+      </w:pPr>
+      <w:r>
+        <w:rPr>
+          <w:i/>
+          <w:color w:val="555555"/>
+        </w:rPr>
+        <w:t>- Review shared candidates</w:t>
+      </w:r>
+    </w:p>
+    <w:p>
+      <w:pPr>
+        <w:spacing w:after="80"/>
+        <w:ind w:left="480"/>
+      </w:pPr>
+      <w:r>
+        <w:rPr>
+          <w:i/>
+          <w:color w:val="555555"/>
+        </w:rPr>
+        <w:t>- Manage your team's hiring pipeline</w:t>
+      </w:r>
+    </w:p>
+    <w:p>
+      <w:pPr>
+        <w:spacing w:after="80"/>
+        <w:ind w:left="480"/>
+      </w:pPr>
+      <w:r>
+        <w:rPr>
+          <w:i/>
+          <w:color w:val="555555"/>
+        </w:rPr>
+        <w:t>Click below to set your password and get started.</w:t>
+      </w:r>
+    </w:p>
+    <w:p>
+      <w:pPr>
+        <w:spacing w:after="80"/>
+        <w:ind w:left="480"/>
+      </w:pPr>
+      <w:r>
+        <w:rPr>
+          <w:i/>
+          <w:color w:val="555555"/>
+        </w:rPr>
+        <w:t>[Button: Set Password &amp; Get Started]</w:t>
+      </w:r>
+    </w:p>
+    <w:p/>
+    <w:p>
+      <w:pPr>
+        <w:pStyle w:val="Heading3"/>
+      </w:pPr>
+      <w:r>
+        <w:t>11. Client portal welcome (después de set-password)</w:t>
+      </w:r>
+    </w:p>
+    <w:p>
+      <w:pPr>
+        <w:pStyle w:val="ListBullet"/>
+      </w:pPr>
+      <w:r>
+        <w:t>Cuándo: cliente termina set-password.</w:t>
+      </w:r>
+    </w:p>
+    <w:p>
+      <w:pPr>
+        <w:pStyle w:val="ListBullet"/>
+      </w:pPr>
+      <w:r>
+        <w:t>Subject: Your Recruiting ATS client portal account is ready</w:t>
+      </w:r>
+    </w:p>
+    <w:p>
+      <w:pPr>
+        <w:pStyle w:val="ListBullet"/>
+      </w:pPr>
+      <w:r>
+        <w:t>Body:</w:t>
+      </w:r>
+    </w:p>
+    <w:p>
+      <w:pPr>
+        <w:spacing w:after="80"/>
+        <w:ind w:left="480"/>
+      </w:pPr>
+      <w:r>
+        <w:rPr>
+          <w:i/>
+          <w:color w:val="555555"/>
+        </w:rPr>
+        <w:t>Welcome to Recruiting ATS</w:t>
+      </w:r>
+    </w:p>
+    <w:p>
+      <w:pPr>
+        <w:spacing w:after="80"/>
+        <w:ind w:left="480"/>
+      </w:pPr>
+      <w:r>
+        <w:rPr>
+          <w:i/>
+          <w:color w:val="555555"/>
+        </w:rPr>
+        <w:t>Hi {firstName},</w:t>
+      </w:r>
+    </w:p>
+    <w:p>
+      <w:pPr>
+        <w:spacing w:after="80"/>
+        <w:ind w:left="480"/>
+      </w:pPr>
+      <w:r>
+        <w:rPr>
+          <w:i/>
+          <w:color w:val="555555"/>
+        </w:rPr>
+        <w:t>Your client portal account for {clientName} is now active. Your email has been confirmed and you can sign in any time at the link below.</w:t>
+      </w:r>
+    </w:p>
+    <w:p>
+      <w:pPr>
+        <w:spacing w:after="80"/>
+        <w:ind w:left="480"/>
+      </w:pPr>
+      <w:r>
+        <w:rPr>
+          <w:i/>
+          <w:color w:val="555555"/>
+        </w:rPr>
+        <w:t>Use the portal to review candidates shared by your recruiter, leave feedback, and track the searches you're hiring on.</w:t>
+      </w:r>
+    </w:p>
+    <w:p>
+      <w:pPr>
+        <w:spacing w:after="80"/>
+        <w:ind w:left="480"/>
+      </w:pPr>
+      <w:r>
+        <w:rPr>
+          <w:i/>
+          <w:color w:val="555555"/>
+        </w:rPr>
+        <w:t>[Button: Open Portal]</w:t>
+      </w:r>
+    </w:p>
+    <w:p/>
+    <w:p>
+      <w:pPr>
+        <w:pStyle w:val="Heading3"/>
+      </w:pPr>
+      <w:r>
+        <w:t>12. Client job access granted (sumar miembro a job específico)</w:t>
+      </w:r>
+    </w:p>
+    <w:p>
+      <w:pPr>
+        <w:pStyle w:val="ListBullet"/>
+      </w:pPr>
+      <w:r>
+        <w:t>Cuándo: un admin del client portal le da acceso a un job a otro teammate que ya tiene cuenta.</w:t>
+      </w:r>
+    </w:p>
+    <w:p>
+      <w:pPr>
+        <w:pStyle w:val="ListBullet"/>
+      </w:pPr>
+      <w:r>
+        <w:t>Subject: {inviterName} added you to {jobTitle}</w:t>
+      </w:r>
+    </w:p>
+    <w:p>
+      <w:pPr>
+        <w:pStyle w:val="ListBullet"/>
+      </w:pPr>
+      <w:r>
+        <w:t>Body:</w:t>
+      </w:r>
+    </w:p>
+    <w:p>
+      <w:pPr>
+        <w:spacing w:after="80"/>
+        <w:ind w:left="480"/>
+      </w:pPr>
+      <w:r>
+        <w:rPr>
+          <w:i/>
+          <w:color w:val="555555"/>
+        </w:rPr>
+        <w:t>Hi {memberName},</w:t>
+      </w:r>
+    </w:p>
+    <w:p>
+      <w:pPr>
+        <w:spacing w:after="80"/>
+        <w:ind w:left="480"/>
+      </w:pPr>
+      <w:r>
+        <w:rPr>
+          <w:i/>
+          <w:color w:val="555555"/>
+        </w:rPr>
+        <w:t>{inviterName} just gave you access to {jobTitle} on {companyName}'s portal.</w:t>
+      </w:r>
+    </w:p>
+    <w:p>
+      <w:pPr>
+        <w:spacing w:after="80"/>
+        <w:ind w:left="480"/>
+      </w:pPr>
+      <w:r>
+        <w:rPr>
+          <w:i/>
+          <w:color w:val="555555"/>
+        </w:rPr>
+        <w:t>You can now review shared candidates, post notes for the team, and follow the pipeline.</w:t>
+      </w:r>
+    </w:p>
+    <w:p>
+      <w:pPr>
+        <w:spacing w:after="80"/>
+        <w:ind w:left="480"/>
+      </w:pPr>
+      <w:r>
+        <w:rPr>
+          <w:i/>
+          <w:color w:val="555555"/>
+        </w:rPr>
+        <w:t>[Button: Open Search]</w:t>
+      </w:r>
+    </w:p>
+    <w:p/>
+    <w:p>
+      <w:r>
+        <w:t>────────────────────────────────────────</w:t>
+      </w:r>
+    </w:p>
+    <w:p/>
+    <w:p>
+      <w:pPr>
+        <w:pStyle w:val="Heading2"/>
+      </w:pPr>
+      <w:r>
+        <w:t>📨 Engagement (firm ↔ client)</w:t>
+      </w:r>
+    </w:p>
+    <w:p/>
+    <w:p>
+      <w:pPr>
+        <w:pStyle w:val="Heading3"/>
+      </w:pPr>
+      <w:r>
+        <w:t>13. Engagement accepted (al cliente)</w:t>
+      </w:r>
+    </w:p>
+    <w:p>
+      <w:pPr>
+        <w:pStyle w:val="ListBullet"/>
+      </w:pPr>
+      <w:r>
+        <w:t>Cuándo: el firm acepta una invitación a colaborar en una búsqueda.</w:t>
+      </w:r>
+    </w:p>
+    <w:p>
+      <w:pPr>
+        <w:pStyle w:val="ListBullet"/>
+      </w:pPr>
+      <w:r>
+        <w:t>Subject: {firmName} accepted {jobTitle}</w:t>
+      </w:r>
+    </w:p>
+    <w:p>
+      <w:pPr>
+        <w:pStyle w:val="ListBullet"/>
+      </w:pPr>
+      <w:r>
+        <w:t>Body:</w:t>
+      </w:r>
+    </w:p>
+    <w:p>
+      <w:pPr>
+        <w:spacing w:after="80"/>
+        <w:ind w:left="480"/>
+      </w:pPr>
+      <w:r>
+        <w:rPr>
+          <w:i/>
+          <w:color w:val="555555"/>
+        </w:rPr>
+        <w:t>Hi {inviterName},</w:t>
+      </w:r>
+    </w:p>
+    <w:p>
+      <w:pPr>
+        <w:spacing w:after="80"/>
+        <w:ind w:left="480"/>
+      </w:pPr>
+      <w:r>
+        <w:rPr>
+          <w:i/>
+          <w:color w:val="555555"/>
+        </w:rPr>
+        <w:t>{firmName} just accepted your invitation to work on {jobTitle}. They can now start sharing candidates and chatting with your team.</w:t>
+      </w:r>
+    </w:p>
+    <w:p>
+      <w:pPr>
+        <w:spacing w:after="80"/>
+        <w:ind w:left="480"/>
+      </w:pPr>
+      <w:r>
+        <w:rPr>
+          <w:i/>
+          <w:color w:val="555555"/>
+        </w:rPr>
+        <w:t>[Button: Open Search]</w:t>
+      </w:r>
+    </w:p>
+    <w:p/>
+    <w:p>
+      <w:pPr>
+        <w:pStyle w:val="Heading3"/>
+      </w:pPr>
+      <w:r>
+        <w:t>14. Client portal share (al cliente cuando se comparte shortlist)</w:t>
+      </w:r>
+    </w:p>
+    <w:p>
+      <w:pPr>
+        <w:pStyle w:val="ListBullet"/>
+      </w:pPr>
+      <w:r>
+        <w:t>Cuándo: el firm comparte candidatos con un cliente. Solo si el cliente ya tiene portal account.</w:t>
+      </w:r>
+    </w:p>
+    <w:p>
+      <w:pPr>
+        <w:pStyle w:val="ListBullet"/>
+      </w:pPr>
+      <w:r>
+        <w:t>Subject: {firmName} shared candidates with you for {jobTitle}</w:t>
+      </w:r>
+    </w:p>
+    <w:p>
+      <w:pPr>
+        <w:pStyle w:val="ListBullet"/>
+      </w:pPr>
+      <w:r>
+        <w:t>Body:</w:t>
+      </w:r>
+    </w:p>
+    <w:p>
+      <w:pPr>
+        <w:spacing w:after="80"/>
+        <w:ind w:left="480"/>
+      </w:pPr>
+      <w:r>
+        <w:rPr>
+          <w:i/>
+          <w:color w:val="555555"/>
+        </w:rPr>
+        <w:t>Hi {clientName},</w:t>
+      </w:r>
+    </w:p>
+    <w:p>
+      <w:pPr>
+        <w:spacing w:after="80"/>
+        <w:ind w:left="480"/>
+      </w:pPr>
+      <w:r>
+        <w:rPr>
+          <w:i/>
+          <w:color w:val="555555"/>
+        </w:rPr>
+        <w:t>{recruiterName} from {firmName} has shared a candidate shortlist with you on Recruiting ATS.</w:t>
+      </w:r>
+    </w:p>
+    <w:p>
+      <w:pPr>
+        <w:spacing w:after="80"/>
+        <w:ind w:left="480"/>
+      </w:pPr>
+      <w:r>
+        <w:rPr>
+          <w:i/>
+          <w:color w:val="555555"/>
         </w:rPr>
         <w:t>{jobTitle}</w:t>
       </w:r>
-      <w:r>
-        <w:t xml:space="preserve"> ({role} · {clientName}). Open the job to see the pipeline and start sourcing.</w:t>
-      </w:r>
-    </w:p>
-    <w:p>
-      <w:r>
-        <w:t xml:space="preserve">  &gt; [Button: Open Job]</w:t>
+    </w:p>
+    <w:p>
+      <w:pPr>
+        <w:spacing w:after="80"/>
+        <w:ind w:left="480"/>
+      </w:pPr>
+      <w:r>
+        <w:rPr>
+          <w:i/>
+          <w:color w:val="555555"/>
+        </w:rPr>
+        <w:t>{N} candidates have been shared for your review.</w:t>
+      </w:r>
+    </w:p>
+    <w:p>
+      <w:pPr>
+        <w:spacing w:after="80"/>
+        <w:ind w:left="480"/>
+      </w:pPr>
+      <w:r>
+        <w:rPr>
+          <w:i/>
+          <w:color w:val="555555"/>
+        </w:rPr>
+        <w:t>Sign in to your client portal to review profiles, rate candidates, and leave feedback.</w:t>
+      </w:r>
+    </w:p>
+    <w:p>
+      <w:pPr>
+        <w:spacing w:after="80"/>
+        <w:ind w:left="480"/>
+      </w:pPr>
+      <w:r>
+        <w:rPr>
+          <w:i/>
+          <w:color w:val="555555"/>
+        </w:rPr>
+        <w:t>[Button: Review Candidates]</w:t>
       </w:r>
     </w:p>
     <w:p/>
     <w:p>
+      <w:pPr>
+        <w:pStyle w:val="Heading3"/>
+      </w:pPr>
+      <w:r>
+        <w:t>15. Candidate shared (al cliente, cada vez que se comparte un candidato individual)</w:t>
+      </w:r>
+    </w:p>
+    <w:p>
+      <w:pPr>
+        <w:pStyle w:val="ListBullet"/>
+      </w:pPr>
+      <w:r>
+        <w:t>Cuándo: el firm comparte un candidato puntual con el cliente.</w:t>
+      </w:r>
+    </w:p>
+    <w:p>
+      <w:pPr>
+        <w:pStyle w:val="ListBullet"/>
+      </w:pPr>
+      <w:r>
+        <w:t>Subject: New candidate shared: {candidateName} for {jobTitle}</w:t>
+      </w:r>
+    </w:p>
+    <w:p>
+      <w:pPr>
+        <w:pStyle w:val="ListBullet"/>
+      </w:pPr>
+      <w:r>
+        <w:t>Body:</w:t>
+      </w:r>
+    </w:p>
+    <w:p>
+      <w:pPr>
+        <w:spacing w:after="80"/>
+        <w:ind w:left="480"/>
+      </w:pPr>
+      <w:r>
+        <w:rPr>
+          <w:i/>
+          <w:color w:val="555555"/>
+        </w:rPr>
+        <w:t>New candidate for {jobTitle}</w:t>
+      </w:r>
+    </w:p>
+    <w:p>
+      <w:pPr>
+        <w:spacing w:after="80"/>
+        <w:ind w:left="480"/>
+      </w:pPr>
+      <w:r>
+        <w:rPr>
+          <w:i/>
+          <w:color w:val="555555"/>
+        </w:rPr>
+        <w:t>Hi {firstName},</w:t>
+      </w:r>
+    </w:p>
+    <w:p>
+      <w:pPr>
+        <w:spacing w:after="80"/>
+        <w:ind w:left="480"/>
+      </w:pPr>
+      <w:r>
+        <w:rPr>
+          <w:i/>
+          <w:color w:val="555555"/>
+        </w:rPr>
+        <w:t>{recruiterName} from {firmName} just shared a new candidate with {clientName}:</w:t>
+      </w:r>
+    </w:p>
+    <w:p>
+      <w:pPr>
+        <w:spacing w:after="80"/>
+        <w:ind w:left="480"/>
+      </w:pPr>
+      <w:r>
+        <w:rPr>
+          <w:i/>
+          <w:color w:val="555555"/>
+        </w:rPr>
+        <w:t>{candidateName} for {jobTitle}</w:t>
+      </w:r>
+    </w:p>
+    <w:p>
+      <w:pPr>
+        <w:spacing w:after="80"/>
+        <w:ind w:left="480"/>
+      </w:pPr>
+      <w:r>
+        <w:rPr>
+          <w:i/>
+          <w:color w:val="555555"/>
+        </w:rPr>
+        <w:t>{Optional note from recruiter}</w:t>
+      </w:r>
+    </w:p>
+    <w:p>
+      <w:pPr>
+        <w:spacing w:after="80"/>
+        <w:ind w:left="480"/>
+      </w:pPr>
+      <w:r>
+        <w:rPr>
+          <w:i/>
+          <w:color w:val="555555"/>
+        </w:rPr>
+        <w:t>Sign in to the client portal to view the full profile, download their resume, and leave feedback.</w:t>
+      </w:r>
+    </w:p>
+    <w:p>
+      <w:pPr>
+        <w:spacing w:after="80"/>
+        <w:ind w:left="480"/>
+      </w:pPr>
+      <w:r>
+        <w:rPr>
+          <w:i/>
+          <w:color w:val="555555"/>
+        </w:rPr>
+        <w:t>[Button: View Candidate]</w:t>
+      </w:r>
+    </w:p>
+    <w:p/>
+    <w:p>
+      <w:pPr>
+        <w:pStyle w:val="Heading3"/>
+      </w:pPr>
+      <w:r>
+        <w:t>16. Candidate feedback (al recruiter, cuando el cliente deja review)</w:t>
+      </w:r>
+    </w:p>
+    <w:p>
+      <w:pPr>
+        <w:pStyle w:val="ListBullet"/>
+      </w:pPr>
+      <w:r>
+        <w:t>Cuándo: cliente puntúa o comenta un candidato.</w:t>
+      </w:r>
+    </w:p>
+    <w:p>
+      <w:pPr>
+        <w:pStyle w:val="ListBullet"/>
+      </w:pPr>
+      <w:r>
+        <w:t>Subject: {reviewerName} left {N}★ feedback on {candidateName} (o "new feedback" / "viewed")</w:t>
+      </w:r>
+    </w:p>
+    <w:p>
+      <w:pPr>
+        <w:pStyle w:val="ListBullet"/>
+      </w:pPr>
+      <w:r>
+        <w:t>Body:</w:t>
+      </w:r>
+    </w:p>
+    <w:p>
+      <w:pPr>
+        <w:spacing w:after="80"/>
+        <w:ind w:left="480"/>
+      </w:pPr>
+      <w:r>
+        <w:rPr>
+          <w:i/>
+          <w:color w:val="555555"/>
+        </w:rPr>
+        <w:t>New feedback on {candidateName}</w:t>
+      </w:r>
+    </w:p>
+    <w:p>
+      <w:pPr>
+        <w:spacing w:after="80"/>
+        <w:ind w:left="480"/>
+      </w:pPr>
+      <w:r>
+        <w:rPr>
+          <w:i/>
+          <w:color w:val="555555"/>
+        </w:rPr>
+        <w:t>Hi {recruiterName},</w:t>
+      </w:r>
+    </w:p>
+    <w:p>
+      <w:pPr>
+        <w:spacing w:after="80"/>
+        <w:ind w:left="480"/>
+      </w:pPr>
+      <w:r>
+        <w:rPr>
+          <w:i/>
+          <w:color w:val="555555"/>
+        </w:rPr>
+        <w:t>{reviewerName} at {clientCompanyName} just left feedback on {candidateName} for {jobTitle}.</w:t>
+      </w:r>
+    </w:p>
+    <w:p>
+      <w:pPr>
+        <w:spacing w:after="80"/>
+        <w:ind w:left="480"/>
+      </w:pPr>
+      <w:r>
+        <w:rPr>
+          <w:i/>
+          <w:color w:val="555555"/>
+        </w:rPr>
+        <w:t>Rating: ★★★★☆ (4/5)</w:t>
+      </w:r>
+    </w:p>
+    <w:p>
+      <w:pPr>
+        <w:spacing w:after="80"/>
+        <w:ind w:left="480"/>
+      </w:pPr>
+      <w:r>
+        <w:rPr>
+          <w:i/>
+          <w:color w:val="555555"/>
+        </w:rPr>
+        <w:t>{Optional comment}</w:t>
+      </w:r>
+    </w:p>
+    <w:p>
+      <w:pPr>
+        <w:spacing w:after="80"/>
+        <w:ind w:left="480"/>
+      </w:pPr>
+      <w:r>
+        <w:rPr>
+          <w:i/>
+          <w:color w:val="555555"/>
+        </w:rPr>
+        <w:t>[Button: View Candidate]</w:t>
+      </w:r>
+    </w:p>
+    <w:p/>
+    <w:p>
       <w:r>
         <w:t>────────────────────────────────────────</w:t>
       </w:r>
@@ -623,7 +1821,7 @@
         <w:pStyle w:val="Heading2"/>
       </w:pPr>
       <w:r>
-        <w:t>🏢 Cliente (hiring company) — invitations</w:t>
+        <w:t>💬 Chat &amp; menciones</w:t>
       </w:r>
     </w:p>
     <w:p/>
@@ -632,7 +1830,7 @@
         <w:pStyle w:val="Heading3"/>
       </w:pPr>
       <w:r>
-        <w:t>9. Client set-password (primer login)</w:t>
+        <w:t>17. New message (chat)</w:t>
       </w:r>
     </w:p>
     <w:p>
@@ -640,7 +1838,7 @@
         <w:pStyle w:val="ListBullet"/>
       </w:pPr>
       <w:r>
-        <w:t>Cuándo: un firm comparte candidatos con un cliente nuevo.</w:t>
+        <w:t>Cuándo: alguien manda un mensaje en el chat (interno o cliente). Solo a los que NO están @-mencionados; los @-mencionados van por la mention email (#18).</w:t>
       </w:r>
     </w:p>
     <w:p>
@@ -648,7 +1846,7 @@
         <w:pStyle w:val="ListBullet"/>
       </w:pPr>
       <w:r>
-        <w:t>Subject: Set up your Recruiting ATS client portal account</w:t>
+        <w:t>Subject: New message on {candidateName} — {jobTitle}</w:t>
       </w:r>
     </w:p>
     <w:p>
@@ -660,37 +1858,68 @@
       </w:r>
     </w:p>
     <w:p>
-      <w:r>
-        <w:t xml:space="preserve">  &gt; Set up your client portal account</w:t>
-      </w:r>
-    </w:p>
-    <w:p>
-      <w:r>
-        <w:t xml:space="preserve">  &gt; Hi {clientName},</w:t>
-      </w:r>
-    </w:p>
-    <w:p>
-      <w:r>
-        <w:t xml:space="preserve">  &gt; </w:t>
-      </w:r>
+      <w:pPr>
+        <w:spacing w:after="80"/>
+        <w:ind w:left="480"/>
+      </w:pPr>
       <w:r>
         <w:rPr>
-          <w:b/>
+          <w:i/>
+          <w:color w:val="555555"/>
         </w:rPr>
-        <w:t>{firmName}</w:t>
-      </w:r>
-      <w:r>
-        <w:t xml:space="preserve"> has shared candidates with you on Recruiting ATS. To review them, you'll need to set a password for your account.</w:t>
-      </w:r>
-    </w:p>
-    <w:p>
-      <w:r>
-        <w:t xml:space="preserve">  &gt; Click below to set your password and access your portal.</w:t>
-      </w:r>
-    </w:p>
-    <w:p>
-      <w:r>
-        <w:t xml:space="preserve">  &gt; [Button: Set Password &amp; Sign In]</w:t>
+        <w:t>New message about {candidateName}</w:t>
+      </w:r>
+    </w:p>
+    <w:p>
+      <w:pPr>
+        <w:spacing w:after="80"/>
+        <w:ind w:left="480"/>
+      </w:pPr>
+      <w:r>
+        <w:rPr>
+          <w:i/>
+          <w:color w:val="555555"/>
+        </w:rPr>
+        <w:t>Hi {firstName},</w:t>
+      </w:r>
+    </w:p>
+    <w:p>
+      <w:pPr>
+        <w:spacing w:after="80"/>
+        <w:ind w:left="480"/>
+      </w:pPr>
+      <w:r>
+        <w:rPr>
+          <w:i/>
+          <w:color w:val="555555"/>
+        </w:rPr>
+        <w:t>{fromName} ({a recruiter | the client | your team}) left a new message in {your internal channel | the shared chat} for {candidateName} ({jobTitle}):</w:t>
+      </w:r>
+    </w:p>
+    <w:p>
+      <w:pPr>
+        <w:spacing w:after="80"/>
+        <w:ind w:left="480"/>
+      </w:pPr>
+      <w:r>
+        <w:rPr>
+          <w:i/>
+          <w:color w:val="555555"/>
+        </w:rPr>
+        <w:t>&gt; {preview del mensaje}</w:t>
+      </w:r>
+    </w:p>
+    <w:p>
+      <w:pPr>
+        <w:spacing w:after="80"/>
+        <w:ind w:left="480"/>
+      </w:pPr>
+      <w:r>
+        <w:rPr>
+          <w:i/>
+          <w:color w:val="555555"/>
+        </w:rPr>
+        <w:t>[Button: View Conversation]</w:t>
       </w:r>
     </w:p>
     <w:p/>
@@ -699,7 +1928,7 @@
         <w:pStyle w:val="Heading3"/>
       </w:pPr>
       <w:r>
-        <w:t>10. Client team invite (admin del cliente invita teammates)</w:t>
+        <w:t>18. Mention</w:t>
       </w:r>
     </w:p>
     <w:p>
@@ -707,7 +1936,7 @@
         <w:pStyle w:val="ListBullet"/>
       </w:pPr>
       <w:r>
-        <w:t>Cuándo: admin del client portal invita a otro miembro de su equipo.</w:t>
+        <w:t>Cuándo: alguien te @-menciona en un chat.</w:t>
       </w:r>
     </w:p>
     <w:p>
@@ -715,7 +1944,7 @@
         <w:pStyle w:val="ListBullet"/>
       </w:pPr>
       <w:r>
-        <w:t>Subject: {inviterName} invited you to {companyName}'s hiring team</w:t>
+        <w:t>Subject: {mentionedBy} mentioned you — {candidateName}</w:t>
       </w:r>
     </w:p>
     <w:p>
@@ -727,92 +1956,92 @@
       </w:r>
     </w:p>
     <w:p>
-      <w:r>
-        <w:t xml:space="preserve">  &gt; You've been added to {companyName}'s hiring team</w:t>
-      </w:r>
-    </w:p>
-    <w:p>
-      <w:r>
-        <w:t xml:space="preserve">  &gt; Hi {memberName},</w:t>
-      </w:r>
-    </w:p>
-    <w:p>
-      <w:r>
-        <w:t xml:space="preserve">  &gt; </w:t>
-      </w:r>
+      <w:pPr>
+        <w:spacing w:after="80"/>
+        <w:ind w:left="480"/>
+      </w:pPr>
       <w:r>
         <w:rPr>
-          <w:b/>
+          <w:i/>
+          <w:color w:val="555555"/>
         </w:rPr>
-        <w:t>{inviterName}</w:t>
-      </w:r>
-      <w:r>
-        <w:t xml:space="preserve"> has invited you to join </w:t>
-      </w:r>
+        <w:t>{mentionedBy} mentioned you</w:t>
+      </w:r>
+    </w:p>
+    <w:p>
+      <w:pPr>
+        <w:spacing w:after="80"/>
+        <w:ind w:left="480"/>
+      </w:pPr>
       <w:r>
         <w:rPr>
-          <w:b/>
+          <w:i/>
+          <w:color w:val="555555"/>
         </w:rPr>
-        <w:t>{companyName}</w:t>
-      </w:r>
-      <w:r>
-        <w:t>'s hiring team on Recruiting ATS.</w:t>
-      </w:r>
-    </w:p>
-    <w:p>
-      <w:r>
-        <w:t xml:space="preserve">  &gt; Role: </w:t>
-      </w:r>
+        <w:t>Hi {firstName},</w:t>
+      </w:r>
+    </w:p>
+    <w:p>
+      <w:pPr>
+        <w:spacing w:after="80"/>
+        <w:ind w:left="480"/>
+      </w:pPr>
       <w:r>
         <w:rPr>
-          <w:b/>
+          <w:i/>
+          <w:color w:val="555555"/>
         </w:rPr>
-        <w:t>{title}</w:t>
-      </w:r>
-      <w:r/>
-    </w:p>
-    <w:p>
-      <w:r>
-        <w:t xml:space="preserve">  &gt; With your account, you can:</w:t>
-      </w:r>
-    </w:p>
-    <w:p>
-      <w:r>
-        <w:t xml:space="preserve">  &gt; - View and post job openings</w:t>
-      </w:r>
-    </w:p>
-    <w:p>
-      <w:r>
-        <w:t xml:space="preserve">  &gt; - Track recruiting firm activity</w:t>
-      </w:r>
-    </w:p>
-    <w:p>
-      <w:r>
-        <w:t xml:space="preserve">  &gt; - Review shared candidates</w:t>
-      </w:r>
-    </w:p>
-    <w:p>
-      <w:r>
-        <w:t xml:space="preserve">  &gt; - Manage your team's hiring pipeline</w:t>
-      </w:r>
-    </w:p>
-    <w:p>
-      <w:r>
-        <w:t xml:space="preserve">  &gt; Click below to set your password and get started.</w:t>
-      </w:r>
-    </w:p>
-    <w:p>
-      <w:r>
-        <w:t xml:space="preserve">  &gt; [Button: Set Password &amp; Get Started]</w:t>
+        <w:t>{mentionedBy} mentioned you in a message about {candidateName} ({jobTitle}):</w:t>
+      </w:r>
+    </w:p>
+    <w:p>
+      <w:pPr>
+        <w:spacing w:after="80"/>
+        <w:ind w:left="480"/>
+      </w:pPr>
+      <w:r>
+        <w:rPr>
+          <w:i/>
+          <w:color w:val="555555"/>
+        </w:rPr>
+        <w:t>&gt; {preview del mensaje}</w:t>
+      </w:r>
+    </w:p>
+    <w:p>
+      <w:pPr>
+        <w:spacing w:after="80"/>
+        <w:ind w:left="480"/>
+      </w:pPr>
+      <w:r>
+        <w:rPr>
+          <w:i/>
+          <w:color w:val="555555"/>
+        </w:rPr>
+        <w:t>[Button: View Conversation]</w:t>
       </w:r>
     </w:p>
     <w:p/>
     <w:p>
+      <w:r>
+        <w:t>────────────────────────────────────────</w:t>
+      </w:r>
+    </w:p>
+    <w:p/>
+    <w:p>
+      <w:pPr>
+        <w:pStyle w:val="Heading2"/>
+      </w:pPr>
+      <w:r>
+        <w:t>📅 Interviews</w:t>
+      </w:r>
+    </w:p>
+    <w:p/>
+    <w:p>
       <w:pPr>
         <w:pStyle w:val="Heading3"/>
       </w:pPr>
       <w:r>
-        <w:t>11. Client portal welcome (después de set-password)</w:t>
+        <w:t>19. Interview invite (al candidato)</w:t>
       </w:r>
     </w:p>
     <w:p>
@@ -820,7 +2049,7 @@
         <w:pStyle w:val="ListBullet"/>
       </w:pPr>
       <w:r>
-        <w:t>Cuándo: cliente termina set-password.</w:t>
+        <w:t>Cuándo: el recruiter programa una interview y marca "Save &amp; send invite".</w:t>
       </w:r>
     </w:p>
     <w:p>
@@ -828,7 +2057,7 @@
         <w:pStyle w:val="ListBullet"/>
       </w:pPr>
       <w:r>
-        <w:t>Subject: Your Recruiting ATS client portal account is ready</w:t>
+        <w:t>Subject: Interview Invitation: {jobTitle} @ {clientName}</w:t>
       </w:r>
     </w:p>
     <w:p>
@@ -840,28 +2069,94 @@
       </w:r>
     </w:p>
     <w:p>
-      <w:r>
-        <w:t xml:space="preserve">  &gt; Welcome to Recruiting ATS</w:t>
-      </w:r>
-    </w:p>
-    <w:p>
-      <w:r>
-        <w:t xml:space="preserve">  &gt; Hi {firstName},</w:t>
-      </w:r>
-    </w:p>
-    <w:p>
-      <w:r>
-        <w:t xml:space="preserve">  &gt; Your client portal account for {clientName} is now active. Your email has been confirmed and you can sign in any time at the link below.</w:t>
-      </w:r>
-    </w:p>
-    <w:p>
-      <w:r>
-        <w:t xml:space="preserve">  &gt; Use the portal to review candidates shared by your recruiter, leave feedback, and track the searches you're hiring on.</w:t>
-      </w:r>
-    </w:p>
-    <w:p>
-      <w:r>
-        <w:t xml:space="preserve">  &gt; [Button: Open Portal]</w:t>
+      <w:pPr>
+        <w:spacing w:after="80"/>
+        <w:ind w:left="480"/>
+      </w:pPr>
+      <w:r>
+        <w:rPr>
+          <w:i/>
+          <w:color w:val="555555"/>
+        </w:rPr>
+        <w:t>Interview Invitation</w:t>
+      </w:r>
+    </w:p>
+    <w:p>
+      <w:pPr>
+        <w:spacing w:after="80"/>
+        <w:ind w:left="480"/>
+      </w:pPr>
+      <w:r>
+        <w:rPr>
+          <w:i/>
+          <w:color w:val="555555"/>
+        </w:rPr>
+        <w:t>Hi {candidateName},</w:t>
+      </w:r>
+    </w:p>
+    <w:p>
+      <w:pPr>
+        <w:spacing w:after="80"/>
+        <w:ind w:left="480"/>
+      </w:pPr>
+      <w:r>
+        <w:rPr>
+          <w:i/>
+          <w:color w:val="555555"/>
+        </w:rPr>
+        <w:t>You've been scheduled for an interview. Here are the details:</w:t>
+      </w:r>
+    </w:p>
+    <w:p>
+      <w:pPr>
+        <w:spacing w:after="80"/>
+        <w:ind w:left="480"/>
+      </w:pPr>
+      <w:r>
+        <w:rPr>
+          <w:i/>
+          <w:color w:val="555555"/>
+        </w:rPr>
+        <w:t>{tabla con job/client/date/time/timezone/type/location/notes}</w:t>
+      </w:r>
+    </w:p>
+    <w:p>
+      <w:pPr>
+        <w:spacing w:after="80"/>
+        <w:ind w:left="480"/>
+      </w:pPr>
+      <w:r>
+        <w:rPr>
+          <w:i/>
+          <w:color w:val="555555"/>
+        </w:rPr>
+        <w:t>If you need to reschedule or have any questions, please contact {recruiterName}.</w:t>
+      </w:r>
+    </w:p>
+    <w:p>
+      <w:pPr>
+        <w:spacing w:after="80"/>
+        <w:ind w:left="480"/>
+      </w:pPr>
+      <w:r>
+        <w:rPr>
+          <w:i/>
+          <w:color w:val="555555"/>
+        </w:rPr>
+        <w:t>Good luck!</w:t>
+      </w:r>
+    </w:p>
+    <w:p>
+      <w:pPr>
+        <w:spacing w:after="80"/>
+        <w:ind w:left="480"/>
+      </w:pPr>
+      <w:r>
+        <w:rPr>
+          <w:i/>
+          <w:color w:val="555555"/>
+        </w:rPr>
+        <w:t>[Button: Join Meeting] (si hay meeting link)</w:t>
       </w:r>
     </w:p>
     <w:p/>
@@ -870,7 +2165,7 @@
         <w:pStyle w:val="Heading3"/>
       </w:pPr>
       <w:r>
-        <w:t>12. Client job access granted (sumar miembro a job específico)</w:t>
+        <w:t>20. Interview invite (al cliente)</w:t>
       </w:r>
     </w:p>
     <w:p>
@@ -878,7 +2173,7 @@
         <w:pStyle w:val="ListBullet"/>
       </w:pPr>
       <w:r>
-        <w:t>Cuándo: un admin del client portal le da acceso a un job a otro teammate que ya tiene cuenta.</w:t>
+        <w:t>Cuándo: misma interview pero notificación al hiring contact.</w:t>
       </w:r>
     </w:p>
     <w:p>
@@ -886,7 +2181,7 @@
         <w:pStyle w:val="ListBullet"/>
       </w:pPr>
       <w:r>
-        <w:t>Subject: {inviterName} added you to {jobTitle}</w:t>
+        <w:t>Subject: Interview Scheduled: {candidateName} for {jobTitle} @ {clientName}</w:t>
       </w:r>
     </w:p>
     <w:p>
@@ -898,41 +2193,81 @@
       </w:r>
     </w:p>
     <w:p>
-      <w:r>
-        <w:t xml:space="preserve">  &gt; Hi {memberName},</w:t>
-      </w:r>
-    </w:p>
-    <w:p>
-      <w:r>
-        <w:t xml:space="preserve">  &gt; </w:t>
-      </w:r>
+      <w:pPr>
+        <w:spacing w:after="80"/>
+        <w:ind w:left="480"/>
+      </w:pPr>
       <w:r>
         <w:rPr>
-          <w:b/>
+          <w:i/>
+          <w:color w:val="555555"/>
         </w:rPr>
-        <w:t>{inviterName}</w:t>
-      </w:r>
-      <w:r>
-        <w:t xml:space="preserve"> just gave you access to </w:t>
-      </w:r>
+        <w:t>Interview Scheduled</w:t>
+      </w:r>
+    </w:p>
+    <w:p>
+      <w:pPr>
+        <w:spacing w:after="80"/>
+        <w:ind w:left="480"/>
+      </w:pPr>
       <w:r>
         <w:rPr>
-          <w:b/>
+          <w:i/>
+          <w:color w:val="555555"/>
         </w:rPr>
-        <w:t>{jobTitle}</w:t>
-      </w:r>
-      <w:r>
-        <w:t xml:space="preserve"> on {companyName}'s portal.</w:t>
-      </w:r>
-    </w:p>
-    <w:p>
-      <w:r>
-        <w:t xml:space="preserve">  &gt; You can now review shared candidates, post notes for the team, and follow the pipeline.</w:t>
-      </w:r>
-    </w:p>
-    <w:p>
-      <w:r>
-        <w:t xml:space="preserve">  &gt; [Button: Open Search]</w:t>
+        <w:t>Hi {contactName},</w:t>
+      </w:r>
+    </w:p>
+    <w:p>
+      <w:pPr>
+        <w:spacing w:after="80"/>
+        <w:ind w:left="480"/>
+      </w:pPr>
+      <w:r>
+        <w:rPr>
+          <w:i/>
+          <w:color w:val="555555"/>
+        </w:rPr>
+        <w:t>{recruiterName} from {firmName} has scheduled an interview for your review:</w:t>
+      </w:r>
+    </w:p>
+    <w:p>
+      <w:pPr>
+        <w:spacing w:after="80"/>
+        <w:ind w:left="480"/>
+      </w:pPr>
+      <w:r>
+        <w:rPr>
+          <w:i/>
+          <w:color w:val="555555"/>
+        </w:rPr>
+        <w:t>{tabla con candidate/job/client/date/time/type/notes}</w:t>
+      </w:r>
+    </w:p>
+    <w:p>
+      <w:pPr>
+        <w:spacing w:after="80"/>
+        <w:ind w:left="480"/>
+      </w:pPr>
+      <w:r>
+        <w:rPr>
+          <w:i/>
+          <w:color w:val="555555"/>
+        </w:rPr>
+        <w:t>Thanks for taking the time — let us know if you need to reschedule.</w:t>
+      </w:r>
+    </w:p>
+    <w:p>
+      <w:pPr>
+        <w:spacing w:after="80"/>
+        <w:ind w:left="480"/>
+      </w:pPr>
+      <w:r>
+        <w:rPr>
+          <w:i/>
+          <w:color w:val="555555"/>
+        </w:rPr>
+        <w:t>[Button: Join Meeting] (si hay link)</w:t>
       </w:r>
     </w:p>
     <w:p/>
@@ -947,7 +2282,7 @@
         <w:pStyle w:val="Heading2"/>
       </w:pPr>
       <w:r>
-        <w:t>📨 Engagement (firm ↔ client)</w:t>
+        <w:t>💳 Billing</w:t>
       </w:r>
     </w:p>
     <w:p/>
@@ -956,7 +2291,7 @@
         <w:pStyle w:val="Heading3"/>
       </w:pPr>
       <w:r>
-        <w:t>13. Engagement accepted (al cliente)</w:t>
+        <w:t>21. Subscription activated</w:t>
       </w:r>
     </w:p>
     <w:p>
@@ -964,7 +2299,7 @@
         <w:pStyle w:val="ListBullet"/>
       </w:pPr>
       <w:r>
-        <w:t>Cuándo: el firm acepta una invitación a colaborar en una búsqueda.</w:t>
+        <w:t>Cuándo: completaste checkout en Stripe.</w:t>
       </w:r>
     </w:p>
     <w:p>
@@ -972,7 +2307,7 @@
         <w:pStyle w:val="ListBullet"/>
       </w:pPr>
       <w:r>
-        <w:t>Subject: {firmName} accepted {jobTitle}</w:t>
+        <w:t>Subject: Subscription active — welcome to Recruiting ATS</w:t>
       </w:r>
     </w:p>
     <w:p>
@@ -984,36 +2319,107 @@
       </w:r>
     </w:p>
     <w:p>
-      <w:r>
-        <w:t xml:space="preserve">  &gt; Hi {inviterName},</w:t>
-      </w:r>
-    </w:p>
-    <w:p>
-      <w:r>
-        <w:t xml:space="preserve">  &gt; </w:t>
-      </w:r>
+      <w:pPr>
+        <w:spacing w:after="80"/>
+        <w:ind w:left="480"/>
+      </w:pPr>
       <w:r>
         <w:rPr>
-          <w:b/>
+          <w:i/>
+          <w:color w:val="555555"/>
         </w:rPr>
-        <w:t>{firmName}</w:t>
-      </w:r>
-      <w:r>
-        <w:t xml:space="preserve"> just accepted your invitation to work on </w:t>
-      </w:r>
+        <w:t>{firstName}, you're all set</w:t>
+      </w:r>
+    </w:p>
+    <w:p>
+      <w:pPr>
+        <w:spacing w:after="80"/>
+        <w:ind w:left="480"/>
+      </w:pPr>
       <w:r>
         <w:rPr>
-          <w:b/>
+          <w:i/>
+          <w:color w:val="555555"/>
         </w:rPr>
-        <w:t>{jobTitle}</w:t>
-      </w:r>
-      <w:r>
-        <w:t>. They can now start sharing candidates and chatting with your team.</w:t>
-      </w:r>
-    </w:p>
-    <w:p>
-      <w:r>
-        <w:t xml:space="preserve">  &gt; [Button: Open Search]</w:t>
+        <w:t>Your subscription to Recruiting ATS is now active. Thanks for trusting us with {orgName}'s recruiting workflow.</w:t>
+      </w:r>
+    </w:p>
+    <w:p>
+      <w:pPr>
+        <w:spacing w:after="80"/>
+        <w:ind w:left="480"/>
+      </w:pPr>
+      <w:r>
+        <w:rPr>
+          <w:i/>
+          <w:color w:val="555555"/>
+        </w:rPr>
+        <w:t>Plan: {N} seats · $${monthly}/month</w:t>
+      </w:r>
+    </w:p>
+    <w:p>
+      <w:pPr>
+        <w:spacing w:after="80"/>
+        <w:ind w:left="480"/>
+      </w:pPr>
+      <w:r>
+        <w:rPr>
+          <w:i/>
+          <w:color w:val="555555"/>
+        </w:rPr>
+        <w:t>Billing: Monthly, auto-renewed</w:t>
+      </w:r>
+    </w:p>
+    <w:p>
+      <w:pPr>
+        <w:spacing w:after="80"/>
+        <w:ind w:left="480"/>
+      </w:pPr>
+      <w:r>
+        <w:rPr>
+          <w:i/>
+          <w:color w:val="555555"/>
+        </w:rPr>
+        <w:t>You can manage billing — update your payment method, download invoices, or cancel — any time from your settings. Stripe will email you a receipt for every payment.</w:t>
+      </w:r>
+    </w:p>
+    <w:p>
+      <w:pPr>
+        <w:spacing w:after="80"/>
+        <w:ind w:left="480"/>
+      </w:pPr>
+      <w:r>
+        <w:rPr>
+          <w:i/>
+          <w:color w:val="555555"/>
+        </w:rPr>
+        <w:t>If you add or remove teammates the bill adjusts automatically on your next invoice.</w:t>
+      </w:r>
+    </w:p>
+    <w:p>
+      <w:pPr>
+        <w:spacing w:after="80"/>
+        <w:ind w:left="480"/>
+      </w:pPr>
+      <w:r>
+        <w:rPr>
+          <w:i/>
+          <w:color w:val="555555"/>
+        </w:rPr>
+        <w:t>Reply to this email if anything's confusing or you'd like to chat — we read every message.</w:t>
+      </w:r>
+    </w:p>
+    <w:p>
+      <w:pPr>
+        <w:spacing w:after="80"/>
+        <w:ind w:left="480"/>
+      </w:pPr>
+      <w:r>
+        <w:rPr>
+          <w:i/>
+          <w:color w:val="555555"/>
+        </w:rPr>
+        <w:t>[Button: Open Dashboard]</w:t>
       </w:r>
     </w:p>
     <w:p/>
@@ -1022,7 +2428,7 @@
         <w:pStyle w:val="Heading3"/>
       </w:pPr>
       <w:r>
-        <w:t>14. Client portal share (al cliente cuando se comparte shortlist)</w:t>
+        <w:t>22. Subscription canceled (scheduled)</w:t>
       </w:r>
     </w:p>
     <w:p>
@@ -1030,7 +2436,7 @@
         <w:pStyle w:val="ListBullet"/>
       </w:pPr>
       <w:r>
-        <w:t>Cuándo: el firm comparte candidatos con un cliente. Solo si el cliente ya tiene portal account.</w:t>
+        <w:t>Cuándo: cancelás desde Customer Portal. Sub sigue activa hasta el final del periodo.</w:t>
       </w:r>
     </w:p>
     <w:p>
@@ -1038,7 +2444,7 @@
         <w:pStyle w:val="ListBullet"/>
       </w:pPr>
       <w:r>
-        <w:t>Subject: {firmName} shared candidates with you for {jobTitle}</w:t>
+        <w:t>Subject: Subscription canceled — access until {date}</w:t>
       </w:r>
     </w:p>
     <w:p>
@@ -1050,51 +2456,94 @@
       </w:r>
     </w:p>
     <w:p>
-      <w:r>
-        <w:t xml:space="preserve">  &gt; Hi {clientName},</w:t>
-      </w:r>
-    </w:p>
-    <w:p>
-      <w:r>
-        <w:t xml:space="preserve">  &gt; </w:t>
-      </w:r>
+      <w:pPr>
+        <w:spacing w:after="80"/>
+        <w:ind w:left="480"/>
+      </w:pPr>
       <w:r>
         <w:rPr>
-          <w:b/>
+          <w:i/>
+          <w:color w:val="555555"/>
         </w:rPr>
-        <w:t>{recruiterName}</w:t>
-      </w:r>
-      <w:r>
-        <w:t xml:space="preserve"> from </w:t>
-      </w:r>
+        <w:t>{firstName}, we got your cancellation</w:t>
+      </w:r>
+    </w:p>
+    <w:p>
+      <w:pPr>
+        <w:spacing w:after="80"/>
+        <w:ind w:left="480"/>
+      </w:pPr>
       <w:r>
         <w:rPr>
-          <w:b/>
+          <w:i/>
+          <w:color w:val="555555"/>
         </w:rPr>
-        <w:t>{firmName}</w:t>
-      </w:r>
-      <w:r>
-        <w:t xml:space="preserve"> has shared a candidate shortlist with you on Recruiting ATS.</w:t>
-      </w:r>
-    </w:p>
-    <w:p>
-      <w:r>
-        <w:t xml:space="preserve">  &gt; {jobTitle}</w:t>
-      </w:r>
-    </w:p>
-    <w:p>
-      <w:r>
-        <w:t xml:space="preserve">  &gt; {N} candidates have been shared for your review.</w:t>
-      </w:r>
-    </w:p>
-    <w:p>
-      <w:r>
-        <w:t xml:space="preserve">  &gt; Sign in to your client portal to review profiles, rate candidates, and leave feedback.</w:t>
-      </w:r>
-    </w:p>
-    <w:p>
-      <w:r>
-        <w:t xml:space="preserve">  &gt; [Button: Review Candidates]</w:t>
+        <w:t>Your Recruiting ATS subscription for {orgName} is scheduled to cancel.</w:t>
+      </w:r>
+    </w:p>
+    <w:p>
+      <w:pPr>
+        <w:spacing w:after="80"/>
+        <w:ind w:left="480"/>
+      </w:pPr>
+      <w:r>
+        <w:rPr>
+          <w:i/>
+          <w:color w:val="555555"/>
+        </w:rPr>
+        <w:t>Access until: {date}</w:t>
+      </w:r>
+    </w:p>
+    <w:p>
+      <w:pPr>
+        <w:spacing w:after="80"/>
+        <w:ind w:left="480"/>
+      </w:pPr>
+      <w:r>
+        <w:rPr>
+          <w:i/>
+          <w:color w:val="555555"/>
+        </w:rPr>
+        <w:t>After that: You'll lose access to create new data. Your existing candidates, jobs and clients stay in our DB.</w:t>
+      </w:r>
+    </w:p>
+    <w:p>
+      <w:pPr>
+        <w:spacing w:after="80"/>
+        <w:ind w:left="480"/>
+      </w:pPr>
+      <w:r>
+        <w:rPr>
+          <w:i/>
+          <w:color w:val="555555"/>
+        </w:rPr>
+        <w:t>Changed your mind? Reactivate before {date} and keep everything as it is — no new charge until your normal billing cycle.</w:t>
+      </w:r>
+    </w:p>
+    <w:p>
+      <w:pPr>
+        <w:spacing w:after="80"/>
+        <w:ind w:left="480"/>
+      </w:pPr>
+      <w:r>
+        <w:rPr>
+          <w:i/>
+          <w:color w:val="555555"/>
+        </w:rPr>
+        <w:t>If we can do something to keep you on board, just reply — we read every email.</w:t>
+      </w:r>
+    </w:p>
+    <w:p>
+      <w:pPr>
+        <w:spacing w:after="80"/>
+        <w:ind w:left="480"/>
+      </w:pPr>
+      <w:r>
+        <w:rPr>
+          <w:i/>
+          <w:color w:val="555555"/>
+        </w:rPr>
+        <w:t>[Button: Reactivate subscription]</w:t>
       </w:r>
     </w:p>
     <w:p/>
@@ -1103,7 +2552,7 @@
         <w:pStyle w:val="Heading3"/>
       </w:pPr>
       <w:r>
-        <w:t>15. Candidate shared (al cliente, cada vez que se comparte un candidato individual)</w:t>
+        <w:t>23. Subscription ended</w:t>
       </w:r>
     </w:p>
     <w:p>
@@ -1111,7 +2560,7 @@
         <w:pStyle w:val="ListBullet"/>
       </w:pPr>
       <w:r>
-        <w:t>Cuándo: el firm comparte un candidato puntual con el cliente.</w:t>
+        <w:t>Cuándo: termina el periodo después de cancel. Acceso revocado.</w:t>
       </w:r>
     </w:p>
     <w:p>
@@ -1119,7 +2568,7 @@
         <w:pStyle w:val="ListBullet"/>
       </w:pPr>
       <w:r>
-        <w:t>Subject: New candidate shared: {candidateName} for {jobTitle}</w:t>
+        <w:t>Subject: Your Recruiting ATS subscription has ended</w:t>
       </w:r>
     </w:p>
     <w:p>
@@ -1131,74 +2580,94 @@
       </w:r>
     </w:p>
     <w:p>
-      <w:r>
-        <w:t xml:space="preserve">  &gt; New candidate for {jobTitle}</w:t>
-      </w:r>
-    </w:p>
-    <w:p>
-      <w:r>
-        <w:t xml:space="preserve">  &gt; Hi {firstName},</w:t>
-      </w:r>
-    </w:p>
-    <w:p>
-      <w:r>
-        <w:t xml:space="preserve">  &gt; </w:t>
-      </w:r>
+      <w:pPr>
+        <w:spacing w:after="80"/>
+        <w:ind w:left="480"/>
+      </w:pPr>
       <w:r>
         <w:rPr>
-          <w:b/>
+          <w:i/>
+          <w:color w:val="555555"/>
         </w:rPr>
-        <w:t>{recruiterName}</w:t>
-      </w:r>
-      <w:r>
-        <w:t xml:space="preserve"> from </w:t>
-      </w:r>
+        <w:t>{firstName}, your subscription has ended</w:t>
+      </w:r>
+    </w:p>
+    <w:p>
+      <w:pPr>
+        <w:spacing w:after="80"/>
+        <w:ind w:left="480"/>
+      </w:pPr>
       <w:r>
         <w:rPr>
-          <w:b/>
+          <w:i/>
+          <w:color w:val="555555"/>
         </w:rPr>
-        <w:t>{firmName}</w:t>
-      </w:r>
-      <w:r>
-        <w:t xml:space="preserve"> just shared a new candidate with </w:t>
-      </w:r>
+        <w:t>Your Recruiting ATS subscription for {orgName} ended today.</w:t>
+      </w:r>
+    </w:p>
+    <w:p>
+      <w:pPr>
+        <w:spacing w:after="80"/>
+        <w:ind w:left="480"/>
+      </w:pPr>
       <w:r>
         <w:rPr>
-          <w:b/>
+          <w:i/>
+          <w:color w:val="555555"/>
         </w:rPr>
-        <w:t>{clientName}</w:t>
-      </w:r>
-      <w:r>
-        <w:t>:</w:t>
-      </w:r>
-    </w:p>
-    <w:p>
-      <w:r>
-        <w:t xml:space="preserve">  &gt; </w:t>
-      </w:r>
+        <w:t>Your data is safe — we keep it in our DB so you can pick up where you left off. To regain access:</w:t>
+      </w:r>
+    </w:p>
+    <w:p>
+      <w:pPr>
+        <w:spacing w:after="80"/>
+        <w:ind w:left="480"/>
+      </w:pPr>
       <w:r>
         <w:rPr>
-          <w:b/>
+          <w:i/>
+          <w:color w:val="555555"/>
         </w:rPr>
-        <w:t>{candidateName}</w:t>
-      </w:r>
-      <w:r>
-        <w:t xml:space="preserve"> for {jobTitle}</w:t>
-      </w:r>
-    </w:p>
-    <w:p>
-      <w:r>
-        <w:t xml:space="preserve">  &gt; {Optional note from recruiter}</w:t>
-      </w:r>
-    </w:p>
-    <w:p>
-      <w:r>
-        <w:t xml:space="preserve">  &gt; Sign in to the client portal to view the full profile, download their resume, and leave feedback.</w:t>
-      </w:r>
-    </w:p>
-    <w:p>
-      <w:r>
-        <w:t xml:space="preserve">  &gt; [Button: View Candidate]</w:t>
+        <w:t>- Resubscribe — same price, your candidates and pipeline come back instantly.</w:t>
+      </w:r>
+    </w:p>
+    <w:p>
+      <w:pPr>
+        <w:spacing w:after="80"/>
+        <w:ind w:left="480"/>
+      </w:pPr>
+      <w:r>
+        <w:rPr>
+          <w:i/>
+          <w:color w:val="555555"/>
+        </w:rPr>
+        <w:t>- Reply to this email if you'd like to chat about your experience or ask for a custom plan.</w:t>
+      </w:r>
+    </w:p>
+    <w:p>
+      <w:pPr>
+        <w:spacing w:after="80"/>
+        <w:ind w:left="480"/>
+      </w:pPr>
+      <w:r>
+        <w:rPr>
+          <w:i/>
+          <w:color w:val="555555"/>
+        </w:rPr>
+        <w:t>Thanks for using Recruiting ATS, whatever you decide.</w:t>
+      </w:r>
+    </w:p>
+    <w:p>
+      <w:pPr>
+        <w:spacing w:after="80"/>
+        <w:ind w:left="480"/>
+      </w:pPr>
+      <w:r>
+        <w:rPr>
+          <w:i/>
+          <w:color w:val="555555"/>
+        </w:rPr>
+        <w:t>[Button: Resubscribe]</w:t>
       </w:r>
     </w:p>
     <w:p/>
@@ -1207,7 +2676,7 @@
         <w:pStyle w:val="Heading3"/>
       </w:pPr>
       <w:r>
-        <w:t>16. Candidate feedback (al recruiter, cuando el cliente deja review)</w:t>
+        <w:t>24. Subscription reactivated</w:t>
       </w:r>
     </w:p>
     <w:p>
@@ -1215,7 +2684,7 @@
         <w:pStyle w:val="ListBullet"/>
       </w:pPr>
       <w:r>
-        <w:t>Cuándo: cliente puntúa o comenta un candidato.</w:t>
+        <w:t>Cuándo: después de cancelar, el user reactiva antes de que termine el periodo.</w:t>
       </w:r>
     </w:p>
     <w:p>
@@ -1223,7 +2692,7 @@
         <w:pStyle w:val="ListBullet"/>
       </w:pPr>
       <w:r>
-        <w:t>Subject: {reviewerName} left {N}★ feedback on {candidateName} (o "new feedback" / "viewed")</w:t>
+        <w:t>Subject: Subscription reactivated — welcome back</w:t>
       </w:r>
     </w:p>
     <w:p>
@@ -1235,84 +2704,77 @@
       </w:r>
     </w:p>
     <w:p>
-      <w:r>
-        <w:t xml:space="preserve">  &gt; New feedback on {candidateName}</w:t>
-      </w:r>
-    </w:p>
-    <w:p>
-      <w:r>
-        <w:t xml:space="preserve">  &gt; Hi {recruiterName},</w:t>
-      </w:r>
-    </w:p>
-    <w:p>
-      <w:r>
-        <w:t xml:space="preserve">  &gt; </w:t>
-      </w:r>
+      <w:pPr>
+        <w:spacing w:after="80"/>
+        <w:ind w:left="480"/>
+      </w:pPr>
       <w:r>
         <w:rPr>
-          <w:b/>
+          <w:i/>
+          <w:color w:val="555555"/>
         </w:rPr>
-        <w:t>{reviewerName}</w:t>
-      </w:r>
-      <w:r>
-        <w:t xml:space="preserve"> at </w:t>
-      </w:r>
+        <w:t>{firstName}, glad to have you back</w:t>
+      </w:r>
+    </w:p>
+    <w:p>
+      <w:pPr>
+        <w:spacing w:after="80"/>
+        <w:ind w:left="480"/>
+      </w:pPr>
       <w:r>
         <w:rPr>
-          <w:b/>
+          <w:i/>
+          <w:color w:val="555555"/>
         </w:rPr>
-        <w:t>{clientCompanyName}</w:t>
-      </w:r>
-      <w:r>
-        <w:t xml:space="preserve"> just left feedback on </w:t>
-      </w:r>
+        <w:t>Your Recruiting ATS subscription for {orgName} is back on track. No cancellation pending.</w:t>
+      </w:r>
+    </w:p>
+    <w:p>
+      <w:pPr>
+        <w:spacing w:after="80"/>
+        <w:ind w:left="480"/>
+      </w:pPr>
       <w:r>
         <w:rPr>
-          <w:b/>
+          <w:i/>
+          <w:color w:val="555555"/>
         </w:rPr>
-        <w:t>{candidateName}</w:t>
-      </w:r>
-      <w:r>
-        <w:t xml:space="preserve"> for {jobTitle}.</w:t>
-      </w:r>
-    </w:p>
-    <w:p>
-      <w:r>
-        <w:t xml:space="preserve">  &gt; Rating: ★★★★☆ (4/5)</w:t>
-      </w:r>
-    </w:p>
-    <w:p>
-      <w:r>
-        <w:t xml:space="preserve">  &gt; {Optional comment}</w:t>
-      </w:r>
-    </w:p>
-    <w:p>
-      <w:r>
-        <w:t xml:space="preserve">  &gt; [Button: View Candidate]</w:t>
+        <w:t>Next billing date: {date}. Same plan, same seats — billing continues uninterrupted.</w:t>
+      </w:r>
+    </w:p>
+    <w:p>
+      <w:pPr>
+        <w:spacing w:after="80"/>
+        <w:ind w:left="480"/>
+      </w:pPr>
+      <w:r>
+        <w:rPr>
+          <w:i/>
+          <w:color w:val="555555"/>
+        </w:rPr>
+        <w:t>If you reactivated by accident, you can cancel again from Settings → Billing.</w:t>
+      </w:r>
+    </w:p>
+    <w:p>
+      <w:pPr>
+        <w:spacing w:after="80"/>
+        <w:ind w:left="480"/>
+      </w:pPr>
+      <w:r>
+        <w:rPr>
+          <w:i/>
+          <w:color w:val="555555"/>
+        </w:rPr>
+        <w:t>[Button: Open Dashboard]</w:t>
       </w:r>
     </w:p>
     <w:p/>
     <w:p>
-      <w:r>
-        <w:t>────────────────────────────────────────</w:t>
-      </w:r>
-    </w:p>
-    <w:p/>
-    <w:p>
-      <w:pPr>
-        <w:pStyle w:val="Heading2"/>
-      </w:pPr>
-      <w:r>
-        <w:t>💬 Chat &amp; menciones</w:t>
-      </w:r>
-    </w:p>
-    <w:p/>
-    <w:p>
       <w:pPr>
         <w:pStyle w:val="Heading3"/>
       </w:pPr>
       <w:r>
-        <w:t>17. New message (chat)</w:t>
+        <w:t>25. Payment failed</w:t>
       </w:r>
     </w:p>
     <w:p>
@@ -1320,7 +2782,7 @@
         <w:pStyle w:val="ListBullet"/>
       </w:pPr>
       <w:r>
-        <w:t>Cuándo: alguien manda un mensaje en el chat (interno o cliente). Solo a los que NO están @-mencionados; los @-mencionados van por la mention email (#18).</w:t>
+        <w:t>Cuándo: Stripe no pudo cobrar la tarjeta (decline, expirada, etc).</w:t>
       </w:r>
     </w:p>
     <w:p>
@@ -1328,7 +2790,7 @@
         <w:pStyle w:val="ListBullet"/>
       </w:pPr>
       <w:r>
-        <w:t>Subject: New message on {candidateName} — {jobTitle}</w:t>
+        <w:t>Subject: Action required: payment failed for Recruiting ATS</w:t>
       </w:r>
     </w:p>
     <w:p>
@@ -1340,729 +2802,55 @@
       </w:r>
     </w:p>
     <w:p>
-      <w:r>
-        <w:t xml:space="preserve">  &gt; New message about {candidateName}</w:t>
-      </w:r>
-    </w:p>
-    <w:p>
-      <w:r>
-        <w:t xml:space="preserve">  &gt; Hi {firstName},</w:t>
-      </w:r>
-    </w:p>
-    <w:p>
-      <w:r>
-        <w:t xml:space="preserve">  &gt; </w:t>
-      </w:r>
+      <w:pPr>
+        <w:spacing w:after="80"/>
+        <w:ind w:left="480"/>
+      </w:pPr>
       <w:r>
         <w:rPr>
-          <w:b/>
+          <w:i/>
+          <w:color w:val="555555"/>
         </w:rPr>
-        <w:t>{fromName}</w:t>
-      </w:r>
-      <w:r>
-        <w:t xml:space="preserve"> ({a recruiter | the client | your team}) left a new message in {your internal channel | the shared chat} for </w:t>
-      </w:r>
+        <w:t>{firstName}, your payment didn't go through</w:t>
+      </w:r>
+    </w:p>
+    <w:p>
+      <w:pPr>
+        <w:spacing w:after="80"/>
+        <w:ind w:left="480"/>
+      </w:pPr>
       <w:r>
         <w:rPr>
-          <w:b/>
+          <w:i/>
+          <w:color w:val="555555"/>
         </w:rPr>
-        <w:t>{candidateName}</w:t>
-      </w:r>
-      <w:r>
-        <w:t xml:space="preserve"> ({jobTitle}):</w:t>
-      </w:r>
-    </w:p>
-    <w:p>
-      <w:r>
-        <w:t xml:space="preserve">  &gt; &gt; {preview del mensaje}</w:t>
-      </w:r>
-    </w:p>
-    <w:p>
-      <w:r>
-        <w:t xml:space="preserve">  &gt; [Button: View Conversation]</w:t>
-      </w:r>
-    </w:p>
-    <w:p/>
-    <w:p>
-      <w:pPr>
-        <w:pStyle w:val="Heading3"/>
-      </w:pPr>
-      <w:r>
-        <w:t>18. Mention</w:t>
-      </w:r>
-    </w:p>
-    <w:p>
-      <w:pPr>
-        <w:pStyle w:val="ListBullet"/>
-      </w:pPr>
-      <w:r>
-        <w:t>Cuándo: alguien te @-menciona en un chat.</w:t>
-      </w:r>
-    </w:p>
-    <w:p>
-      <w:pPr>
-        <w:pStyle w:val="ListBullet"/>
-      </w:pPr>
-      <w:r>
-        <w:t>Subject: {mentionedBy} mentioned you — {candidateName}</w:t>
-      </w:r>
-    </w:p>
-    <w:p>
-      <w:pPr>
-        <w:pStyle w:val="ListBullet"/>
-      </w:pPr>
-      <w:r>
-        <w:t>Body:</w:t>
-      </w:r>
-    </w:p>
-    <w:p>
-      <w:r>
-        <w:t xml:space="preserve">  &gt; {mentionedBy} mentioned you</w:t>
-      </w:r>
-    </w:p>
-    <w:p>
-      <w:r>
-        <w:t xml:space="preserve">  &gt; Hi {firstName},</w:t>
-      </w:r>
-    </w:p>
-    <w:p>
-      <w:r>
-        <w:t xml:space="preserve">  &gt; </w:t>
-      </w:r>
+        <w:t>We tried to charge your card for Recruiting ATS — {orgName} — and the bank declined it.</w:t>
+      </w:r>
+    </w:p>
+    <w:p>
+      <w:pPr>
+        <w:spacing w:after="80"/>
+        <w:ind w:left="480"/>
+      </w:pPr>
       <w:r>
         <w:rPr>
-          <w:b/>
+          <w:i/>
+          <w:color w:val="555555"/>
         </w:rPr>
-        <w:t>{mentionedBy}</w:t>
-      </w:r>
-      <w:r>
-        <w:t xml:space="preserve"> mentioned you in a message about </w:t>
-      </w:r>
+        <w:t>To avoid losing access, update your payment method:</w:t>
+      </w:r>
+    </w:p>
+    <w:p>
+      <w:pPr>
+        <w:spacing w:after="80"/>
+        <w:ind w:left="480"/>
+      </w:pPr>
       <w:r>
         <w:rPr>
-          <w:b/>
+          <w:i/>
+          <w:color w:val="555555"/>
         </w:rPr>
-        <w:t>{candidateName}</w:t>
-      </w:r>
-      <w:r>
-        <w:t xml:space="preserve"> ({jobTitle}):</w:t>
-      </w:r>
-    </w:p>
-    <w:p>
-      <w:r>
-        <w:t xml:space="preserve">  &gt; &gt; {preview del mensaje}</w:t>
-      </w:r>
-    </w:p>
-    <w:p>
-      <w:r>
-        <w:t xml:space="preserve">  &gt; [Button: View Conversation]</w:t>
-      </w:r>
-    </w:p>
-    <w:p/>
-    <w:p>
-      <w:r>
-        <w:t>────────────────────────────────────────</w:t>
-      </w:r>
-    </w:p>
-    <w:p/>
-    <w:p>
-      <w:pPr>
-        <w:pStyle w:val="Heading2"/>
-      </w:pPr>
-      <w:r>
-        <w:t>📅 Interviews</w:t>
-      </w:r>
-    </w:p>
-    <w:p/>
-    <w:p>
-      <w:pPr>
-        <w:pStyle w:val="Heading3"/>
-      </w:pPr>
-      <w:r>
-        <w:t>19. Interview invite (al candidato)</w:t>
-      </w:r>
-    </w:p>
-    <w:p>
-      <w:pPr>
-        <w:pStyle w:val="ListBullet"/>
-      </w:pPr>
-      <w:r>
-        <w:t>Cuándo: el recruiter programa una interview y marca "Save &amp; send invite".</w:t>
-      </w:r>
-    </w:p>
-    <w:p>
-      <w:pPr>
-        <w:pStyle w:val="ListBullet"/>
-      </w:pPr>
-      <w:r>
-        <w:t>Subject: Interview Invitation: {jobTitle} @ {clientName}</w:t>
-      </w:r>
-    </w:p>
-    <w:p>
-      <w:pPr>
-        <w:pStyle w:val="ListBullet"/>
-      </w:pPr>
-      <w:r>
-        <w:t>Body:</w:t>
-      </w:r>
-    </w:p>
-    <w:p>
-      <w:r>
-        <w:t xml:space="preserve">  &gt; Interview Invitation</w:t>
-      </w:r>
-    </w:p>
-    <w:p>
-      <w:r>
-        <w:t xml:space="preserve">  &gt; Hi {candidateName},</w:t>
-      </w:r>
-    </w:p>
-    <w:p>
-      <w:r>
-        <w:t xml:space="preserve">  &gt; You've been scheduled for an interview. Here are the details:</w:t>
-      </w:r>
-    </w:p>
-    <w:p>
-      <w:r>
-        <w:t xml:space="preserve">  &gt; {tabla con job/client/date/time/timezone/type/location/notes}</w:t>
-      </w:r>
-    </w:p>
-    <w:p>
-      <w:r>
-        <w:t xml:space="preserve">  &gt; If you need to reschedule or have any questions, please contact </w:t>
-      </w:r>
-      <w:r>
-        <w:rPr>
-          <w:b/>
-        </w:rPr>
-        <w:t>{recruiterName}</w:t>
-      </w:r>
-      <w:r>
-        <w:t>.</w:t>
-      </w:r>
-    </w:p>
-    <w:p>
-      <w:r>
-        <w:t xml:space="preserve">  &gt; Good luck!</w:t>
-      </w:r>
-    </w:p>
-    <w:p>
-      <w:r>
-        <w:t xml:space="preserve">  &gt; [Button: Join Meeting] (si hay meeting link)</w:t>
-      </w:r>
-    </w:p>
-    <w:p/>
-    <w:p>
-      <w:pPr>
-        <w:pStyle w:val="Heading3"/>
-      </w:pPr>
-      <w:r>
-        <w:t>20. Interview invite (al cliente)</w:t>
-      </w:r>
-    </w:p>
-    <w:p>
-      <w:pPr>
-        <w:pStyle w:val="ListBullet"/>
-      </w:pPr>
-      <w:r>
-        <w:t>Cuándo: misma interview pero notificación al hiring contact.</w:t>
-      </w:r>
-    </w:p>
-    <w:p>
-      <w:pPr>
-        <w:pStyle w:val="ListBullet"/>
-      </w:pPr>
-      <w:r>
-        <w:t>Subject: Interview Scheduled: {candidateName} for {jobTitle} @ {clientName}</w:t>
-      </w:r>
-    </w:p>
-    <w:p>
-      <w:pPr>
-        <w:pStyle w:val="ListBullet"/>
-      </w:pPr>
-      <w:r>
-        <w:t>Body:</w:t>
-      </w:r>
-    </w:p>
-    <w:p>
-      <w:r>
-        <w:t xml:space="preserve">  &gt; Interview Scheduled</w:t>
-      </w:r>
-    </w:p>
-    <w:p>
-      <w:r>
-        <w:t xml:space="preserve">  &gt; Hi {contactName},</w:t>
-      </w:r>
-    </w:p>
-    <w:p>
-      <w:r>
-        <w:t xml:space="preserve">  &gt; </w:t>
-      </w:r>
-      <w:r>
-        <w:rPr>
-          <w:b/>
-        </w:rPr>
-        <w:t>{recruiterName}</w:t>
-      </w:r>
-      <w:r>
-        <w:t xml:space="preserve"> from </w:t>
-      </w:r>
-      <w:r>
-        <w:rPr>
-          <w:b/>
-        </w:rPr>
-        <w:t>{firmName}</w:t>
-      </w:r>
-      <w:r>
-        <w:t xml:space="preserve"> has scheduled an interview for your review:</w:t>
-      </w:r>
-    </w:p>
-    <w:p>
-      <w:r>
-        <w:t xml:space="preserve">  &gt; {tabla con candidate/job/client/date/time/type/notes}</w:t>
-      </w:r>
-    </w:p>
-    <w:p>
-      <w:r>
-        <w:t xml:space="preserve">  &gt; Thanks for taking the time — let us know if you need to reschedule.</w:t>
-      </w:r>
-    </w:p>
-    <w:p>
-      <w:r>
-        <w:t xml:space="preserve">  &gt; [Button: Join Meeting] (si hay link)</w:t>
-      </w:r>
-    </w:p>
-    <w:p/>
-    <w:p>
-      <w:r>
-        <w:t>────────────────────────────────────────</w:t>
-      </w:r>
-    </w:p>
-    <w:p/>
-    <w:p>
-      <w:pPr>
-        <w:pStyle w:val="Heading2"/>
-      </w:pPr>
-      <w:r>
-        <w:t>💳 Billing</w:t>
-      </w:r>
-    </w:p>
-    <w:p/>
-    <w:p>
-      <w:pPr>
-        <w:pStyle w:val="Heading3"/>
-      </w:pPr>
-      <w:r>
-        <w:t>21. Subscription activated</w:t>
-      </w:r>
-    </w:p>
-    <w:p>
-      <w:pPr>
-        <w:pStyle w:val="ListBullet"/>
-      </w:pPr>
-      <w:r>
-        <w:t>Cuándo: completaste checkout en Stripe.</w:t>
-      </w:r>
-    </w:p>
-    <w:p>
-      <w:pPr>
-        <w:pStyle w:val="ListBullet"/>
-      </w:pPr>
-      <w:r>
-        <w:t>Subject: Subscription active — welcome to Recruiting ATS</w:t>
-      </w:r>
-    </w:p>
-    <w:p>
-      <w:pPr>
-        <w:pStyle w:val="ListBullet"/>
-      </w:pPr>
-      <w:r>
-        <w:t>Body:</w:t>
-      </w:r>
-    </w:p>
-    <w:p>
-      <w:r>
-        <w:t xml:space="preserve">  &gt; {firstName}, you're all set</w:t>
-      </w:r>
-    </w:p>
-    <w:p>
-      <w:r>
-        <w:t xml:space="preserve">  &gt; Your subscription to </w:t>
-      </w:r>
-      <w:r>
-        <w:rPr>
-          <w:b/>
-        </w:rPr>
-        <w:t>Recruiting ATS</w:t>
-      </w:r>
-      <w:r>
-        <w:t xml:space="preserve"> is now active. Thanks for trusting us with </w:t>
-      </w:r>
-      <w:r>
-        <w:rPr>
-          <w:b/>
-        </w:rPr>
-        <w:t>{orgName}</w:t>
-      </w:r>
-      <w:r>
-        <w:t>'s recruiting workflow.</w:t>
-      </w:r>
-    </w:p>
-    <w:p>
-      <w:r>
-        <w:t xml:space="preserve">  &gt; Plan: {N} seats · $${monthly}/month</w:t>
-      </w:r>
-    </w:p>
-    <w:p>
-      <w:r>
-        <w:t xml:space="preserve">  &gt; Billing: Monthly, auto-renewed</w:t>
-      </w:r>
-    </w:p>
-    <w:p>
-      <w:r>
-        <w:t xml:space="preserve">  &gt; You can manage billing — update your payment method, download invoices, or cancel — any time from your settings. Stripe will email you a receipt for every payment.</w:t>
-      </w:r>
-    </w:p>
-    <w:p>
-      <w:r>
-        <w:t xml:space="preserve">  &gt; If you add or remove teammates the bill adjusts automatically on your next invoice.</w:t>
-      </w:r>
-    </w:p>
-    <w:p>
-      <w:r>
-        <w:t xml:space="preserve">  &gt; Reply to this email if anything's confusing or you'd like to chat — we read every message.</w:t>
-      </w:r>
-    </w:p>
-    <w:p>
-      <w:r>
-        <w:t xml:space="preserve">  &gt; [Button: Open Dashboard]</w:t>
-      </w:r>
-    </w:p>
-    <w:p/>
-    <w:p>
-      <w:pPr>
-        <w:pStyle w:val="Heading3"/>
-      </w:pPr>
-      <w:r>
-        <w:t>22. Subscription canceled (scheduled)</w:t>
-      </w:r>
-    </w:p>
-    <w:p>
-      <w:pPr>
-        <w:pStyle w:val="ListBullet"/>
-      </w:pPr>
-      <w:r>
-        <w:t>Cuándo: cancelás desde Customer Portal. Sub sigue activa hasta el final del periodo.</w:t>
-      </w:r>
-    </w:p>
-    <w:p>
-      <w:pPr>
-        <w:pStyle w:val="ListBullet"/>
-      </w:pPr>
-      <w:r>
-        <w:t>Subject: Subscription canceled — access until {date}</w:t>
-      </w:r>
-    </w:p>
-    <w:p>
-      <w:pPr>
-        <w:pStyle w:val="ListBullet"/>
-      </w:pPr>
-      <w:r>
-        <w:t>Body:</w:t>
-      </w:r>
-    </w:p>
-    <w:p>
-      <w:r>
-        <w:t xml:space="preserve">  &gt; {firstName}, we got your cancellation</w:t>
-      </w:r>
-    </w:p>
-    <w:p>
-      <w:r>
-        <w:t xml:space="preserve">  &gt; Your </w:t>
-      </w:r>
-      <w:r>
-        <w:rPr>
-          <w:b/>
-        </w:rPr>
-        <w:t>Recruiting ATS</w:t>
-      </w:r>
-      <w:r>
-        <w:t xml:space="preserve"> subscription for </w:t>
-      </w:r>
-      <w:r>
-        <w:rPr>
-          <w:b/>
-        </w:rPr>
-        <w:t>{orgName}</w:t>
-      </w:r>
-      <w:r>
-        <w:t xml:space="preserve"> is scheduled to cancel.</w:t>
-      </w:r>
-    </w:p>
-    <w:p>
-      <w:r>
-        <w:t xml:space="preserve">  &gt; Access until: {date}</w:t>
-      </w:r>
-    </w:p>
-    <w:p>
-      <w:r>
-        <w:t xml:space="preserve">  &gt; After that: You'll lose access to create new data. Your existing candidates, jobs and clients stay in our DB.</w:t>
-      </w:r>
-    </w:p>
-    <w:p>
-      <w:r>
-        <w:t xml:space="preserve">  &gt; Changed your mind? Reactivate before {date} and keep everything as it is — no new charge until your normal billing cycle.</w:t>
-      </w:r>
-    </w:p>
-    <w:p>
-      <w:r>
-        <w:t xml:space="preserve">  &gt; If we can do something to keep you on board, just reply — we read every email.</w:t>
-      </w:r>
-    </w:p>
-    <w:p>
-      <w:r>
-        <w:t xml:space="preserve">  &gt; [Button: Reactivate subscription]</w:t>
-      </w:r>
-    </w:p>
-    <w:p/>
-    <w:p>
-      <w:pPr>
-        <w:pStyle w:val="Heading3"/>
-      </w:pPr>
-      <w:r>
-        <w:t>23. Subscription ended</w:t>
-      </w:r>
-    </w:p>
-    <w:p>
-      <w:pPr>
-        <w:pStyle w:val="ListBullet"/>
-      </w:pPr>
-      <w:r>
-        <w:t>Cuándo: termina el periodo después de cancel. Acceso revocado.</w:t>
-      </w:r>
-    </w:p>
-    <w:p>
-      <w:pPr>
-        <w:pStyle w:val="ListBullet"/>
-      </w:pPr>
-      <w:r>
-        <w:t>Subject: Your Recruiting ATS subscription has ended</w:t>
-      </w:r>
-    </w:p>
-    <w:p>
-      <w:pPr>
-        <w:pStyle w:val="ListBullet"/>
-      </w:pPr>
-      <w:r>
-        <w:t>Body:</w:t>
-      </w:r>
-    </w:p>
-    <w:p>
-      <w:r>
-        <w:t xml:space="preserve">  &gt; {firstName}, your subscription has ended</w:t>
-      </w:r>
-    </w:p>
-    <w:p>
-      <w:r>
-        <w:t xml:space="preserve">  &gt; Your </w:t>
-      </w:r>
-      <w:r>
-        <w:rPr>
-          <w:b/>
-        </w:rPr>
-        <w:t>Recruiting ATS</w:t>
-      </w:r>
-      <w:r>
-        <w:t xml:space="preserve"> subscription for </w:t>
-      </w:r>
-      <w:r>
-        <w:rPr>
-          <w:b/>
-        </w:rPr>
-        <w:t>{orgName}</w:t>
-      </w:r>
-      <w:r>
-        <w:t xml:space="preserve"> ended today.</w:t>
-      </w:r>
-    </w:p>
-    <w:p>
-      <w:r>
-        <w:t xml:space="preserve">  &gt; Your data is safe — we keep it in our DB so you can pick up where you left off. To regain access:</w:t>
-      </w:r>
-    </w:p>
-    <w:p>
-      <w:r>
-        <w:t xml:space="preserve">  &gt; - Resubscribe — same price, your candidates and pipeline come back instantly.</w:t>
-      </w:r>
-    </w:p>
-    <w:p>
-      <w:r>
-        <w:t xml:space="preserve">  &gt; - Reply to this email if you'd like to chat about your experience or ask for a custom plan.</w:t>
-      </w:r>
-    </w:p>
-    <w:p>
-      <w:r>
-        <w:t xml:space="preserve">  &gt; Thanks for using Recruiting ATS, whatever you decide.</w:t>
-      </w:r>
-    </w:p>
-    <w:p>
-      <w:r>
-        <w:t xml:space="preserve">  &gt; [Button: Resubscribe]</w:t>
-      </w:r>
-    </w:p>
-    <w:p/>
-    <w:p>
-      <w:pPr>
-        <w:pStyle w:val="Heading3"/>
-      </w:pPr>
-      <w:r>
-        <w:t>24. Subscription reactivated</w:t>
-      </w:r>
-    </w:p>
-    <w:p>
-      <w:pPr>
-        <w:pStyle w:val="ListBullet"/>
-      </w:pPr>
-      <w:r>
-        <w:t>Cuándo: después de cancelar, el user reactiva antes de que termine el periodo.</w:t>
-      </w:r>
-    </w:p>
-    <w:p>
-      <w:pPr>
-        <w:pStyle w:val="ListBullet"/>
-      </w:pPr>
-      <w:r>
-        <w:t>Subject: Subscription reactivated — welcome back</w:t>
-      </w:r>
-    </w:p>
-    <w:p>
-      <w:pPr>
-        <w:pStyle w:val="ListBullet"/>
-      </w:pPr>
-      <w:r>
-        <w:t>Body:</w:t>
-      </w:r>
-    </w:p>
-    <w:p>
-      <w:r>
-        <w:t xml:space="preserve">  &gt; {firstName}, glad to have you back</w:t>
-      </w:r>
-    </w:p>
-    <w:p>
-      <w:r>
-        <w:t xml:space="preserve">  &gt; Your </w:t>
-      </w:r>
-      <w:r>
-        <w:rPr>
-          <w:b/>
-        </w:rPr>
-        <w:t>Recruiting ATS</w:t>
-      </w:r>
-      <w:r>
-        <w:t xml:space="preserve"> subscription for </w:t>
-      </w:r>
-      <w:r>
-        <w:rPr>
-          <w:b/>
-        </w:rPr>
-        <w:t>{orgName}</w:t>
-      </w:r>
-      <w:r>
-        <w:t xml:space="preserve"> is back on track. No cancellation pending.</w:t>
-      </w:r>
-    </w:p>
-    <w:p>
-      <w:r>
-        <w:t xml:space="preserve">  &gt; Next billing date: </w:t>
-      </w:r>
-      <w:r>
-        <w:rPr>
-          <w:b/>
-        </w:rPr>
-        <w:t>{date}</w:t>
-      </w:r>
-      <w:r>
-        <w:t>. Same plan, same seats — billing continues uninterrupted.</w:t>
-      </w:r>
-    </w:p>
-    <w:p>
-      <w:r>
-        <w:t xml:space="preserve">  &gt; If you reactivated by accident, you can cancel again from Settings → Billing.</w:t>
-      </w:r>
-    </w:p>
-    <w:p>
-      <w:r>
-        <w:t xml:space="preserve">  &gt; [Button: Open Dashboard]</w:t>
-      </w:r>
-    </w:p>
-    <w:p/>
-    <w:p>
-      <w:pPr>
-        <w:pStyle w:val="Heading3"/>
-      </w:pPr>
-      <w:r>
-        <w:t>25. Payment failed</w:t>
-      </w:r>
-    </w:p>
-    <w:p>
-      <w:pPr>
-        <w:pStyle w:val="ListBullet"/>
-      </w:pPr>
-      <w:r>
-        <w:t>Cuándo: Stripe no pudo cobrar la tarjeta (decline, expirada, etc).</w:t>
-      </w:r>
-    </w:p>
-    <w:p>
-      <w:pPr>
-        <w:pStyle w:val="ListBullet"/>
-      </w:pPr>
-      <w:r>
-        <w:t>Subject: Action required: payment failed for Recruiting ATS</w:t>
-      </w:r>
-    </w:p>
-    <w:p>
-      <w:pPr>
-        <w:pStyle w:val="ListBullet"/>
-      </w:pPr>
-      <w:r>
-        <w:t>Body:</w:t>
-      </w:r>
-    </w:p>
-    <w:p>
-      <w:r>
-        <w:t xml:space="preserve">  &gt; {firstName}, your payment didn't go through</w:t>
-      </w:r>
-    </w:p>
-    <w:p>
-      <w:r>
-        <w:t xml:space="preserve">  &gt; We tried to charge your card for </w:t>
-      </w:r>
-      <w:r>
-        <w:rPr>
-          <w:b/>
-        </w:rPr>
-        <w:t>Recruiting ATS</w:t>
-      </w:r>
-      <w:r>
-        <w:t xml:space="preserve"> — </w:t>
-      </w:r>
-      <w:r>
-        <w:rPr>
-          <w:b/>
-        </w:rPr>
-        <w:t>{orgName}</w:t>
-      </w:r>
-      <w:r>
-        <w:t xml:space="preserve"> — and the bank declined it.</w:t>
-      </w:r>
-    </w:p>
-    <w:p>
-      <w:r>
-        <w:t xml:space="preserve">  &gt; To avoid losing access, update your payment method:</w:t>
-      </w:r>
-    </w:p>
-    <w:p>
-      <w:r>
-        <w:t xml:space="preserve">  &gt; [Button: Update payment method]</w:t>
+        <w:t>[Button: Update payment method]</w:t>
       </w:r>
     </w:p>
     <w:p/>

</xml_diff>

<commit_message>
docs: Email-Copys.docx — body como texto de corrido (sin '>') (#335)
Antes: cada linea del body aparecia con el '>' literal de markdown
y se leia "bot-like". Feedback Nicolas 2026-06-24.

Ahora: cada linea del body es un parrafo italic + gris suave,
sin el '>'. Se lee como mail real (saludo, body, closing, boton)
en lugar de raw source.

Co-authored-by: Claude <noreply@anthropic.com>
</commit_message>
<xml_diff>
--- a/docs/email-review/Email-Copys.docx
+++ b/docs/email-review/Email-Copys.docx
@@ -13,33 +13,39 @@
     <w:p/>
     <w:p>
       <w:pPr>
+        <w:spacing w:after="80"/>
         <w:ind w:left="480"/>
       </w:pPr>
       <w:r>
         <w:rPr>
-          <w:color w:val="444444"/>
+          <w:i/>
+          <w:color w:val="555555"/>
         </w:rPr>
         <w:t>Listado plano de todos los emails transaccionales que manda el ATS.</w:t>
       </w:r>
     </w:p>
     <w:p>
       <w:pPr>
+        <w:spacing w:after="80"/>
         <w:ind w:left="480"/>
       </w:pPr>
       <w:r>
         <w:rPr>
-          <w:color w:val="444444"/>
+          <w:i/>
+          <w:color w:val="555555"/>
         </w:rPr>
         <w:t>Variables entre {llaves} se reemplazan en tiempo de envío.</w:t>
       </w:r>
     </w:p>
     <w:p>
       <w:pPr>
+        <w:spacing w:after="80"/>
         <w:ind w:left="480"/>
       </w:pPr>
       <w:r>
         <w:rPr>
-          <w:color w:val="444444"/>
+          <w:i/>
+          <w:color w:val="555555"/>
         </w:rPr>
         <w:t>Todos estos están live en producción ahora mismo.</w:t>
       </w:r>
@@ -47,22 +53,26 @@
     <w:p/>
     <w:p>
       <w:pPr>
+        <w:spacing w:after="80"/>
         <w:ind w:left="480"/>
       </w:pPr>
       <w:r>
         <w:rPr>
-          <w:color w:val="444444"/>
+          <w:i/>
+          <w:color w:val="555555"/>
         </w:rPr>
         <w:t>Para revisar y cambiar con Ari. Cuando definan los nuevos copys,</w:t>
       </w:r>
     </w:p>
     <w:p>
       <w:pPr>
+        <w:spacing w:after="80"/>
         <w:ind w:left="480"/>
       </w:pPr>
       <w:r>
         <w:rPr>
-          <w:color w:val="444444"/>
+          <w:i/>
+          <w:color w:val="555555"/>
         </w:rPr>
         <w:t>los cambio en lib/email.ts en un solo PR.</w:t>
       </w:r>
@@ -116,23 +126,55 @@
       </w:r>
     </w:p>
     <w:p>
-      <w:r>
-        <w:t xml:space="preserve">  &gt; Hi {firstName},</w:t>
-      </w:r>
-    </w:p>
-    <w:p>
-      <w:r>
-        <w:t xml:space="preserve">  &gt; Thanks for signing up. Click the button to confirm this is your email.</w:t>
-      </w:r>
-    </w:p>
-    <w:p>
-      <w:r>
-        <w:t xml:space="preserve">  &gt; This link expires in 24 hours.</w:t>
-      </w:r>
-    </w:p>
-    <w:p>
-      <w:r>
-        <w:t xml:space="preserve">  &gt; [Button: Verify Email]</w:t>
+      <w:pPr>
+        <w:spacing w:after="80"/>
+        <w:ind w:left="480"/>
+      </w:pPr>
+      <w:r>
+        <w:rPr>
+          <w:i/>
+          <w:color w:val="555555"/>
+        </w:rPr>
+        <w:t>Hi {firstName},</w:t>
+      </w:r>
+    </w:p>
+    <w:p>
+      <w:pPr>
+        <w:spacing w:after="80"/>
+        <w:ind w:left="480"/>
+      </w:pPr>
+      <w:r>
+        <w:rPr>
+          <w:i/>
+          <w:color w:val="555555"/>
+        </w:rPr>
+        <w:t>Thanks for signing up. Click the button to confirm this is your email.</w:t>
+      </w:r>
+    </w:p>
+    <w:p>
+      <w:pPr>
+        <w:spacing w:after="80"/>
+        <w:ind w:left="480"/>
+      </w:pPr>
+      <w:r>
+        <w:rPr>
+          <w:i/>
+          <w:color w:val="555555"/>
+        </w:rPr>
+        <w:t>This link expires in 24 hours.</w:t>
+      </w:r>
+    </w:p>
+    <w:p>
+      <w:pPr>
+        <w:spacing w:after="80"/>
+        <w:ind w:left="480"/>
+      </w:pPr>
+      <w:r>
+        <w:rPr>
+          <w:i/>
+          <w:color w:val="555555"/>
+        </w:rPr>
+        <w:t>[Button: Verify Email]</w:t>
       </w:r>
     </w:p>
     <w:p/>
@@ -169,28 +211,68 @@
       </w:r>
     </w:p>
     <w:p>
-      <w:r>
-        <w:t xml:space="preserve">  &gt; You're in, {firstName}</w:t>
-      </w:r>
-    </w:p>
-    <w:p>
-      <w:r>
-        <w:t xml:space="preserve">  &gt; {orgName} is live on Recruiting ATS. Take a look around — we'll send you a short getting-started note in a bit.</w:t>
-      </w:r>
-    </w:p>
-    <w:p>
-      <w:r>
-        <w:t xml:space="preserve">  &gt; Your free trial runs until {date}. We won't charge until it ends — cancel any time before then and you won't be billed.</w:t>
-      </w:r>
-    </w:p>
-    <w:p>
-      <w:r>
-        <w:t xml:space="preserve">  &gt; Reply to this email if anything's confusing or missing — we read every message.</w:t>
-      </w:r>
-    </w:p>
-    <w:p>
-      <w:r>
-        <w:t xml:space="preserve">  &gt; [Button: Open Dashboard]</w:t>
+      <w:pPr>
+        <w:spacing w:after="80"/>
+        <w:ind w:left="480"/>
+      </w:pPr>
+      <w:r>
+        <w:rPr>
+          <w:i/>
+          <w:color w:val="555555"/>
+        </w:rPr>
+        <w:t>You're in, {firstName}</w:t>
+      </w:r>
+    </w:p>
+    <w:p>
+      <w:pPr>
+        <w:spacing w:after="80"/>
+        <w:ind w:left="480"/>
+      </w:pPr>
+      <w:r>
+        <w:rPr>
+          <w:i/>
+          <w:color w:val="555555"/>
+        </w:rPr>
+        <w:t>{orgName} is live on Recruiting ATS. Take a look around — we'll send you a short getting-started note in a bit.</w:t>
+      </w:r>
+    </w:p>
+    <w:p>
+      <w:pPr>
+        <w:spacing w:after="80"/>
+        <w:ind w:left="480"/>
+      </w:pPr>
+      <w:r>
+        <w:rPr>
+          <w:i/>
+          <w:color w:val="555555"/>
+        </w:rPr>
+        <w:t>Your free trial runs until {date}. We won't charge until it ends — cancel any time before then and you won't be billed.</w:t>
+      </w:r>
+    </w:p>
+    <w:p>
+      <w:pPr>
+        <w:spacing w:after="80"/>
+        <w:ind w:left="480"/>
+      </w:pPr>
+      <w:r>
+        <w:rPr>
+          <w:i/>
+          <w:color w:val="555555"/>
+        </w:rPr>
+        <w:t>Reply to this email if anything's confusing or missing — we read every message.</w:t>
+      </w:r>
+    </w:p>
+    <w:p>
+      <w:pPr>
+        <w:spacing w:after="80"/>
+        <w:ind w:left="480"/>
+      </w:pPr>
+      <w:r>
+        <w:rPr>
+          <w:i/>
+          <w:color w:val="555555"/>
+        </w:rPr>
+        <w:t>[Button: Open Dashboard]</w:t>
       </w:r>
     </w:p>
     <w:p/>
@@ -227,38 +309,94 @@
       </w:r>
     </w:p>
     <w:p>
-      <w:r>
-        <w:t xml:space="preserve">  &gt; {firstName}, here's the fastest path to your first placement</w:t>
-      </w:r>
-    </w:p>
-    <w:p>
-      <w:r>
-        <w:t xml:space="preserve">  &gt; Now that you've had a chance to look around {orgName}, three things worth doing this week:</w:t>
-      </w:r>
-    </w:p>
-    <w:p>
-      <w:r>
-        <w:t xml:space="preserve">  &gt; 1. Add your first client — set fee structure + payment terms once, reuse for every search.</w:t>
-      </w:r>
-    </w:p>
-    <w:p>
-      <w:r>
-        <w:t xml:space="preserve">  &gt; 2. Post your first job — upload the JD and the parser fills the form for you.</w:t>
-      </w:r>
-    </w:p>
-    <w:p>
-      <w:r>
-        <w:t xml:space="preserve">  &gt; 3. Invite a teammate — collaborate on the same pipeline + share notes.</w:t>
-      </w:r>
-    </w:p>
-    <w:p>
-      <w:r>
-        <w:t xml:space="preserve">  &gt; Reply to this email if anything's confusing or missing — we read every message and ship fast.</w:t>
-      </w:r>
-    </w:p>
-    <w:p>
-      <w:r>
-        <w:t xml:space="preserve">  &gt; [Button: Open Dashboard]</w:t>
+      <w:pPr>
+        <w:spacing w:after="80"/>
+        <w:ind w:left="480"/>
+      </w:pPr>
+      <w:r>
+        <w:rPr>
+          <w:i/>
+          <w:color w:val="555555"/>
+        </w:rPr>
+        <w:t>{firstName}, here's the fastest path to your first placement</w:t>
+      </w:r>
+    </w:p>
+    <w:p>
+      <w:pPr>
+        <w:spacing w:after="80"/>
+        <w:ind w:left="480"/>
+      </w:pPr>
+      <w:r>
+        <w:rPr>
+          <w:i/>
+          <w:color w:val="555555"/>
+        </w:rPr>
+        <w:t>Now that you've had a chance to look around {orgName}, three things worth doing this week:</w:t>
+      </w:r>
+    </w:p>
+    <w:p>
+      <w:pPr>
+        <w:spacing w:after="80"/>
+        <w:ind w:left="480"/>
+      </w:pPr>
+      <w:r>
+        <w:rPr>
+          <w:i/>
+          <w:color w:val="555555"/>
+        </w:rPr>
+        <w:t>1. Add your first client — set fee structure + payment terms once, reuse for every search.</w:t>
+      </w:r>
+    </w:p>
+    <w:p>
+      <w:pPr>
+        <w:spacing w:after="80"/>
+        <w:ind w:left="480"/>
+      </w:pPr>
+      <w:r>
+        <w:rPr>
+          <w:i/>
+          <w:color w:val="555555"/>
+        </w:rPr>
+        <w:t>2. Post your first job — upload the JD and the parser fills the form for you.</w:t>
+      </w:r>
+    </w:p>
+    <w:p>
+      <w:pPr>
+        <w:spacing w:after="80"/>
+        <w:ind w:left="480"/>
+      </w:pPr>
+      <w:r>
+        <w:rPr>
+          <w:i/>
+          <w:color w:val="555555"/>
+        </w:rPr>
+        <w:t>3. Invite a teammate — collaborate on the same pipeline + share notes.</w:t>
+      </w:r>
+    </w:p>
+    <w:p>
+      <w:pPr>
+        <w:spacing w:after="80"/>
+        <w:ind w:left="480"/>
+      </w:pPr>
+      <w:r>
+        <w:rPr>
+          <w:i/>
+          <w:color w:val="555555"/>
+        </w:rPr>
+        <w:t>Reply to this email if anything's confusing or missing — we read every message and ship fast.</w:t>
+      </w:r>
+    </w:p>
+    <w:p>
+      <w:pPr>
+        <w:spacing w:after="80"/>
+        <w:ind w:left="480"/>
+      </w:pPr>
+      <w:r>
+        <w:rPr>
+          <w:i/>
+          <w:color w:val="555555"/>
+        </w:rPr>
+        <w:t>[Button: Open Dashboard]</w:t>
       </w:r>
     </w:p>
     <w:p/>
@@ -295,23 +433,55 @@
       </w:r>
     </w:p>
     <w:p>
-      <w:r>
-        <w:t xml:space="preserve">  &gt; Hi {firstName},</w:t>
-      </w:r>
-    </w:p>
-    <w:p>
-      <w:r>
-        <w:t xml:space="preserve">  &gt; We received a request to reset your Recruiting ATS password. Click the button below to choose a new one. This link expires in 1 hour.</w:t>
-      </w:r>
-    </w:p>
-    <w:p>
-      <w:r>
-        <w:t xml:space="preserve">  &gt; If you didn't request this, ignore — your password stays unchanged.</w:t>
-      </w:r>
-    </w:p>
-    <w:p>
-      <w:r>
-        <w:t xml:space="preserve">  &gt; [Button: Reset Password]</w:t>
+      <w:pPr>
+        <w:spacing w:after="80"/>
+        <w:ind w:left="480"/>
+      </w:pPr>
+      <w:r>
+        <w:rPr>
+          <w:i/>
+          <w:color w:val="555555"/>
+        </w:rPr>
+        <w:t>Hi {firstName},</w:t>
+      </w:r>
+    </w:p>
+    <w:p>
+      <w:pPr>
+        <w:spacing w:after="80"/>
+        <w:ind w:left="480"/>
+      </w:pPr>
+      <w:r>
+        <w:rPr>
+          <w:i/>
+          <w:color w:val="555555"/>
+        </w:rPr>
+        <w:t>We received a request to reset your Recruiting ATS password. Click the button below to choose a new one. This link expires in 1 hour.</w:t>
+      </w:r>
+    </w:p>
+    <w:p>
+      <w:pPr>
+        <w:spacing w:after="80"/>
+        <w:ind w:left="480"/>
+      </w:pPr>
+      <w:r>
+        <w:rPr>
+          <w:i/>
+          <w:color w:val="555555"/>
+        </w:rPr>
+        <w:t>If you didn't request this, ignore — your password stays unchanged.</w:t>
+      </w:r>
+    </w:p>
+    <w:p>
+      <w:pPr>
+        <w:spacing w:after="80"/>
+        <w:ind w:left="480"/>
+      </w:pPr>
+      <w:r>
+        <w:rPr>
+          <w:i/>
+          <w:color w:val="555555"/>
+        </w:rPr>
+        <w:t>[Button: Reset Password]</w:t>
       </w:r>
     </w:p>
     <w:p/>
@@ -363,42 +533,81 @@
       </w:r>
     </w:p>
     <w:p>
-      <w:r>
-        <w:t xml:space="preserve">  &gt; You've been invited to join {orgName}</w:t>
-      </w:r>
-    </w:p>
-    <w:p>
-      <w:r>
-        <w:t xml:space="preserve">  &gt; Hi {firstName},</w:t>
-      </w:r>
-    </w:p>
-    <w:p>
-      <w:r>
-        <w:t xml:space="preserve">  &gt; </w:t>
-      </w:r>
+      <w:pPr>
+        <w:spacing w:after="80"/>
+        <w:ind w:left="480"/>
+      </w:pPr>
       <w:r>
         <w:rPr>
-          <w:b/>
+          <w:i/>
+          <w:color w:val="555555"/>
         </w:rPr>
-        <w:t>{inviterName}</w:t>
-      </w:r>
-      <w:r>
-        <w:t xml:space="preserve"> invited you to collaborate on Recruiting ATS.</w:t>
-      </w:r>
-    </w:p>
-    <w:p>
-      <w:r>
-        <w:t xml:space="preserve">  &gt; Recruiting ATS is where {orgName} runs their searches — accept to join the team there.</w:t>
-      </w:r>
-    </w:p>
-    <w:p>
-      <w:r>
-        <w:t xml:space="preserve">  &gt; This link expires in 7 days.</w:t>
-      </w:r>
-    </w:p>
-    <w:p>
-      <w:r>
-        <w:t xml:space="preserve">  &gt; [Button: Accept Invitation]</w:t>
+        <w:t>You've been invited to join {orgName}</w:t>
+      </w:r>
+    </w:p>
+    <w:p>
+      <w:pPr>
+        <w:spacing w:after="80"/>
+        <w:ind w:left="480"/>
+      </w:pPr>
+      <w:r>
+        <w:rPr>
+          <w:i/>
+          <w:color w:val="555555"/>
+        </w:rPr>
+        <w:t>Hi {firstName},</w:t>
+      </w:r>
+    </w:p>
+    <w:p>
+      <w:pPr>
+        <w:spacing w:after="80"/>
+        <w:ind w:left="480"/>
+      </w:pPr>
+      <w:r>
+        <w:rPr>
+          <w:i/>
+          <w:color w:val="555555"/>
+        </w:rPr>
+        <w:t>{inviterName} invited you to collaborate on Recruiting ATS.</w:t>
+      </w:r>
+    </w:p>
+    <w:p>
+      <w:pPr>
+        <w:spacing w:after="80"/>
+        <w:ind w:left="480"/>
+      </w:pPr>
+      <w:r>
+        <w:rPr>
+          <w:i/>
+          <w:color w:val="555555"/>
+        </w:rPr>
+        <w:t>Recruiting ATS is where {orgName} runs their searches — accept to join the team there.</w:t>
+      </w:r>
+    </w:p>
+    <w:p>
+      <w:pPr>
+        <w:spacing w:after="80"/>
+        <w:ind w:left="480"/>
+      </w:pPr>
+      <w:r>
+        <w:rPr>
+          <w:i/>
+          <w:color w:val="555555"/>
+        </w:rPr>
+        <w:t>This link expires in 7 days.</w:t>
+      </w:r>
+    </w:p>
+    <w:p>
+      <w:pPr>
+        <w:spacing w:after="80"/>
+        <w:ind w:left="480"/>
+      </w:pPr>
+      <w:r>
+        <w:rPr>
+          <w:i/>
+          <w:color w:val="555555"/>
+        </w:rPr>
+        <w:t>[Button: Accept Invitation]</w:t>
       </w:r>
     </w:p>
     <w:p/>
@@ -435,37 +644,68 @@
       </w:r>
     </w:p>
     <w:p>
-      <w:r>
-        <w:t xml:space="preserve">  &gt; Welcome to {orgName} on Recruiting ATS</w:t>
-      </w:r>
-    </w:p>
-    <w:p>
-      <w:r>
-        <w:t xml:space="preserve">  &gt; Hi {firstName},</w:t>
-      </w:r>
-    </w:p>
-    <w:p>
-      <w:r>
-        <w:t xml:space="preserve">  &gt; Your Recruiting ATS account at </w:t>
-      </w:r>
+      <w:pPr>
+        <w:spacing w:after="80"/>
+        <w:ind w:left="480"/>
+      </w:pPr>
       <w:r>
         <w:rPr>
-          <w:b/>
+          <w:i/>
+          <w:color w:val="555555"/>
         </w:rPr>
-        <w:t>{orgName}</w:t>
-      </w:r>
-      <w:r>
-        <w:t xml:space="preserve"> is now active and your email has been confirmed. You can sign in any time at the link below.</w:t>
-      </w:r>
-    </w:p>
-    <w:p>
-      <w:r>
-        <w:t xml:space="preserve">  &gt; From the dashboard you'll see the searches you're assigned to, candidates in flight, and your team's recent activity.</w:t>
-      </w:r>
-    </w:p>
-    <w:p>
-      <w:r>
-        <w:t xml:space="preserve">  &gt; [Button: Open Dashboard]</w:t>
+        <w:t>Welcome to {orgName} on Recruiting ATS</w:t>
+      </w:r>
+    </w:p>
+    <w:p>
+      <w:pPr>
+        <w:spacing w:after="80"/>
+        <w:ind w:left="480"/>
+      </w:pPr>
+      <w:r>
+        <w:rPr>
+          <w:i/>
+          <w:color w:val="555555"/>
+        </w:rPr>
+        <w:t>Hi {firstName},</w:t>
+      </w:r>
+    </w:p>
+    <w:p>
+      <w:pPr>
+        <w:spacing w:after="80"/>
+        <w:ind w:left="480"/>
+      </w:pPr>
+      <w:r>
+        <w:rPr>
+          <w:i/>
+          <w:color w:val="555555"/>
+        </w:rPr>
+        <w:t>Your Recruiting ATS account at {orgName} is now active and your email has been confirmed. You can sign in any time at the link below.</w:t>
+      </w:r>
+    </w:p>
+    <w:p>
+      <w:pPr>
+        <w:spacing w:after="80"/>
+        <w:ind w:left="480"/>
+      </w:pPr>
+      <w:r>
+        <w:rPr>
+          <w:i/>
+          <w:color w:val="555555"/>
+        </w:rPr>
+        <w:t>From the dashboard you'll see the searches you're assigned to, candidates in flight, and your team's recent activity.</w:t>
+      </w:r>
+    </w:p>
+    <w:p>
+      <w:pPr>
+        <w:spacing w:after="80"/>
+        <w:ind w:left="480"/>
+      </w:pPr>
+      <w:r>
+        <w:rPr>
+          <w:i/>
+          <w:color w:val="555555"/>
+        </w:rPr>
+        <w:t>[Button: Open Dashboard]</w:t>
       </w:r>
     </w:p>
     <w:p/>
@@ -502,51 +742,81 @@
       </w:r>
     </w:p>
     <w:p>
-      <w:r>
-        <w:t xml:space="preserve">  &gt; 🎉 {newMemberName} accepted your invite</w:t>
-      </w:r>
-    </w:p>
-    <w:p>
-      <w:r>
-        <w:t xml:space="preserve">  &gt; Hi {firstName},</w:t>
-      </w:r>
-    </w:p>
-    <w:p>
-      <w:r>
-        <w:t xml:space="preserve">  &gt; </w:t>
-      </w:r>
+      <w:pPr>
+        <w:spacing w:after="80"/>
+        <w:ind w:left="480"/>
+      </w:pPr>
       <w:r>
         <w:rPr>
-          <w:b/>
+          <w:i/>
+          <w:color w:val="555555"/>
         </w:rPr>
-        <w:t>{newMemberName}</w:t>
-      </w:r>
-      <w:r>
-        <w:t xml:space="preserve"> ({email}) just joined </w:t>
-      </w:r>
+        <w:t>🎉 {newMemberName} accepted your invite</w:t>
+      </w:r>
+    </w:p>
+    <w:p>
+      <w:pPr>
+        <w:spacing w:after="80"/>
+        <w:ind w:left="480"/>
+      </w:pPr>
       <w:r>
         <w:rPr>
-          <w:b/>
+          <w:i/>
+          <w:color w:val="555555"/>
         </w:rPr>
-        <w:t>{orgName}</w:t>
-      </w:r>
-      <w:r>
-        <w:t xml:space="preserve"> on Recruiting ATS.</w:t>
-      </w:r>
-    </w:p>
-    <w:p>
-      <w:r>
-        <w:t xml:space="preserve">  &gt; They can now see the searches they're assigned to and collaborate with you on candidates and clients.</w:t>
-      </w:r>
-    </w:p>
-    <w:p>
-      <w:r>
-        <w:t xml:space="preserve">  &gt; Want to keep growing the team? Send another invite from My Team.</w:t>
-      </w:r>
-    </w:p>
-    <w:p>
-      <w:r>
-        <w:t xml:space="preserve">  &gt; [Button: Open My Team]</w:t>
+        <w:t>Hi {firstName},</w:t>
+      </w:r>
+    </w:p>
+    <w:p>
+      <w:pPr>
+        <w:spacing w:after="80"/>
+        <w:ind w:left="480"/>
+      </w:pPr>
+      <w:r>
+        <w:rPr>
+          <w:i/>
+          <w:color w:val="555555"/>
+        </w:rPr>
+        <w:t>{newMemberName} ({email}) just joined {orgName} on Recruiting ATS.</w:t>
+      </w:r>
+    </w:p>
+    <w:p>
+      <w:pPr>
+        <w:spacing w:after="80"/>
+        <w:ind w:left="480"/>
+      </w:pPr>
+      <w:r>
+        <w:rPr>
+          <w:i/>
+          <w:color w:val="555555"/>
+        </w:rPr>
+        <w:t>They can now see the searches they're assigned to and collaborate with you on candidates and clients.</w:t>
+      </w:r>
+    </w:p>
+    <w:p>
+      <w:pPr>
+        <w:spacing w:after="80"/>
+        <w:ind w:left="480"/>
+      </w:pPr>
+      <w:r>
+        <w:rPr>
+          <w:i/>
+          <w:color w:val="555555"/>
+        </w:rPr>
+        <w:t>Want to keep growing the team? Send another invite from My Team.</w:t>
+      </w:r>
+    </w:p>
+    <w:p>
+      <w:pPr>
+        <w:spacing w:after="80"/>
+        <w:ind w:left="480"/>
+      </w:pPr>
+      <w:r>
+        <w:rPr>
+          <w:i/>
+          <w:color w:val="555555"/>
+        </w:rPr>
+        <w:t>[Button: Open My Team]</w:t>
       </w:r>
     </w:p>
     <w:p/>
@@ -583,36 +853,964 @@
       </w:r>
     </w:p>
     <w:p>
-      <w:r>
-        <w:t xml:space="preserve">  &gt; You're now collaborating on {jobTitle}</w:t>
-      </w:r>
-    </w:p>
-    <w:p>
-      <w:r>
-        <w:t xml:space="preserve">  &gt; Hi {firstName},</w:t>
-      </w:r>
-    </w:p>
-    <w:p>
-      <w:r>
-        <w:t xml:space="preserve">  &gt; {assignerName} just added you to the search for </w:t>
-      </w:r>
+      <w:pPr>
+        <w:spacing w:after="80"/>
+        <w:ind w:left="480"/>
+      </w:pPr>
       <w:r>
         <w:rPr>
-          <w:b/>
+          <w:i/>
+          <w:color w:val="555555"/>
+        </w:rPr>
+        <w:t>You're now collaborating on {jobTitle}</w:t>
+      </w:r>
+    </w:p>
+    <w:p>
+      <w:pPr>
+        <w:spacing w:after="80"/>
+        <w:ind w:left="480"/>
+      </w:pPr>
+      <w:r>
+        <w:rPr>
+          <w:i/>
+          <w:color w:val="555555"/>
+        </w:rPr>
+        <w:t>Hi {firstName},</w:t>
+      </w:r>
+    </w:p>
+    <w:p>
+      <w:pPr>
+        <w:spacing w:after="80"/>
+        <w:ind w:left="480"/>
+      </w:pPr>
+      <w:r>
+        <w:rPr>
+          <w:i/>
+          <w:color w:val="555555"/>
+        </w:rPr>
+        <w:t>{assignerName} just added you to the search for {jobTitle} ({role} · {clientName}). Open the job to see the pipeline and start sourcing.</w:t>
+      </w:r>
+    </w:p>
+    <w:p>
+      <w:pPr>
+        <w:spacing w:after="80"/>
+        <w:ind w:left="480"/>
+      </w:pPr>
+      <w:r>
+        <w:rPr>
+          <w:i/>
+          <w:color w:val="555555"/>
+        </w:rPr>
+        <w:t>[Button: Open Job]</w:t>
+      </w:r>
+    </w:p>
+    <w:p/>
+    <w:p>
+      <w:r>
+        <w:t>────────────────────────────────────────</w:t>
+      </w:r>
+    </w:p>
+    <w:p/>
+    <w:p>
+      <w:pPr>
+        <w:pStyle w:val="Heading2"/>
+      </w:pPr>
+      <w:r>
+        <w:t>🏢 Cliente (hiring company) — invitations</w:t>
+      </w:r>
+    </w:p>
+    <w:p/>
+    <w:p>
+      <w:pPr>
+        <w:pStyle w:val="Heading3"/>
+      </w:pPr>
+      <w:r>
+        <w:t>9. Client set-password (primer login)</w:t>
+      </w:r>
+    </w:p>
+    <w:p>
+      <w:pPr>
+        <w:pStyle w:val="ListBullet"/>
+      </w:pPr>
+      <w:r>
+        <w:t>Cuándo: un firm comparte candidatos con un cliente nuevo.</w:t>
+      </w:r>
+    </w:p>
+    <w:p>
+      <w:pPr>
+        <w:pStyle w:val="ListBullet"/>
+      </w:pPr>
+      <w:r>
+        <w:t>Subject: Set up your Recruiting ATS client portal account</w:t>
+      </w:r>
+    </w:p>
+    <w:p>
+      <w:pPr>
+        <w:pStyle w:val="ListBullet"/>
+      </w:pPr>
+      <w:r>
+        <w:t>Body:</w:t>
+      </w:r>
+    </w:p>
+    <w:p>
+      <w:pPr>
+        <w:spacing w:after="80"/>
+        <w:ind w:left="480"/>
+      </w:pPr>
+      <w:r>
+        <w:rPr>
+          <w:i/>
+          <w:color w:val="555555"/>
+        </w:rPr>
+        <w:t>Set up your client portal account</w:t>
+      </w:r>
+    </w:p>
+    <w:p>
+      <w:pPr>
+        <w:spacing w:after="80"/>
+        <w:ind w:left="480"/>
+      </w:pPr>
+      <w:r>
+        <w:rPr>
+          <w:i/>
+          <w:color w:val="555555"/>
+        </w:rPr>
+        <w:t>Hi {clientName},</w:t>
+      </w:r>
+    </w:p>
+    <w:p>
+      <w:pPr>
+        <w:spacing w:after="80"/>
+        <w:ind w:left="480"/>
+      </w:pPr>
+      <w:r>
+        <w:rPr>
+          <w:i/>
+          <w:color w:val="555555"/>
+        </w:rPr>
+        <w:t>{firmName} has shared candidates with you on Recruiting ATS. To review them, you'll need to set a password for your account.</w:t>
+      </w:r>
+    </w:p>
+    <w:p>
+      <w:pPr>
+        <w:spacing w:after="80"/>
+        <w:ind w:left="480"/>
+      </w:pPr>
+      <w:r>
+        <w:rPr>
+          <w:i/>
+          <w:color w:val="555555"/>
+        </w:rPr>
+        <w:t>Click below to set your password and access your portal.</w:t>
+      </w:r>
+    </w:p>
+    <w:p>
+      <w:pPr>
+        <w:spacing w:after="80"/>
+        <w:ind w:left="480"/>
+      </w:pPr>
+      <w:r>
+        <w:rPr>
+          <w:i/>
+          <w:color w:val="555555"/>
+        </w:rPr>
+        <w:t>[Button: Set Password &amp; Sign In]</w:t>
+      </w:r>
+    </w:p>
+    <w:p/>
+    <w:p>
+      <w:pPr>
+        <w:pStyle w:val="Heading3"/>
+      </w:pPr>
+      <w:r>
+        <w:t>10. Client team invite (admin del cliente invita teammates)</w:t>
+      </w:r>
+    </w:p>
+    <w:p>
+      <w:pPr>
+        <w:pStyle w:val="ListBullet"/>
+      </w:pPr>
+      <w:r>
+        <w:t>Cuándo: admin del client portal invita a otro miembro de su equipo.</w:t>
+      </w:r>
+    </w:p>
+    <w:p>
+      <w:pPr>
+        <w:pStyle w:val="ListBullet"/>
+      </w:pPr>
+      <w:r>
+        <w:t>Subject: {inviterName} invited you to {companyName}'s hiring team</w:t>
+      </w:r>
+    </w:p>
+    <w:p>
+      <w:pPr>
+        <w:pStyle w:val="ListBullet"/>
+      </w:pPr>
+      <w:r>
+        <w:t>Body:</w:t>
+      </w:r>
+    </w:p>
+    <w:p>
+      <w:pPr>
+        <w:spacing w:after="80"/>
+        <w:ind w:left="480"/>
+      </w:pPr>
+      <w:r>
+        <w:rPr>
+          <w:i/>
+          <w:color w:val="555555"/>
+        </w:rPr>
+        <w:t>You've been added to {companyName}'s hiring team</w:t>
+      </w:r>
+    </w:p>
+    <w:p>
+      <w:pPr>
+        <w:spacing w:after="80"/>
+        <w:ind w:left="480"/>
+      </w:pPr>
+      <w:r>
+        <w:rPr>
+          <w:i/>
+          <w:color w:val="555555"/>
+        </w:rPr>
+        <w:t>Hi {memberName},</w:t>
+      </w:r>
+    </w:p>
+    <w:p>
+      <w:pPr>
+        <w:spacing w:after="80"/>
+        <w:ind w:left="480"/>
+      </w:pPr>
+      <w:r>
+        <w:rPr>
+          <w:i/>
+          <w:color w:val="555555"/>
+        </w:rPr>
+        <w:t>{inviterName} has invited you to join {companyName}'s hiring team on Recruiting ATS.</w:t>
+      </w:r>
+    </w:p>
+    <w:p>
+      <w:pPr>
+        <w:spacing w:after="80"/>
+        <w:ind w:left="480"/>
+      </w:pPr>
+      <w:r>
+        <w:rPr>
+          <w:i/>
+          <w:color w:val="555555"/>
+        </w:rPr>
+        <w:t>Role: {title}</w:t>
+      </w:r>
+    </w:p>
+    <w:p>
+      <w:pPr>
+        <w:spacing w:after="80"/>
+        <w:ind w:left="480"/>
+      </w:pPr>
+      <w:r>
+        <w:rPr>
+          <w:i/>
+          <w:color w:val="555555"/>
+        </w:rPr>
+        <w:t>With your account, you can:</w:t>
+      </w:r>
+    </w:p>
+    <w:p>
+      <w:pPr>
+        <w:spacing w:after="80"/>
+        <w:ind w:left="480"/>
+      </w:pPr>
+      <w:r>
+        <w:rPr>
+          <w:i/>
+          <w:color w:val="555555"/>
+        </w:rPr>
+        <w:t>- View and post job openings</w:t>
+      </w:r>
+    </w:p>
+    <w:p>
+      <w:pPr>
+        <w:spacing w:after="80"/>
+        <w:ind w:left="480"/>
+      </w:pPr>
+      <w:r>
+        <w:rPr>
+          <w:i/>
+          <w:color w:val="555555"/>
+        </w:rPr>
+        <w:t>- Track recruiting firm activity</w:t>
+      </w:r>
+    </w:p>
+    <w:p>
+      <w:pPr>
+        <w:spacing w:after="80"/>
+        <w:ind w:left="480"/>
+      </w:pPr>
+      <w:r>
+        <w:rPr>
+          <w:i/>
+          <w:color w:val="555555"/>
+        </w:rPr>
+        <w:t>- Review shared candidates</w:t>
+      </w:r>
+    </w:p>
+    <w:p>
+      <w:pPr>
+        <w:spacing w:after="80"/>
+        <w:ind w:left="480"/>
+      </w:pPr>
+      <w:r>
+        <w:rPr>
+          <w:i/>
+          <w:color w:val="555555"/>
+        </w:rPr>
+        <w:t>- Manage your team's hiring pipeline</w:t>
+      </w:r>
+    </w:p>
+    <w:p>
+      <w:pPr>
+        <w:spacing w:after="80"/>
+        <w:ind w:left="480"/>
+      </w:pPr>
+      <w:r>
+        <w:rPr>
+          <w:i/>
+          <w:color w:val="555555"/>
+        </w:rPr>
+        <w:t>Click below to set your password and get started.</w:t>
+      </w:r>
+    </w:p>
+    <w:p>
+      <w:pPr>
+        <w:spacing w:after="80"/>
+        <w:ind w:left="480"/>
+      </w:pPr>
+      <w:r>
+        <w:rPr>
+          <w:i/>
+          <w:color w:val="555555"/>
+        </w:rPr>
+        <w:t>[Button: Set Password &amp; Get Started]</w:t>
+      </w:r>
+    </w:p>
+    <w:p/>
+    <w:p>
+      <w:pPr>
+        <w:pStyle w:val="Heading3"/>
+      </w:pPr>
+      <w:r>
+        <w:t>11. Client portal welcome (después de set-password)</w:t>
+      </w:r>
+    </w:p>
+    <w:p>
+      <w:pPr>
+        <w:pStyle w:val="ListBullet"/>
+      </w:pPr>
+      <w:r>
+        <w:t>Cuándo: cliente termina set-password.</w:t>
+      </w:r>
+    </w:p>
+    <w:p>
+      <w:pPr>
+        <w:pStyle w:val="ListBullet"/>
+      </w:pPr>
+      <w:r>
+        <w:t>Subject: Your Recruiting ATS client portal account is ready</w:t>
+      </w:r>
+    </w:p>
+    <w:p>
+      <w:pPr>
+        <w:pStyle w:val="ListBullet"/>
+      </w:pPr>
+      <w:r>
+        <w:t>Body:</w:t>
+      </w:r>
+    </w:p>
+    <w:p>
+      <w:pPr>
+        <w:spacing w:after="80"/>
+        <w:ind w:left="480"/>
+      </w:pPr>
+      <w:r>
+        <w:rPr>
+          <w:i/>
+          <w:color w:val="555555"/>
+        </w:rPr>
+        <w:t>Welcome to Recruiting ATS</w:t>
+      </w:r>
+    </w:p>
+    <w:p>
+      <w:pPr>
+        <w:spacing w:after="80"/>
+        <w:ind w:left="480"/>
+      </w:pPr>
+      <w:r>
+        <w:rPr>
+          <w:i/>
+          <w:color w:val="555555"/>
+        </w:rPr>
+        <w:t>Hi {firstName},</w:t>
+      </w:r>
+    </w:p>
+    <w:p>
+      <w:pPr>
+        <w:spacing w:after="80"/>
+        <w:ind w:left="480"/>
+      </w:pPr>
+      <w:r>
+        <w:rPr>
+          <w:i/>
+          <w:color w:val="555555"/>
+        </w:rPr>
+        <w:t>Your client portal account for {clientName} is now active. Your email has been confirmed and you can sign in any time at the link below.</w:t>
+      </w:r>
+    </w:p>
+    <w:p>
+      <w:pPr>
+        <w:spacing w:after="80"/>
+        <w:ind w:left="480"/>
+      </w:pPr>
+      <w:r>
+        <w:rPr>
+          <w:i/>
+          <w:color w:val="555555"/>
+        </w:rPr>
+        <w:t>Use the portal to review candidates shared by your recruiter, leave feedback, and track the searches you're hiring on.</w:t>
+      </w:r>
+    </w:p>
+    <w:p>
+      <w:pPr>
+        <w:spacing w:after="80"/>
+        <w:ind w:left="480"/>
+      </w:pPr>
+      <w:r>
+        <w:rPr>
+          <w:i/>
+          <w:color w:val="555555"/>
+        </w:rPr>
+        <w:t>[Button: Open Portal]</w:t>
+      </w:r>
+    </w:p>
+    <w:p/>
+    <w:p>
+      <w:pPr>
+        <w:pStyle w:val="Heading3"/>
+      </w:pPr>
+      <w:r>
+        <w:t>12. Client job access granted (sumar miembro a job específico)</w:t>
+      </w:r>
+    </w:p>
+    <w:p>
+      <w:pPr>
+        <w:pStyle w:val="ListBullet"/>
+      </w:pPr>
+      <w:r>
+        <w:t>Cuándo: un admin del client portal le da acceso a un job a otro teammate que ya tiene cuenta.</w:t>
+      </w:r>
+    </w:p>
+    <w:p>
+      <w:pPr>
+        <w:pStyle w:val="ListBullet"/>
+      </w:pPr>
+      <w:r>
+        <w:t>Subject: {inviterName} added you to {jobTitle}</w:t>
+      </w:r>
+    </w:p>
+    <w:p>
+      <w:pPr>
+        <w:pStyle w:val="ListBullet"/>
+      </w:pPr>
+      <w:r>
+        <w:t>Body:</w:t>
+      </w:r>
+    </w:p>
+    <w:p>
+      <w:pPr>
+        <w:spacing w:after="80"/>
+        <w:ind w:left="480"/>
+      </w:pPr>
+      <w:r>
+        <w:rPr>
+          <w:i/>
+          <w:color w:val="555555"/>
+        </w:rPr>
+        <w:t>Hi {memberName},</w:t>
+      </w:r>
+    </w:p>
+    <w:p>
+      <w:pPr>
+        <w:spacing w:after="80"/>
+        <w:ind w:left="480"/>
+      </w:pPr>
+      <w:r>
+        <w:rPr>
+          <w:i/>
+          <w:color w:val="555555"/>
+        </w:rPr>
+        <w:t>{inviterName} just gave you access to {jobTitle} on {companyName}'s portal.</w:t>
+      </w:r>
+    </w:p>
+    <w:p>
+      <w:pPr>
+        <w:spacing w:after="80"/>
+        <w:ind w:left="480"/>
+      </w:pPr>
+      <w:r>
+        <w:rPr>
+          <w:i/>
+          <w:color w:val="555555"/>
+        </w:rPr>
+        <w:t>You can now review shared candidates, post notes for the team, and follow the pipeline.</w:t>
+      </w:r>
+    </w:p>
+    <w:p>
+      <w:pPr>
+        <w:spacing w:after="80"/>
+        <w:ind w:left="480"/>
+      </w:pPr>
+      <w:r>
+        <w:rPr>
+          <w:i/>
+          <w:color w:val="555555"/>
+        </w:rPr>
+        <w:t>[Button: Open Search]</w:t>
+      </w:r>
+    </w:p>
+    <w:p/>
+    <w:p>
+      <w:r>
+        <w:t>────────────────────────────────────────</w:t>
+      </w:r>
+    </w:p>
+    <w:p/>
+    <w:p>
+      <w:pPr>
+        <w:pStyle w:val="Heading2"/>
+      </w:pPr>
+      <w:r>
+        <w:t>📨 Engagement (firm ↔ client)</w:t>
+      </w:r>
+    </w:p>
+    <w:p/>
+    <w:p>
+      <w:pPr>
+        <w:pStyle w:val="Heading3"/>
+      </w:pPr>
+      <w:r>
+        <w:t>13. Engagement accepted (al cliente)</w:t>
+      </w:r>
+    </w:p>
+    <w:p>
+      <w:pPr>
+        <w:pStyle w:val="ListBullet"/>
+      </w:pPr>
+      <w:r>
+        <w:t>Cuándo: el firm acepta una invitación a colaborar en una búsqueda.</w:t>
+      </w:r>
+    </w:p>
+    <w:p>
+      <w:pPr>
+        <w:pStyle w:val="ListBullet"/>
+      </w:pPr>
+      <w:r>
+        <w:t>Subject: {firmName} accepted {jobTitle}</w:t>
+      </w:r>
+    </w:p>
+    <w:p>
+      <w:pPr>
+        <w:pStyle w:val="ListBullet"/>
+      </w:pPr>
+      <w:r>
+        <w:t>Body:</w:t>
+      </w:r>
+    </w:p>
+    <w:p>
+      <w:pPr>
+        <w:spacing w:after="80"/>
+        <w:ind w:left="480"/>
+      </w:pPr>
+      <w:r>
+        <w:rPr>
+          <w:i/>
+          <w:color w:val="555555"/>
+        </w:rPr>
+        <w:t>Hi {inviterName},</w:t>
+      </w:r>
+    </w:p>
+    <w:p>
+      <w:pPr>
+        <w:spacing w:after="80"/>
+        <w:ind w:left="480"/>
+      </w:pPr>
+      <w:r>
+        <w:rPr>
+          <w:i/>
+          <w:color w:val="555555"/>
+        </w:rPr>
+        <w:t>{firmName} just accepted your invitation to work on {jobTitle}. They can now start sharing candidates and chatting with your team.</w:t>
+      </w:r>
+    </w:p>
+    <w:p>
+      <w:pPr>
+        <w:spacing w:after="80"/>
+        <w:ind w:left="480"/>
+      </w:pPr>
+      <w:r>
+        <w:rPr>
+          <w:i/>
+          <w:color w:val="555555"/>
+        </w:rPr>
+        <w:t>[Button: Open Search]</w:t>
+      </w:r>
+    </w:p>
+    <w:p/>
+    <w:p>
+      <w:pPr>
+        <w:pStyle w:val="Heading3"/>
+      </w:pPr>
+      <w:r>
+        <w:t>14. Client portal share (al cliente cuando se comparte shortlist)</w:t>
+      </w:r>
+    </w:p>
+    <w:p>
+      <w:pPr>
+        <w:pStyle w:val="ListBullet"/>
+      </w:pPr>
+      <w:r>
+        <w:t>Cuándo: el firm comparte candidatos con un cliente. Solo si el cliente ya tiene portal account.</w:t>
+      </w:r>
+    </w:p>
+    <w:p>
+      <w:pPr>
+        <w:pStyle w:val="ListBullet"/>
+      </w:pPr>
+      <w:r>
+        <w:t>Subject: {firmName} shared candidates with you for {jobTitle}</w:t>
+      </w:r>
+    </w:p>
+    <w:p>
+      <w:pPr>
+        <w:pStyle w:val="ListBullet"/>
+      </w:pPr>
+      <w:r>
+        <w:t>Body:</w:t>
+      </w:r>
+    </w:p>
+    <w:p>
+      <w:pPr>
+        <w:spacing w:after="80"/>
+        <w:ind w:left="480"/>
+      </w:pPr>
+      <w:r>
+        <w:rPr>
+          <w:i/>
+          <w:color w:val="555555"/>
+        </w:rPr>
+        <w:t>Hi {clientName},</w:t>
+      </w:r>
+    </w:p>
+    <w:p>
+      <w:pPr>
+        <w:spacing w:after="80"/>
+        <w:ind w:left="480"/>
+      </w:pPr>
+      <w:r>
+        <w:rPr>
+          <w:i/>
+          <w:color w:val="555555"/>
+        </w:rPr>
+        <w:t>{recruiterName} from {firmName} has shared a candidate shortlist with you on Recruiting ATS.</w:t>
+      </w:r>
+    </w:p>
+    <w:p>
+      <w:pPr>
+        <w:spacing w:after="80"/>
+        <w:ind w:left="480"/>
+      </w:pPr>
+      <w:r>
+        <w:rPr>
+          <w:i/>
+          <w:color w:val="555555"/>
         </w:rPr>
         <w:t>{jobTitle}</w:t>
       </w:r>
-      <w:r>
-        <w:t xml:space="preserve"> ({role} · {clientName}). Open the job to see the pipeline and start sourcing.</w:t>
-      </w:r>
-    </w:p>
-    <w:p>
-      <w:r>
-        <w:t xml:space="preserve">  &gt; [Button: Open Job]</w:t>
+    </w:p>
+    <w:p>
+      <w:pPr>
+        <w:spacing w:after="80"/>
+        <w:ind w:left="480"/>
+      </w:pPr>
+      <w:r>
+        <w:rPr>
+          <w:i/>
+          <w:color w:val="555555"/>
+        </w:rPr>
+        <w:t>{N} candidates have been shared for your review.</w:t>
+      </w:r>
+    </w:p>
+    <w:p>
+      <w:pPr>
+        <w:spacing w:after="80"/>
+        <w:ind w:left="480"/>
+      </w:pPr>
+      <w:r>
+        <w:rPr>
+          <w:i/>
+          <w:color w:val="555555"/>
+        </w:rPr>
+        <w:t>Sign in to your client portal to review profiles, rate candidates, and leave feedback.</w:t>
+      </w:r>
+    </w:p>
+    <w:p>
+      <w:pPr>
+        <w:spacing w:after="80"/>
+        <w:ind w:left="480"/>
+      </w:pPr>
+      <w:r>
+        <w:rPr>
+          <w:i/>
+          <w:color w:val="555555"/>
+        </w:rPr>
+        <w:t>[Button: Review Candidates]</w:t>
       </w:r>
     </w:p>
     <w:p/>
     <w:p>
+      <w:pPr>
+        <w:pStyle w:val="Heading3"/>
+      </w:pPr>
+      <w:r>
+        <w:t>15. Candidate shared (al cliente, cada vez que se comparte un candidato individual)</w:t>
+      </w:r>
+    </w:p>
+    <w:p>
+      <w:pPr>
+        <w:pStyle w:val="ListBullet"/>
+      </w:pPr>
+      <w:r>
+        <w:t>Cuándo: el firm comparte un candidato puntual con el cliente.</w:t>
+      </w:r>
+    </w:p>
+    <w:p>
+      <w:pPr>
+        <w:pStyle w:val="ListBullet"/>
+      </w:pPr>
+      <w:r>
+        <w:t>Subject: New candidate shared: {candidateName} for {jobTitle}</w:t>
+      </w:r>
+    </w:p>
+    <w:p>
+      <w:pPr>
+        <w:pStyle w:val="ListBullet"/>
+      </w:pPr>
+      <w:r>
+        <w:t>Body:</w:t>
+      </w:r>
+    </w:p>
+    <w:p>
+      <w:pPr>
+        <w:spacing w:after="80"/>
+        <w:ind w:left="480"/>
+      </w:pPr>
+      <w:r>
+        <w:rPr>
+          <w:i/>
+          <w:color w:val="555555"/>
+        </w:rPr>
+        <w:t>New candidate for {jobTitle}</w:t>
+      </w:r>
+    </w:p>
+    <w:p>
+      <w:pPr>
+        <w:spacing w:after="80"/>
+        <w:ind w:left="480"/>
+      </w:pPr>
+      <w:r>
+        <w:rPr>
+          <w:i/>
+          <w:color w:val="555555"/>
+        </w:rPr>
+        <w:t>Hi {firstName},</w:t>
+      </w:r>
+    </w:p>
+    <w:p>
+      <w:pPr>
+        <w:spacing w:after="80"/>
+        <w:ind w:left="480"/>
+      </w:pPr>
+      <w:r>
+        <w:rPr>
+          <w:i/>
+          <w:color w:val="555555"/>
+        </w:rPr>
+        <w:t>{recruiterName} from {firmName} just shared a new candidate with {clientName}:</w:t>
+      </w:r>
+    </w:p>
+    <w:p>
+      <w:pPr>
+        <w:spacing w:after="80"/>
+        <w:ind w:left="480"/>
+      </w:pPr>
+      <w:r>
+        <w:rPr>
+          <w:i/>
+          <w:color w:val="555555"/>
+        </w:rPr>
+        <w:t>{candidateName} for {jobTitle}</w:t>
+      </w:r>
+    </w:p>
+    <w:p>
+      <w:pPr>
+        <w:spacing w:after="80"/>
+        <w:ind w:left="480"/>
+      </w:pPr>
+      <w:r>
+        <w:rPr>
+          <w:i/>
+          <w:color w:val="555555"/>
+        </w:rPr>
+        <w:t>{Optional note from recruiter}</w:t>
+      </w:r>
+    </w:p>
+    <w:p>
+      <w:pPr>
+        <w:spacing w:after="80"/>
+        <w:ind w:left="480"/>
+      </w:pPr>
+      <w:r>
+        <w:rPr>
+          <w:i/>
+          <w:color w:val="555555"/>
+        </w:rPr>
+        <w:t>Sign in to the client portal to view the full profile, download their resume, and leave feedback.</w:t>
+      </w:r>
+    </w:p>
+    <w:p>
+      <w:pPr>
+        <w:spacing w:after="80"/>
+        <w:ind w:left="480"/>
+      </w:pPr>
+      <w:r>
+        <w:rPr>
+          <w:i/>
+          <w:color w:val="555555"/>
+        </w:rPr>
+        <w:t>[Button: View Candidate]</w:t>
+      </w:r>
+    </w:p>
+    <w:p/>
+    <w:p>
+      <w:pPr>
+        <w:pStyle w:val="Heading3"/>
+      </w:pPr>
+      <w:r>
+        <w:t>16. Candidate feedback (al recruiter, cuando el cliente deja review)</w:t>
+      </w:r>
+    </w:p>
+    <w:p>
+      <w:pPr>
+        <w:pStyle w:val="ListBullet"/>
+      </w:pPr>
+      <w:r>
+        <w:t>Cuándo: cliente puntúa o comenta un candidato.</w:t>
+      </w:r>
+    </w:p>
+    <w:p>
+      <w:pPr>
+        <w:pStyle w:val="ListBullet"/>
+      </w:pPr>
+      <w:r>
+        <w:t>Subject: {reviewerName} left {N}★ feedback on {candidateName} (o "new feedback" / "viewed")</w:t>
+      </w:r>
+    </w:p>
+    <w:p>
+      <w:pPr>
+        <w:pStyle w:val="ListBullet"/>
+      </w:pPr>
+      <w:r>
+        <w:t>Body:</w:t>
+      </w:r>
+    </w:p>
+    <w:p>
+      <w:pPr>
+        <w:spacing w:after="80"/>
+        <w:ind w:left="480"/>
+      </w:pPr>
+      <w:r>
+        <w:rPr>
+          <w:i/>
+          <w:color w:val="555555"/>
+        </w:rPr>
+        <w:t>New feedback on {candidateName}</w:t>
+      </w:r>
+    </w:p>
+    <w:p>
+      <w:pPr>
+        <w:spacing w:after="80"/>
+        <w:ind w:left="480"/>
+      </w:pPr>
+      <w:r>
+        <w:rPr>
+          <w:i/>
+          <w:color w:val="555555"/>
+        </w:rPr>
+        <w:t>Hi {recruiterName},</w:t>
+      </w:r>
+    </w:p>
+    <w:p>
+      <w:pPr>
+        <w:spacing w:after="80"/>
+        <w:ind w:left="480"/>
+      </w:pPr>
+      <w:r>
+        <w:rPr>
+          <w:i/>
+          <w:color w:val="555555"/>
+        </w:rPr>
+        <w:t>{reviewerName} at {clientCompanyName} just left feedback on {candidateName} for {jobTitle}.</w:t>
+      </w:r>
+    </w:p>
+    <w:p>
+      <w:pPr>
+        <w:spacing w:after="80"/>
+        <w:ind w:left="480"/>
+      </w:pPr>
+      <w:r>
+        <w:rPr>
+          <w:i/>
+          <w:color w:val="555555"/>
+        </w:rPr>
+        <w:t>Rating: ★★★★☆ (4/5)</w:t>
+      </w:r>
+    </w:p>
+    <w:p>
+      <w:pPr>
+        <w:spacing w:after="80"/>
+        <w:ind w:left="480"/>
+      </w:pPr>
+      <w:r>
+        <w:rPr>
+          <w:i/>
+          <w:color w:val="555555"/>
+        </w:rPr>
+        <w:t>{Optional comment}</w:t>
+      </w:r>
+    </w:p>
+    <w:p>
+      <w:pPr>
+        <w:spacing w:after="80"/>
+        <w:ind w:left="480"/>
+      </w:pPr>
+      <w:r>
+        <w:rPr>
+          <w:i/>
+          <w:color w:val="555555"/>
+        </w:rPr>
+        <w:t>[Button: View Candidate]</w:t>
+      </w:r>
+    </w:p>
+    <w:p/>
+    <w:p>
       <w:r>
         <w:t>────────────────────────────────────────</w:t>
       </w:r>
@@ -623,7 +1821,7 @@
         <w:pStyle w:val="Heading2"/>
       </w:pPr>
       <w:r>
-        <w:t>🏢 Cliente (hiring company) — invitations</w:t>
+        <w:t>💬 Chat &amp; menciones</w:t>
       </w:r>
     </w:p>
     <w:p/>
@@ -632,7 +1830,7 @@
         <w:pStyle w:val="Heading3"/>
       </w:pPr>
       <w:r>
-        <w:t>9. Client set-password (primer login)</w:t>
+        <w:t>17. New message (chat)</w:t>
       </w:r>
     </w:p>
     <w:p>
@@ -640,7 +1838,7 @@
         <w:pStyle w:val="ListBullet"/>
       </w:pPr>
       <w:r>
-        <w:t>Cuándo: un firm comparte candidatos con un cliente nuevo.</w:t>
+        <w:t>Cuándo: alguien manda un mensaje en el chat (interno o cliente). Solo a los que NO están @-mencionados; los @-mencionados van por la mention email (#18).</w:t>
       </w:r>
     </w:p>
     <w:p>
@@ -648,7 +1846,7 @@
         <w:pStyle w:val="ListBullet"/>
       </w:pPr>
       <w:r>
-        <w:t>Subject: Set up your Recruiting ATS client portal account</w:t>
+        <w:t>Subject: New message on {candidateName} — {jobTitle}</w:t>
       </w:r>
     </w:p>
     <w:p>
@@ -660,37 +1858,68 @@
       </w:r>
     </w:p>
     <w:p>
-      <w:r>
-        <w:t xml:space="preserve">  &gt; Set up your client portal account</w:t>
-      </w:r>
-    </w:p>
-    <w:p>
-      <w:r>
-        <w:t xml:space="preserve">  &gt; Hi {clientName},</w:t>
-      </w:r>
-    </w:p>
-    <w:p>
-      <w:r>
-        <w:t xml:space="preserve">  &gt; </w:t>
-      </w:r>
+      <w:pPr>
+        <w:spacing w:after="80"/>
+        <w:ind w:left="480"/>
+      </w:pPr>
       <w:r>
         <w:rPr>
-          <w:b/>
+          <w:i/>
+          <w:color w:val="555555"/>
         </w:rPr>
-        <w:t>{firmName}</w:t>
-      </w:r>
-      <w:r>
-        <w:t xml:space="preserve"> has shared candidates with you on Recruiting ATS. To review them, you'll need to set a password for your account.</w:t>
-      </w:r>
-    </w:p>
-    <w:p>
-      <w:r>
-        <w:t xml:space="preserve">  &gt; Click below to set your password and access your portal.</w:t>
-      </w:r>
-    </w:p>
-    <w:p>
-      <w:r>
-        <w:t xml:space="preserve">  &gt; [Button: Set Password &amp; Sign In]</w:t>
+        <w:t>New message about {candidateName}</w:t>
+      </w:r>
+    </w:p>
+    <w:p>
+      <w:pPr>
+        <w:spacing w:after="80"/>
+        <w:ind w:left="480"/>
+      </w:pPr>
+      <w:r>
+        <w:rPr>
+          <w:i/>
+          <w:color w:val="555555"/>
+        </w:rPr>
+        <w:t>Hi {firstName},</w:t>
+      </w:r>
+    </w:p>
+    <w:p>
+      <w:pPr>
+        <w:spacing w:after="80"/>
+        <w:ind w:left="480"/>
+      </w:pPr>
+      <w:r>
+        <w:rPr>
+          <w:i/>
+          <w:color w:val="555555"/>
+        </w:rPr>
+        <w:t>{fromName} ({a recruiter | the client | your team}) left a new message in {your internal channel | the shared chat} for {candidateName} ({jobTitle}):</w:t>
+      </w:r>
+    </w:p>
+    <w:p>
+      <w:pPr>
+        <w:spacing w:after="80"/>
+        <w:ind w:left="480"/>
+      </w:pPr>
+      <w:r>
+        <w:rPr>
+          <w:i/>
+          <w:color w:val="555555"/>
+        </w:rPr>
+        <w:t>&gt; {preview del mensaje}</w:t>
+      </w:r>
+    </w:p>
+    <w:p>
+      <w:pPr>
+        <w:spacing w:after="80"/>
+        <w:ind w:left="480"/>
+      </w:pPr>
+      <w:r>
+        <w:rPr>
+          <w:i/>
+          <w:color w:val="555555"/>
+        </w:rPr>
+        <w:t>[Button: View Conversation]</w:t>
       </w:r>
     </w:p>
     <w:p/>
@@ -699,7 +1928,7 @@
         <w:pStyle w:val="Heading3"/>
       </w:pPr>
       <w:r>
-        <w:t>10. Client team invite (admin del cliente invita teammates)</w:t>
+        <w:t>18. Mention</w:t>
       </w:r>
     </w:p>
     <w:p>
@@ -707,7 +1936,7 @@
         <w:pStyle w:val="ListBullet"/>
       </w:pPr>
       <w:r>
-        <w:t>Cuándo: admin del client portal invita a otro miembro de su equipo.</w:t>
+        <w:t>Cuándo: alguien te @-menciona en un chat.</w:t>
       </w:r>
     </w:p>
     <w:p>
@@ -715,7 +1944,7 @@
         <w:pStyle w:val="ListBullet"/>
       </w:pPr>
       <w:r>
-        <w:t>Subject: {inviterName} invited you to {companyName}'s hiring team</w:t>
+        <w:t>Subject: {mentionedBy} mentioned you — {candidateName}</w:t>
       </w:r>
     </w:p>
     <w:p>
@@ -727,92 +1956,92 @@
       </w:r>
     </w:p>
     <w:p>
-      <w:r>
-        <w:t xml:space="preserve">  &gt; You've been added to {companyName}'s hiring team</w:t>
-      </w:r>
-    </w:p>
-    <w:p>
-      <w:r>
-        <w:t xml:space="preserve">  &gt; Hi {memberName},</w:t>
-      </w:r>
-    </w:p>
-    <w:p>
-      <w:r>
-        <w:t xml:space="preserve">  &gt; </w:t>
-      </w:r>
+      <w:pPr>
+        <w:spacing w:after="80"/>
+        <w:ind w:left="480"/>
+      </w:pPr>
       <w:r>
         <w:rPr>
-          <w:b/>
+          <w:i/>
+          <w:color w:val="555555"/>
         </w:rPr>
-        <w:t>{inviterName}</w:t>
-      </w:r>
-      <w:r>
-        <w:t xml:space="preserve"> has invited you to join </w:t>
-      </w:r>
+        <w:t>{mentionedBy} mentioned you</w:t>
+      </w:r>
+    </w:p>
+    <w:p>
+      <w:pPr>
+        <w:spacing w:after="80"/>
+        <w:ind w:left="480"/>
+      </w:pPr>
       <w:r>
         <w:rPr>
-          <w:b/>
+          <w:i/>
+          <w:color w:val="555555"/>
         </w:rPr>
-        <w:t>{companyName}</w:t>
-      </w:r>
-      <w:r>
-        <w:t>'s hiring team on Recruiting ATS.</w:t>
-      </w:r>
-    </w:p>
-    <w:p>
-      <w:r>
-        <w:t xml:space="preserve">  &gt; Role: </w:t>
-      </w:r>
+        <w:t>Hi {firstName},</w:t>
+      </w:r>
+    </w:p>
+    <w:p>
+      <w:pPr>
+        <w:spacing w:after="80"/>
+        <w:ind w:left="480"/>
+      </w:pPr>
       <w:r>
         <w:rPr>
-          <w:b/>
+          <w:i/>
+          <w:color w:val="555555"/>
         </w:rPr>
-        <w:t>{title}</w:t>
-      </w:r>
-      <w:r/>
-    </w:p>
-    <w:p>
-      <w:r>
-        <w:t xml:space="preserve">  &gt; With your account, you can:</w:t>
-      </w:r>
-    </w:p>
-    <w:p>
-      <w:r>
-        <w:t xml:space="preserve">  &gt; - View and post job openings</w:t>
-      </w:r>
-    </w:p>
-    <w:p>
-      <w:r>
-        <w:t xml:space="preserve">  &gt; - Track recruiting firm activity</w:t>
-      </w:r>
-    </w:p>
-    <w:p>
-      <w:r>
-        <w:t xml:space="preserve">  &gt; - Review shared candidates</w:t>
-      </w:r>
-    </w:p>
-    <w:p>
-      <w:r>
-        <w:t xml:space="preserve">  &gt; - Manage your team's hiring pipeline</w:t>
-      </w:r>
-    </w:p>
-    <w:p>
-      <w:r>
-        <w:t xml:space="preserve">  &gt; Click below to set your password and get started.</w:t>
-      </w:r>
-    </w:p>
-    <w:p>
-      <w:r>
-        <w:t xml:space="preserve">  &gt; [Button: Set Password &amp; Get Started]</w:t>
+        <w:t>{mentionedBy} mentioned you in a message about {candidateName} ({jobTitle}):</w:t>
+      </w:r>
+    </w:p>
+    <w:p>
+      <w:pPr>
+        <w:spacing w:after="80"/>
+        <w:ind w:left="480"/>
+      </w:pPr>
+      <w:r>
+        <w:rPr>
+          <w:i/>
+          <w:color w:val="555555"/>
+        </w:rPr>
+        <w:t>&gt; {preview del mensaje}</w:t>
+      </w:r>
+    </w:p>
+    <w:p>
+      <w:pPr>
+        <w:spacing w:after="80"/>
+        <w:ind w:left="480"/>
+      </w:pPr>
+      <w:r>
+        <w:rPr>
+          <w:i/>
+          <w:color w:val="555555"/>
+        </w:rPr>
+        <w:t>[Button: View Conversation]</w:t>
       </w:r>
     </w:p>
     <w:p/>
     <w:p>
+      <w:r>
+        <w:t>────────────────────────────────────────</w:t>
+      </w:r>
+    </w:p>
+    <w:p/>
+    <w:p>
+      <w:pPr>
+        <w:pStyle w:val="Heading2"/>
+      </w:pPr>
+      <w:r>
+        <w:t>📅 Interviews</w:t>
+      </w:r>
+    </w:p>
+    <w:p/>
+    <w:p>
       <w:pPr>
         <w:pStyle w:val="Heading3"/>
       </w:pPr>
       <w:r>
-        <w:t>11. Client portal welcome (después de set-password)</w:t>
+        <w:t>19. Interview invite (al candidato)</w:t>
       </w:r>
     </w:p>
     <w:p>
@@ -820,7 +2049,7 @@
         <w:pStyle w:val="ListBullet"/>
       </w:pPr>
       <w:r>
-        <w:t>Cuándo: cliente termina set-password.</w:t>
+        <w:t>Cuándo: el recruiter programa una interview y marca "Save &amp; send invite".</w:t>
       </w:r>
     </w:p>
     <w:p>
@@ -828,7 +2057,7 @@
         <w:pStyle w:val="ListBullet"/>
       </w:pPr>
       <w:r>
-        <w:t>Subject: Your Recruiting ATS client portal account is ready</w:t>
+        <w:t>Subject: Interview Invitation: {jobTitle} @ {clientName}</w:t>
       </w:r>
     </w:p>
     <w:p>
@@ -840,28 +2069,94 @@
       </w:r>
     </w:p>
     <w:p>
-      <w:r>
-        <w:t xml:space="preserve">  &gt; Welcome to Recruiting ATS</w:t>
-      </w:r>
-    </w:p>
-    <w:p>
-      <w:r>
-        <w:t xml:space="preserve">  &gt; Hi {firstName},</w:t>
-      </w:r>
-    </w:p>
-    <w:p>
-      <w:r>
-        <w:t xml:space="preserve">  &gt; Your client portal account for {clientName} is now active. Your email has been confirmed and you can sign in any time at the link below.</w:t>
-      </w:r>
-    </w:p>
-    <w:p>
-      <w:r>
-        <w:t xml:space="preserve">  &gt; Use the portal to review candidates shared by your recruiter, leave feedback, and track the searches you're hiring on.</w:t>
-      </w:r>
-    </w:p>
-    <w:p>
-      <w:r>
-        <w:t xml:space="preserve">  &gt; [Button: Open Portal]</w:t>
+      <w:pPr>
+        <w:spacing w:after="80"/>
+        <w:ind w:left="480"/>
+      </w:pPr>
+      <w:r>
+        <w:rPr>
+          <w:i/>
+          <w:color w:val="555555"/>
+        </w:rPr>
+        <w:t>Interview Invitation</w:t>
+      </w:r>
+    </w:p>
+    <w:p>
+      <w:pPr>
+        <w:spacing w:after="80"/>
+        <w:ind w:left="480"/>
+      </w:pPr>
+      <w:r>
+        <w:rPr>
+          <w:i/>
+          <w:color w:val="555555"/>
+        </w:rPr>
+        <w:t>Hi {candidateName},</w:t>
+      </w:r>
+    </w:p>
+    <w:p>
+      <w:pPr>
+        <w:spacing w:after="80"/>
+        <w:ind w:left="480"/>
+      </w:pPr>
+      <w:r>
+        <w:rPr>
+          <w:i/>
+          <w:color w:val="555555"/>
+        </w:rPr>
+        <w:t>You've been scheduled for an interview. Here are the details:</w:t>
+      </w:r>
+    </w:p>
+    <w:p>
+      <w:pPr>
+        <w:spacing w:after="80"/>
+        <w:ind w:left="480"/>
+      </w:pPr>
+      <w:r>
+        <w:rPr>
+          <w:i/>
+          <w:color w:val="555555"/>
+        </w:rPr>
+        <w:t>{tabla con job/client/date/time/timezone/type/location/notes}</w:t>
+      </w:r>
+    </w:p>
+    <w:p>
+      <w:pPr>
+        <w:spacing w:after="80"/>
+        <w:ind w:left="480"/>
+      </w:pPr>
+      <w:r>
+        <w:rPr>
+          <w:i/>
+          <w:color w:val="555555"/>
+        </w:rPr>
+        <w:t>If you need to reschedule or have any questions, please contact {recruiterName}.</w:t>
+      </w:r>
+    </w:p>
+    <w:p>
+      <w:pPr>
+        <w:spacing w:after="80"/>
+        <w:ind w:left="480"/>
+      </w:pPr>
+      <w:r>
+        <w:rPr>
+          <w:i/>
+          <w:color w:val="555555"/>
+        </w:rPr>
+        <w:t>Good luck!</w:t>
+      </w:r>
+    </w:p>
+    <w:p>
+      <w:pPr>
+        <w:spacing w:after="80"/>
+        <w:ind w:left="480"/>
+      </w:pPr>
+      <w:r>
+        <w:rPr>
+          <w:i/>
+          <w:color w:val="555555"/>
+        </w:rPr>
+        <w:t>[Button: Join Meeting] (si hay meeting link)</w:t>
       </w:r>
     </w:p>
     <w:p/>
@@ -870,7 +2165,7 @@
         <w:pStyle w:val="Heading3"/>
       </w:pPr>
       <w:r>
-        <w:t>12. Client job access granted (sumar miembro a job específico)</w:t>
+        <w:t>20. Interview invite (al cliente)</w:t>
       </w:r>
     </w:p>
     <w:p>
@@ -878,7 +2173,7 @@
         <w:pStyle w:val="ListBullet"/>
       </w:pPr>
       <w:r>
-        <w:t>Cuándo: un admin del client portal le da acceso a un job a otro teammate que ya tiene cuenta.</w:t>
+        <w:t>Cuándo: misma interview pero notificación al hiring contact.</w:t>
       </w:r>
     </w:p>
     <w:p>
@@ -886,7 +2181,7 @@
         <w:pStyle w:val="ListBullet"/>
       </w:pPr>
       <w:r>
-        <w:t>Subject: {inviterName} added you to {jobTitle}</w:t>
+        <w:t>Subject: Interview Scheduled: {candidateName} for {jobTitle} @ {clientName}</w:t>
       </w:r>
     </w:p>
     <w:p>
@@ -898,41 +2193,81 @@
       </w:r>
     </w:p>
     <w:p>
-      <w:r>
-        <w:t xml:space="preserve">  &gt; Hi {memberName},</w:t>
-      </w:r>
-    </w:p>
-    <w:p>
-      <w:r>
-        <w:t xml:space="preserve">  &gt; </w:t>
-      </w:r>
+      <w:pPr>
+        <w:spacing w:after="80"/>
+        <w:ind w:left="480"/>
+      </w:pPr>
       <w:r>
         <w:rPr>
-          <w:b/>
+          <w:i/>
+          <w:color w:val="555555"/>
         </w:rPr>
-        <w:t>{inviterName}</w:t>
-      </w:r>
-      <w:r>
-        <w:t xml:space="preserve"> just gave you access to </w:t>
-      </w:r>
+        <w:t>Interview Scheduled</w:t>
+      </w:r>
+    </w:p>
+    <w:p>
+      <w:pPr>
+        <w:spacing w:after="80"/>
+        <w:ind w:left="480"/>
+      </w:pPr>
       <w:r>
         <w:rPr>
-          <w:b/>
+          <w:i/>
+          <w:color w:val="555555"/>
         </w:rPr>
-        <w:t>{jobTitle}</w:t>
-      </w:r>
-      <w:r>
-        <w:t xml:space="preserve"> on {companyName}'s portal.</w:t>
-      </w:r>
-    </w:p>
-    <w:p>
-      <w:r>
-        <w:t xml:space="preserve">  &gt; You can now review shared candidates, post notes for the team, and follow the pipeline.</w:t>
-      </w:r>
-    </w:p>
-    <w:p>
-      <w:r>
-        <w:t xml:space="preserve">  &gt; [Button: Open Search]</w:t>
+        <w:t>Hi {contactName},</w:t>
+      </w:r>
+    </w:p>
+    <w:p>
+      <w:pPr>
+        <w:spacing w:after="80"/>
+        <w:ind w:left="480"/>
+      </w:pPr>
+      <w:r>
+        <w:rPr>
+          <w:i/>
+          <w:color w:val="555555"/>
+        </w:rPr>
+        <w:t>{recruiterName} from {firmName} has scheduled an interview for your review:</w:t>
+      </w:r>
+    </w:p>
+    <w:p>
+      <w:pPr>
+        <w:spacing w:after="80"/>
+        <w:ind w:left="480"/>
+      </w:pPr>
+      <w:r>
+        <w:rPr>
+          <w:i/>
+          <w:color w:val="555555"/>
+        </w:rPr>
+        <w:t>{tabla con candidate/job/client/date/time/type/notes}</w:t>
+      </w:r>
+    </w:p>
+    <w:p>
+      <w:pPr>
+        <w:spacing w:after="80"/>
+        <w:ind w:left="480"/>
+      </w:pPr>
+      <w:r>
+        <w:rPr>
+          <w:i/>
+          <w:color w:val="555555"/>
+        </w:rPr>
+        <w:t>Thanks for taking the time — let us know if you need to reschedule.</w:t>
+      </w:r>
+    </w:p>
+    <w:p>
+      <w:pPr>
+        <w:spacing w:after="80"/>
+        <w:ind w:left="480"/>
+      </w:pPr>
+      <w:r>
+        <w:rPr>
+          <w:i/>
+          <w:color w:val="555555"/>
+        </w:rPr>
+        <w:t>[Button: Join Meeting] (si hay link)</w:t>
       </w:r>
     </w:p>
     <w:p/>
@@ -947,7 +2282,7 @@
         <w:pStyle w:val="Heading2"/>
       </w:pPr>
       <w:r>
-        <w:t>📨 Engagement (firm ↔ client)</w:t>
+        <w:t>💳 Billing</w:t>
       </w:r>
     </w:p>
     <w:p/>
@@ -956,7 +2291,7 @@
         <w:pStyle w:val="Heading3"/>
       </w:pPr>
       <w:r>
-        <w:t>13. Engagement accepted (al cliente)</w:t>
+        <w:t>21. Subscription activated</w:t>
       </w:r>
     </w:p>
     <w:p>
@@ -964,7 +2299,7 @@
         <w:pStyle w:val="ListBullet"/>
       </w:pPr>
       <w:r>
-        <w:t>Cuándo: el firm acepta una invitación a colaborar en una búsqueda.</w:t>
+        <w:t>Cuándo: completaste checkout en Stripe.</w:t>
       </w:r>
     </w:p>
     <w:p>
@@ -972,7 +2307,7 @@
         <w:pStyle w:val="ListBullet"/>
       </w:pPr>
       <w:r>
-        <w:t>Subject: {firmName} accepted {jobTitle}</w:t>
+        <w:t>Subject: Subscription active — welcome to Recruiting ATS</w:t>
       </w:r>
     </w:p>
     <w:p>
@@ -984,36 +2319,107 @@
       </w:r>
     </w:p>
     <w:p>
-      <w:r>
-        <w:t xml:space="preserve">  &gt; Hi {inviterName},</w:t>
-      </w:r>
-    </w:p>
-    <w:p>
-      <w:r>
-        <w:t xml:space="preserve">  &gt; </w:t>
-      </w:r>
+      <w:pPr>
+        <w:spacing w:after="80"/>
+        <w:ind w:left="480"/>
+      </w:pPr>
       <w:r>
         <w:rPr>
-          <w:b/>
+          <w:i/>
+          <w:color w:val="555555"/>
         </w:rPr>
-        <w:t>{firmName}</w:t>
-      </w:r>
-      <w:r>
-        <w:t xml:space="preserve"> just accepted your invitation to work on </w:t>
-      </w:r>
+        <w:t>{firstName}, you're all set</w:t>
+      </w:r>
+    </w:p>
+    <w:p>
+      <w:pPr>
+        <w:spacing w:after="80"/>
+        <w:ind w:left="480"/>
+      </w:pPr>
       <w:r>
         <w:rPr>
-          <w:b/>
+          <w:i/>
+          <w:color w:val="555555"/>
         </w:rPr>
-        <w:t>{jobTitle}</w:t>
-      </w:r>
-      <w:r>
-        <w:t>. They can now start sharing candidates and chatting with your team.</w:t>
-      </w:r>
-    </w:p>
-    <w:p>
-      <w:r>
-        <w:t xml:space="preserve">  &gt; [Button: Open Search]</w:t>
+        <w:t>Your subscription to Recruiting ATS is now active. Thanks for trusting us with {orgName}'s recruiting workflow.</w:t>
+      </w:r>
+    </w:p>
+    <w:p>
+      <w:pPr>
+        <w:spacing w:after="80"/>
+        <w:ind w:left="480"/>
+      </w:pPr>
+      <w:r>
+        <w:rPr>
+          <w:i/>
+          <w:color w:val="555555"/>
+        </w:rPr>
+        <w:t>Plan: {N} seats · $${monthly}/month</w:t>
+      </w:r>
+    </w:p>
+    <w:p>
+      <w:pPr>
+        <w:spacing w:after="80"/>
+        <w:ind w:left="480"/>
+      </w:pPr>
+      <w:r>
+        <w:rPr>
+          <w:i/>
+          <w:color w:val="555555"/>
+        </w:rPr>
+        <w:t>Billing: Monthly, auto-renewed</w:t>
+      </w:r>
+    </w:p>
+    <w:p>
+      <w:pPr>
+        <w:spacing w:after="80"/>
+        <w:ind w:left="480"/>
+      </w:pPr>
+      <w:r>
+        <w:rPr>
+          <w:i/>
+          <w:color w:val="555555"/>
+        </w:rPr>
+        <w:t>You can manage billing — update your payment method, download invoices, or cancel — any time from your settings. Stripe will email you a receipt for every payment.</w:t>
+      </w:r>
+    </w:p>
+    <w:p>
+      <w:pPr>
+        <w:spacing w:after="80"/>
+        <w:ind w:left="480"/>
+      </w:pPr>
+      <w:r>
+        <w:rPr>
+          <w:i/>
+          <w:color w:val="555555"/>
+        </w:rPr>
+        <w:t>If you add or remove teammates the bill adjusts automatically on your next invoice.</w:t>
+      </w:r>
+    </w:p>
+    <w:p>
+      <w:pPr>
+        <w:spacing w:after="80"/>
+        <w:ind w:left="480"/>
+      </w:pPr>
+      <w:r>
+        <w:rPr>
+          <w:i/>
+          <w:color w:val="555555"/>
+        </w:rPr>
+        <w:t>Reply to this email if anything's confusing or you'd like to chat — we read every message.</w:t>
+      </w:r>
+    </w:p>
+    <w:p>
+      <w:pPr>
+        <w:spacing w:after="80"/>
+        <w:ind w:left="480"/>
+      </w:pPr>
+      <w:r>
+        <w:rPr>
+          <w:i/>
+          <w:color w:val="555555"/>
+        </w:rPr>
+        <w:t>[Button: Open Dashboard]</w:t>
       </w:r>
     </w:p>
     <w:p/>
@@ -1022,7 +2428,7 @@
         <w:pStyle w:val="Heading3"/>
       </w:pPr>
       <w:r>
-        <w:t>14. Client portal share (al cliente cuando se comparte shortlist)</w:t>
+        <w:t>22. Subscription canceled (scheduled)</w:t>
       </w:r>
     </w:p>
     <w:p>
@@ -1030,7 +2436,7 @@
         <w:pStyle w:val="ListBullet"/>
       </w:pPr>
       <w:r>
-        <w:t>Cuándo: el firm comparte candidatos con un cliente. Solo si el cliente ya tiene portal account.</w:t>
+        <w:t>Cuándo: cancelás desde Customer Portal. Sub sigue activa hasta el final del periodo.</w:t>
       </w:r>
     </w:p>
     <w:p>
@@ -1038,7 +2444,7 @@
         <w:pStyle w:val="ListBullet"/>
       </w:pPr>
       <w:r>
-        <w:t>Subject: {firmName} shared candidates with you for {jobTitle}</w:t>
+        <w:t>Subject: Subscription canceled — access until {date}</w:t>
       </w:r>
     </w:p>
     <w:p>
@@ -1050,51 +2456,94 @@
       </w:r>
     </w:p>
     <w:p>
-      <w:r>
-        <w:t xml:space="preserve">  &gt; Hi {clientName},</w:t>
-      </w:r>
-    </w:p>
-    <w:p>
-      <w:r>
-        <w:t xml:space="preserve">  &gt; </w:t>
-      </w:r>
+      <w:pPr>
+        <w:spacing w:after="80"/>
+        <w:ind w:left="480"/>
+      </w:pPr>
       <w:r>
         <w:rPr>
-          <w:b/>
+          <w:i/>
+          <w:color w:val="555555"/>
         </w:rPr>
-        <w:t>{recruiterName}</w:t>
-      </w:r>
-      <w:r>
-        <w:t xml:space="preserve"> from </w:t>
-      </w:r>
+        <w:t>{firstName}, we got your cancellation</w:t>
+      </w:r>
+    </w:p>
+    <w:p>
+      <w:pPr>
+        <w:spacing w:after="80"/>
+        <w:ind w:left="480"/>
+      </w:pPr>
       <w:r>
         <w:rPr>
-          <w:b/>
+          <w:i/>
+          <w:color w:val="555555"/>
         </w:rPr>
-        <w:t>{firmName}</w:t>
-      </w:r>
-      <w:r>
-        <w:t xml:space="preserve"> has shared a candidate shortlist with you on Recruiting ATS.</w:t>
-      </w:r>
-    </w:p>
-    <w:p>
-      <w:r>
-        <w:t xml:space="preserve">  &gt; {jobTitle}</w:t>
-      </w:r>
-    </w:p>
-    <w:p>
-      <w:r>
-        <w:t xml:space="preserve">  &gt; {N} candidates have been shared for your review.</w:t>
-      </w:r>
-    </w:p>
-    <w:p>
-      <w:r>
-        <w:t xml:space="preserve">  &gt; Sign in to your client portal to review profiles, rate candidates, and leave feedback.</w:t>
-      </w:r>
-    </w:p>
-    <w:p>
-      <w:r>
-        <w:t xml:space="preserve">  &gt; [Button: Review Candidates]</w:t>
+        <w:t>Your Recruiting ATS subscription for {orgName} is scheduled to cancel.</w:t>
+      </w:r>
+    </w:p>
+    <w:p>
+      <w:pPr>
+        <w:spacing w:after="80"/>
+        <w:ind w:left="480"/>
+      </w:pPr>
+      <w:r>
+        <w:rPr>
+          <w:i/>
+          <w:color w:val="555555"/>
+        </w:rPr>
+        <w:t>Access until: {date}</w:t>
+      </w:r>
+    </w:p>
+    <w:p>
+      <w:pPr>
+        <w:spacing w:after="80"/>
+        <w:ind w:left="480"/>
+      </w:pPr>
+      <w:r>
+        <w:rPr>
+          <w:i/>
+          <w:color w:val="555555"/>
+        </w:rPr>
+        <w:t>After that: You'll lose access to create new data. Your existing candidates, jobs and clients stay in our DB.</w:t>
+      </w:r>
+    </w:p>
+    <w:p>
+      <w:pPr>
+        <w:spacing w:after="80"/>
+        <w:ind w:left="480"/>
+      </w:pPr>
+      <w:r>
+        <w:rPr>
+          <w:i/>
+          <w:color w:val="555555"/>
+        </w:rPr>
+        <w:t>Changed your mind? Reactivate before {date} and keep everything as it is — no new charge until your normal billing cycle.</w:t>
+      </w:r>
+    </w:p>
+    <w:p>
+      <w:pPr>
+        <w:spacing w:after="80"/>
+        <w:ind w:left="480"/>
+      </w:pPr>
+      <w:r>
+        <w:rPr>
+          <w:i/>
+          <w:color w:val="555555"/>
+        </w:rPr>
+        <w:t>If we can do something to keep you on board, just reply — we read every email.</w:t>
+      </w:r>
+    </w:p>
+    <w:p>
+      <w:pPr>
+        <w:spacing w:after="80"/>
+        <w:ind w:left="480"/>
+      </w:pPr>
+      <w:r>
+        <w:rPr>
+          <w:i/>
+          <w:color w:val="555555"/>
+        </w:rPr>
+        <w:t>[Button: Reactivate subscription]</w:t>
       </w:r>
     </w:p>
     <w:p/>
@@ -1103,7 +2552,7 @@
         <w:pStyle w:val="Heading3"/>
       </w:pPr>
       <w:r>
-        <w:t>15. Candidate shared (al cliente, cada vez que se comparte un candidato individual)</w:t>
+        <w:t>23. Subscription ended</w:t>
       </w:r>
     </w:p>
     <w:p>
@@ -1111,7 +2560,7 @@
         <w:pStyle w:val="ListBullet"/>
       </w:pPr>
       <w:r>
-        <w:t>Cuándo: el firm comparte un candidato puntual con el cliente.</w:t>
+        <w:t>Cuándo: termina el periodo después de cancel. Acceso revocado.</w:t>
       </w:r>
     </w:p>
     <w:p>
@@ -1119,7 +2568,7 @@
         <w:pStyle w:val="ListBullet"/>
       </w:pPr>
       <w:r>
-        <w:t>Subject: New candidate shared: {candidateName} for {jobTitle}</w:t>
+        <w:t>Subject: Your Recruiting ATS subscription has ended</w:t>
       </w:r>
     </w:p>
     <w:p>
@@ -1131,74 +2580,94 @@
       </w:r>
     </w:p>
     <w:p>
-      <w:r>
-        <w:t xml:space="preserve">  &gt; New candidate for {jobTitle}</w:t>
-      </w:r>
-    </w:p>
-    <w:p>
-      <w:r>
-        <w:t xml:space="preserve">  &gt; Hi {firstName},</w:t>
-      </w:r>
-    </w:p>
-    <w:p>
-      <w:r>
-        <w:t xml:space="preserve">  &gt; </w:t>
-      </w:r>
+      <w:pPr>
+        <w:spacing w:after="80"/>
+        <w:ind w:left="480"/>
+      </w:pPr>
       <w:r>
         <w:rPr>
-          <w:b/>
+          <w:i/>
+          <w:color w:val="555555"/>
         </w:rPr>
-        <w:t>{recruiterName}</w:t>
-      </w:r>
-      <w:r>
-        <w:t xml:space="preserve"> from </w:t>
-      </w:r>
+        <w:t>{firstName}, your subscription has ended</w:t>
+      </w:r>
+    </w:p>
+    <w:p>
+      <w:pPr>
+        <w:spacing w:after="80"/>
+        <w:ind w:left="480"/>
+      </w:pPr>
       <w:r>
         <w:rPr>
-          <w:b/>
+          <w:i/>
+          <w:color w:val="555555"/>
         </w:rPr>
-        <w:t>{firmName}</w:t>
-      </w:r>
-      <w:r>
-        <w:t xml:space="preserve"> just shared a new candidate with </w:t>
-      </w:r>
+        <w:t>Your Recruiting ATS subscription for {orgName} ended today.</w:t>
+      </w:r>
+    </w:p>
+    <w:p>
+      <w:pPr>
+        <w:spacing w:after="80"/>
+        <w:ind w:left="480"/>
+      </w:pPr>
       <w:r>
         <w:rPr>
-          <w:b/>
+          <w:i/>
+          <w:color w:val="555555"/>
         </w:rPr>
-        <w:t>{clientName}</w:t>
-      </w:r>
-      <w:r>
-        <w:t>:</w:t>
-      </w:r>
-    </w:p>
-    <w:p>
-      <w:r>
-        <w:t xml:space="preserve">  &gt; </w:t>
-      </w:r>
+        <w:t>Your data is safe — we keep it in our DB so you can pick up where you left off. To regain access:</w:t>
+      </w:r>
+    </w:p>
+    <w:p>
+      <w:pPr>
+        <w:spacing w:after="80"/>
+        <w:ind w:left="480"/>
+      </w:pPr>
       <w:r>
         <w:rPr>
-          <w:b/>
+          <w:i/>
+          <w:color w:val="555555"/>
         </w:rPr>
-        <w:t>{candidateName}</w:t>
-      </w:r>
-      <w:r>
-        <w:t xml:space="preserve"> for {jobTitle}</w:t>
-      </w:r>
-    </w:p>
-    <w:p>
-      <w:r>
-        <w:t xml:space="preserve">  &gt; {Optional note from recruiter}</w:t>
-      </w:r>
-    </w:p>
-    <w:p>
-      <w:r>
-        <w:t xml:space="preserve">  &gt; Sign in to the client portal to view the full profile, download their resume, and leave feedback.</w:t>
-      </w:r>
-    </w:p>
-    <w:p>
-      <w:r>
-        <w:t xml:space="preserve">  &gt; [Button: View Candidate]</w:t>
+        <w:t>- Resubscribe — same price, your candidates and pipeline come back instantly.</w:t>
+      </w:r>
+    </w:p>
+    <w:p>
+      <w:pPr>
+        <w:spacing w:after="80"/>
+        <w:ind w:left="480"/>
+      </w:pPr>
+      <w:r>
+        <w:rPr>
+          <w:i/>
+          <w:color w:val="555555"/>
+        </w:rPr>
+        <w:t>- Reply to this email if you'd like to chat about your experience or ask for a custom plan.</w:t>
+      </w:r>
+    </w:p>
+    <w:p>
+      <w:pPr>
+        <w:spacing w:after="80"/>
+        <w:ind w:left="480"/>
+      </w:pPr>
+      <w:r>
+        <w:rPr>
+          <w:i/>
+          <w:color w:val="555555"/>
+        </w:rPr>
+        <w:t>Thanks for using Recruiting ATS, whatever you decide.</w:t>
+      </w:r>
+    </w:p>
+    <w:p>
+      <w:pPr>
+        <w:spacing w:after="80"/>
+        <w:ind w:left="480"/>
+      </w:pPr>
+      <w:r>
+        <w:rPr>
+          <w:i/>
+          <w:color w:val="555555"/>
+        </w:rPr>
+        <w:t>[Button: Resubscribe]</w:t>
       </w:r>
     </w:p>
     <w:p/>
@@ -1207,7 +2676,7 @@
         <w:pStyle w:val="Heading3"/>
       </w:pPr>
       <w:r>
-        <w:t>16. Candidate feedback (al recruiter, cuando el cliente deja review)</w:t>
+        <w:t>24. Subscription reactivated</w:t>
       </w:r>
     </w:p>
     <w:p>
@@ -1215,7 +2684,7 @@
         <w:pStyle w:val="ListBullet"/>
       </w:pPr>
       <w:r>
-        <w:t>Cuándo: cliente puntúa o comenta un candidato.</w:t>
+        <w:t>Cuándo: después de cancelar, el user reactiva antes de que termine el periodo.</w:t>
       </w:r>
     </w:p>
     <w:p>
@@ -1223,7 +2692,7 @@
         <w:pStyle w:val="ListBullet"/>
       </w:pPr>
       <w:r>
-        <w:t>Subject: {reviewerName} left {N}★ feedback on {candidateName} (o "new feedback" / "viewed")</w:t>
+        <w:t>Subject: Subscription reactivated — welcome back</w:t>
       </w:r>
     </w:p>
     <w:p>
@@ -1235,84 +2704,77 @@
       </w:r>
     </w:p>
     <w:p>
-      <w:r>
-        <w:t xml:space="preserve">  &gt; New feedback on {candidateName}</w:t>
-      </w:r>
-    </w:p>
-    <w:p>
-      <w:r>
-        <w:t xml:space="preserve">  &gt; Hi {recruiterName},</w:t>
-      </w:r>
-    </w:p>
-    <w:p>
-      <w:r>
-        <w:t xml:space="preserve">  &gt; </w:t>
-      </w:r>
+      <w:pPr>
+        <w:spacing w:after="80"/>
+        <w:ind w:left="480"/>
+      </w:pPr>
       <w:r>
         <w:rPr>
-          <w:b/>
+          <w:i/>
+          <w:color w:val="555555"/>
         </w:rPr>
-        <w:t>{reviewerName}</w:t>
-      </w:r>
-      <w:r>
-        <w:t xml:space="preserve"> at </w:t>
-      </w:r>
+        <w:t>{firstName}, glad to have you back</w:t>
+      </w:r>
+    </w:p>
+    <w:p>
+      <w:pPr>
+        <w:spacing w:after="80"/>
+        <w:ind w:left="480"/>
+      </w:pPr>
       <w:r>
         <w:rPr>
-          <w:b/>
+          <w:i/>
+          <w:color w:val="555555"/>
         </w:rPr>
-        <w:t>{clientCompanyName}</w:t>
-      </w:r>
-      <w:r>
-        <w:t xml:space="preserve"> just left feedback on </w:t>
-      </w:r>
+        <w:t>Your Recruiting ATS subscription for {orgName} is back on track. No cancellation pending.</w:t>
+      </w:r>
+    </w:p>
+    <w:p>
+      <w:pPr>
+        <w:spacing w:after="80"/>
+        <w:ind w:left="480"/>
+      </w:pPr>
       <w:r>
         <w:rPr>
-          <w:b/>
+          <w:i/>
+          <w:color w:val="555555"/>
         </w:rPr>
-        <w:t>{candidateName}</w:t>
-      </w:r>
-      <w:r>
-        <w:t xml:space="preserve"> for {jobTitle}.</w:t>
-      </w:r>
-    </w:p>
-    <w:p>
-      <w:r>
-        <w:t xml:space="preserve">  &gt; Rating: ★★★★☆ (4/5)</w:t>
-      </w:r>
-    </w:p>
-    <w:p>
-      <w:r>
-        <w:t xml:space="preserve">  &gt; {Optional comment}</w:t>
-      </w:r>
-    </w:p>
-    <w:p>
-      <w:r>
-        <w:t xml:space="preserve">  &gt; [Button: View Candidate]</w:t>
+        <w:t>Next billing date: {date}. Same plan, same seats — billing continues uninterrupted.</w:t>
+      </w:r>
+    </w:p>
+    <w:p>
+      <w:pPr>
+        <w:spacing w:after="80"/>
+        <w:ind w:left="480"/>
+      </w:pPr>
+      <w:r>
+        <w:rPr>
+          <w:i/>
+          <w:color w:val="555555"/>
+        </w:rPr>
+        <w:t>If you reactivated by accident, you can cancel again from Settings → Billing.</w:t>
+      </w:r>
+    </w:p>
+    <w:p>
+      <w:pPr>
+        <w:spacing w:after="80"/>
+        <w:ind w:left="480"/>
+      </w:pPr>
+      <w:r>
+        <w:rPr>
+          <w:i/>
+          <w:color w:val="555555"/>
+        </w:rPr>
+        <w:t>[Button: Open Dashboard]</w:t>
       </w:r>
     </w:p>
     <w:p/>
     <w:p>
-      <w:r>
-        <w:t>────────────────────────────────────────</w:t>
-      </w:r>
-    </w:p>
-    <w:p/>
-    <w:p>
-      <w:pPr>
-        <w:pStyle w:val="Heading2"/>
-      </w:pPr>
-      <w:r>
-        <w:t>💬 Chat &amp; menciones</w:t>
-      </w:r>
-    </w:p>
-    <w:p/>
-    <w:p>
       <w:pPr>
         <w:pStyle w:val="Heading3"/>
       </w:pPr>
       <w:r>
-        <w:t>17. New message (chat)</w:t>
+        <w:t>25. Payment failed</w:t>
       </w:r>
     </w:p>
     <w:p>
@@ -1320,7 +2782,7 @@
         <w:pStyle w:val="ListBullet"/>
       </w:pPr>
       <w:r>
-        <w:t>Cuándo: alguien manda un mensaje en el chat (interno o cliente). Solo a los que NO están @-mencionados; los @-mencionados van por la mention email (#18).</w:t>
+        <w:t>Cuándo: Stripe no pudo cobrar la tarjeta (decline, expirada, etc).</w:t>
       </w:r>
     </w:p>
     <w:p>
@@ -1328,7 +2790,7 @@
         <w:pStyle w:val="ListBullet"/>
       </w:pPr>
       <w:r>
-        <w:t>Subject: New message on {candidateName} — {jobTitle}</w:t>
+        <w:t>Subject: Action required: payment failed for Recruiting ATS</w:t>
       </w:r>
     </w:p>
     <w:p>
@@ -1340,729 +2802,55 @@
       </w:r>
     </w:p>
     <w:p>
-      <w:r>
-        <w:t xml:space="preserve">  &gt; New message about {candidateName}</w:t>
-      </w:r>
-    </w:p>
-    <w:p>
-      <w:r>
-        <w:t xml:space="preserve">  &gt; Hi {firstName},</w:t>
-      </w:r>
-    </w:p>
-    <w:p>
-      <w:r>
-        <w:t xml:space="preserve">  &gt; </w:t>
-      </w:r>
+      <w:pPr>
+        <w:spacing w:after="80"/>
+        <w:ind w:left="480"/>
+      </w:pPr>
       <w:r>
         <w:rPr>
-          <w:b/>
+          <w:i/>
+          <w:color w:val="555555"/>
         </w:rPr>
-        <w:t>{fromName}</w:t>
-      </w:r>
-      <w:r>
-        <w:t xml:space="preserve"> ({a recruiter | the client | your team}) left a new message in {your internal channel | the shared chat} for </w:t>
-      </w:r>
+        <w:t>{firstName}, your payment didn't go through</w:t>
+      </w:r>
+    </w:p>
+    <w:p>
+      <w:pPr>
+        <w:spacing w:after="80"/>
+        <w:ind w:left="480"/>
+      </w:pPr>
       <w:r>
         <w:rPr>
-          <w:b/>
+          <w:i/>
+          <w:color w:val="555555"/>
         </w:rPr>
-        <w:t>{candidateName}</w:t>
-      </w:r>
-      <w:r>
-        <w:t xml:space="preserve"> ({jobTitle}):</w:t>
-      </w:r>
-    </w:p>
-    <w:p>
-      <w:r>
-        <w:t xml:space="preserve">  &gt; &gt; {preview del mensaje}</w:t>
-      </w:r>
-    </w:p>
-    <w:p>
-      <w:r>
-        <w:t xml:space="preserve">  &gt; [Button: View Conversation]</w:t>
-      </w:r>
-    </w:p>
-    <w:p/>
-    <w:p>
-      <w:pPr>
-        <w:pStyle w:val="Heading3"/>
-      </w:pPr>
-      <w:r>
-        <w:t>18. Mention</w:t>
-      </w:r>
-    </w:p>
-    <w:p>
-      <w:pPr>
-        <w:pStyle w:val="ListBullet"/>
-      </w:pPr>
-      <w:r>
-        <w:t>Cuándo: alguien te @-menciona en un chat.</w:t>
-      </w:r>
-    </w:p>
-    <w:p>
-      <w:pPr>
-        <w:pStyle w:val="ListBullet"/>
-      </w:pPr>
-      <w:r>
-        <w:t>Subject: {mentionedBy} mentioned you — {candidateName}</w:t>
-      </w:r>
-    </w:p>
-    <w:p>
-      <w:pPr>
-        <w:pStyle w:val="ListBullet"/>
-      </w:pPr>
-      <w:r>
-        <w:t>Body:</w:t>
-      </w:r>
-    </w:p>
-    <w:p>
-      <w:r>
-        <w:t xml:space="preserve">  &gt; {mentionedBy} mentioned you</w:t>
-      </w:r>
-    </w:p>
-    <w:p>
-      <w:r>
-        <w:t xml:space="preserve">  &gt; Hi {firstName},</w:t>
-      </w:r>
-    </w:p>
-    <w:p>
-      <w:r>
-        <w:t xml:space="preserve">  &gt; </w:t>
-      </w:r>
+        <w:t>We tried to charge your card for Recruiting ATS — {orgName} — and the bank declined it.</w:t>
+      </w:r>
+    </w:p>
+    <w:p>
+      <w:pPr>
+        <w:spacing w:after="80"/>
+        <w:ind w:left="480"/>
+      </w:pPr>
       <w:r>
         <w:rPr>
-          <w:b/>
+          <w:i/>
+          <w:color w:val="555555"/>
         </w:rPr>
-        <w:t>{mentionedBy}</w:t>
-      </w:r>
-      <w:r>
-        <w:t xml:space="preserve"> mentioned you in a message about </w:t>
-      </w:r>
+        <w:t>To avoid losing access, update your payment method:</w:t>
+      </w:r>
+    </w:p>
+    <w:p>
+      <w:pPr>
+        <w:spacing w:after="80"/>
+        <w:ind w:left="480"/>
+      </w:pPr>
       <w:r>
         <w:rPr>
-          <w:b/>
+          <w:i/>
+          <w:color w:val="555555"/>
         </w:rPr>
-        <w:t>{candidateName}</w:t>
-      </w:r>
-      <w:r>
-        <w:t xml:space="preserve"> ({jobTitle}):</w:t>
-      </w:r>
-    </w:p>
-    <w:p>
-      <w:r>
-        <w:t xml:space="preserve">  &gt; &gt; {preview del mensaje}</w:t>
-      </w:r>
-    </w:p>
-    <w:p>
-      <w:r>
-        <w:t xml:space="preserve">  &gt; [Button: View Conversation]</w:t>
-      </w:r>
-    </w:p>
-    <w:p/>
-    <w:p>
-      <w:r>
-        <w:t>────────────────────────────────────────</w:t>
-      </w:r>
-    </w:p>
-    <w:p/>
-    <w:p>
-      <w:pPr>
-        <w:pStyle w:val="Heading2"/>
-      </w:pPr>
-      <w:r>
-        <w:t>📅 Interviews</w:t>
-      </w:r>
-    </w:p>
-    <w:p/>
-    <w:p>
-      <w:pPr>
-        <w:pStyle w:val="Heading3"/>
-      </w:pPr>
-      <w:r>
-        <w:t>19. Interview invite (al candidato)</w:t>
-      </w:r>
-    </w:p>
-    <w:p>
-      <w:pPr>
-        <w:pStyle w:val="ListBullet"/>
-      </w:pPr>
-      <w:r>
-        <w:t>Cuándo: el recruiter programa una interview y marca "Save &amp; send invite".</w:t>
-      </w:r>
-    </w:p>
-    <w:p>
-      <w:pPr>
-        <w:pStyle w:val="ListBullet"/>
-      </w:pPr>
-      <w:r>
-        <w:t>Subject: Interview Invitation: {jobTitle} @ {clientName}</w:t>
-      </w:r>
-    </w:p>
-    <w:p>
-      <w:pPr>
-        <w:pStyle w:val="ListBullet"/>
-      </w:pPr>
-      <w:r>
-        <w:t>Body:</w:t>
-      </w:r>
-    </w:p>
-    <w:p>
-      <w:r>
-        <w:t xml:space="preserve">  &gt; Interview Invitation</w:t>
-      </w:r>
-    </w:p>
-    <w:p>
-      <w:r>
-        <w:t xml:space="preserve">  &gt; Hi {candidateName},</w:t>
-      </w:r>
-    </w:p>
-    <w:p>
-      <w:r>
-        <w:t xml:space="preserve">  &gt; You've been scheduled for an interview. Here are the details:</w:t>
-      </w:r>
-    </w:p>
-    <w:p>
-      <w:r>
-        <w:t xml:space="preserve">  &gt; {tabla con job/client/date/time/timezone/type/location/notes}</w:t>
-      </w:r>
-    </w:p>
-    <w:p>
-      <w:r>
-        <w:t xml:space="preserve">  &gt; If you need to reschedule or have any questions, please contact </w:t>
-      </w:r>
-      <w:r>
-        <w:rPr>
-          <w:b/>
-        </w:rPr>
-        <w:t>{recruiterName}</w:t>
-      </w:r>
-      <w:r>
-        <w:t>.</w:t>
-      </w:r>
-    </w:p>
-    <w:p>
-      <w:r>
-        <w:t xml:space="preserve">  &gt; Good luck!</w:t>
-      </w:r>
-    </w:p>
-    <w:p>
-      <w:r>
-        <w:t xml:space="preserve">  &gt; [Button: Join Meeting] (si hay meeting link)</w:t>
-      </w:r>
-    </w:p>
-    <w:p/>
-    <w:p>
-      <w:pPr>
-        <w:pStyle w:val="Heading3"/>
-      </w:pPr>
-      <w:r>
-        <w:t>20. Interview invite (al cliente)</w:t>
-      </w:r>
-    </w:p>
-    <w:p>
-      <w:pPr>
-        <w:pStyle w:val="ListBullet"/>
-      </w:pPr>
-      <w:r>
-        <w:t>Cuándo: misma interview pero notificación al hiring contact.</w:t>
-      </w:r>
-    </w:p>
-    <w:p>
-      <w:pPr>
-        <w:pStyle w:val="ListBullet"/>
-      </w:pPr>
-      <w:r>
-        <w:t>Subject: Interview Scheduled: {candidateName} for {jobTitle} @ {clientName}</w:t>
-      </w:r>
-    </w:p>
-    <w:p>
-      <w:pPr>
-        <w:pStyle w:val="ListBullet"/>
-      </w:pPr>
-      <w:r>
-        <w:t>Body:</w:t>
-      </w:r>
-    </w:p>
-    <w:p>
-      <w:r>
-        <w:t xml:space="preserve">  &gt; Interview Scheduled</w:t>
-      </w:r>
-    </w:p>
-    <w:p>
-      <w:r>
-        <w:t xml:space="preserve">  &gt; Hi {contactName},</w:t>
-      </w:r>
-    </w:p>
-    <w:p>
-      <w:r>
-        <w:t xml:space="preserve">  &gt; </w:t>
-      </w:r>
-      <w:r>
-        <w:rPr>
-          <w:b/>
-        </w:rPr>
-        <w:t>{recruiterName}</w:t>
-      </w:r>
-      <w:r>
-        <w:t xml:space="preserve"> from </w:t>
-      </w:r>
-      <w:r>
-        <w:rPr>
-          <w:b/>
-        </w:rPr>
-        <w:t>{firmName}</w:t>
-      </w:r>
-      <w:r>
-        <w:t xml:space="preserve"> has scheduled an interview for your review:</w:t>
-      </w:r>
-    </w:p>
-    <w:p>
-      <w:r>
-        <w:t xml:space="preserve">  &gt; {tabla con candidate/job/client/date/time/type/notes}</w:t>
-      </w:r>
-    </w:p>
-    <w:p>
-      <w:r>
-        <w:t xml:space="preserve">  &gt; Thanks for taking the time — let us know if you need to reschedule.</w:t>
-      </w:r>
-    </w:p>
-    <w:p>
-      <w:r>
-        <w:t xml:space="preserve">  &gt; [Button: Join Meeting] (si hay link)</w:t>
-      </w:r>
-    </w:p>
-    <w:p/>
-    <w:p>
-      <w:r>
-        <w:t>────────────────────────────────────────</w:t>
-      </w:r>
-    </w:p>
-    <w:p/>
-    <w:p>
-      <w:pPr>
-        <w:pStyle w:val="Heading2"/>
-      </w:pPr>
-      <w:r>
-        <w:t>💳 Billing</w:t>
-      </w:r>
-    </w:p>
-    <w:p/>
-    <w:p>
-      <w:pPr>
-        <w:pStyle w:val="Heading3"/>
-      </w:pPr>
-      <w:r>
-        <w:t>21. Subscription activated</w:t>
-      </w:r>
-    </w:p>
-    <w:p>
-      <w:pPr>
-        <w:pStyle w:val="ListBullet"/>
-      </w:pPr>
-      <w:r>
-        <w:t>Cuándo: completaste checkout en Stripe.</w:t>
-      </w:r>
-    </w:p>
-    <w:p>
-      <w:pPr>
-        <w:pStyle w:val="ListBullet"/>
-      </w:pPr>
-      <w:r>
-        <w:t>Subject: Subscription active — welcome to Recruiting ATS</w:t>
-      </w:r>
-    </w:p>
-    <w:p>
-      <w:pPr>
-        <w:pStyle w:val="ListBullet"/>
-      </w:pPr>
-      <w:r>
-        <w:t>Body:</w:t>
-      </w:r>
-    </w:p>
-    <w:p>
-      <w:r>
-        <w:t xml:space="preserve">  &gt; {firstName}, you're all set</w:t>
-      </w:r>
-    </w:p>
-    <w:p>
-      <w:r>
-        <w:t xml:space="preserve">  &gt; Your subscription to </w:t>
-      </w:r>
-      <w:r>
-        <w:rPr>
-          <w:b/>
-        </w:rPr>
-        <w:t>Recruiting ATS</w:t>
-      </w:r>
-      <w:r>
-        <w:t xml:space="preserve"> is now active. Thanks for trusting us with </w:t>
-      </w:r>
-      <w:r>
-        <w:rPr>
-          <w:b/>
-        </w:rPr>
-        <w:t>{orgName}</w:t>
-      </w:r>
-      <w:r>
-        <w:t>'s recruiting workflow.</w:t>
-      </w:r>
-    </w:p>
-    <w:p>
-      <w:r>
-        <w:t xml:space="preserve">  &gt; Plan: {N} seats · $${monthly}/month</w:t>
-      </w:r>
-    </w:p>
-    <w:p>
-      <w:r>
-        <w:t xml:space="preserve">  &gt; Billing: Monthly, auto-renewed</w:t>
-      </w:r>
-    </w:p>
-    <w:p>
-      <w:r>
-        <w:t xml:space="preserve">  &gt; You can manage billing — update your payment method, download invoices, or cancel — any time from your settings. Stripe will email you a receipt for every payment.</w:t>
-      </w:r>
-    </w:p>
-    <w:p>
-      <w:r>
-        <w:t xml:space="preserve">  &gt; If you add or remove teammates the bill adjusts automatically on your next invoice.</w:t>
-      </w:r>
-    </w:p>
-    <w:p>
-      <w:r>
-        <w:t xml:space="preserve">  &gt; Reply to this email if anything's confusing or you'd like to chat — we read every message.</w:t>
-      </w:r>
-    </w:p>
-    <w:p>
-      <w:r>
-        <w:t xml:space="preserve">  &gt; [Button: Open Dashboard]</w:t>
-      </w:r>
-    </w:p>
-    <w:p/>
-    <w:p>
-      <w:pPr>
-        <w:pStyle w:val="Heading3"/>
-      </w:pPr>
-      <w:r>
-        <w:t>22. Subscription canceled (scheduled)</w:t>
-      </w:r>
-    </w:p>
-    <w:p>
-      <w:pPr>
-        <w:pStyle w:val="ListBullet"/>
-      </w:pPr>
-      <w:r>
-        <w:t>Cuándo: cancelás desde Customer Portal. Sub sigue activa hasta el final del periodo.</w:t>
-      </w:r>
-    </w:p>
-    <w:p>
-      <w:pPr>
-        <w:pStyle w:val="ListBullet"/>
-      </w:pPr>
-      <w:r>
-        <w:t>Subject: Subscription canceled — access until {date}</w:t>
-      </w:r>
-    </w:p>
-    <w:p>
-      <w:pPr>
-        <w:pStyle w:val="ListBullet"/>
-      </w:pPr>
-      <w:r>
-        <w:t>Body:</w:t>
-      </w:r>
-    </w:p>
-    <w:p>
-      <w:r>
-        <w:t xml:space="preserve">  &gt; {firstName}, we got your cancellation</w:t>
-      </w:r>
-    </w:p>
-    <w:p>
-      <w:r>
-        <w:t xml:space="preserve">  &gt; Your </w:t>
-      </w:r>
-      <w:r>
-        <w:rPr>
-          <w:b/>
-        </w:rPr>
-        <w:t>Recruiting ATS</w:t>
-      </w:r>
-      <w:r>
-        <w:t xml:space="preserve"> subscription for </w:t>
-      </w:r>
-      <w:r>
-        <w:rPr>
-          <w:b/>
-        </w:rPr>
-        <w:t>{orgName}</w:t>
-      </w:r>
-      <w:r>
-        <w:t xml:space="preserve"> is scheduled to cancel.</w:t>
-      </w:r>
-    </w:p>
-    <w:p>
-      <w:r>
-        <w:t xml:space="preserve">  &gt; Access until: {date}</w:t>
-      </w:r>
-    </w:p>
-    <w:p>
-      <w:r>
-        <w:t xml:space="preserve">  &gt; After that: You'll lose access to create new data. Your existing candidates, jobs and clients stay in our DB.</w:t>
-      </w:r>
-    </w:p>
-    <w:p>
-      <w:r>
-        <w:t xml:space="preserve">  &gt; Changed your mind? Reactivate before {date} and keep everything as it is — no new charge until your normal billing cycle.</w:t>
-      </w:r>
-    </w:p>
-    <w:p>
-      <w:r>
-        <w:t xml:space="preserve">  &gt; If we can do something to keep you on board, just reply — we read every email.</w:t>
-      </w:r>
-    </w:p>
-    <w:p>
-      <w:r>
-        <w:t xml:space="preserve">  &gt; [Button: Reactivate subscription]</w:t>
-      </w:r>
-    </w:p>
-    <w:p/>
-    <w:p>
-      <w:pPr>
-        <w:pStyle w:val="Heading3"/>
-      </w:pPr>
-      <w:r>
-        <w:t>23. Subscription ended</w:t>
-      </w:r>
-    </w:p>
-    <w:p>
-      <w:pPr>
-        <w:pStyle w:val="ListBullet"/>
-      </w:pPr>
-      <w:r>
-        <w:t>Cuándo: termina el periodo después de cancel. Acceso revocado.</w:t>
-      </w:r>
-    </w:p>
-    <w:p>
-      <w:pPr>
-        <w:pStyle w:val="ListBullet"/>
-      </w:pPr>
-      <w:r>
-        <w:t>Subject: Your Recruiting ATS subscription has ended</w:t>
-      </w:r>
-    </w:p>
-    <w:p>
-      <w:pPr>
-        <w:pStyle w:val="ListBullet"/>
-      </w:pPr>
-      <w:r>
-        <w:t>Body:</w:t>
-      </w:r>
-    </w:p>
-    <w:p>
-      <w:r>
-        <w:t xml:space="preserve">  &gt; {firstName}, your subscription has ended</w:t>
-      </w:r>
-    </w:p>
-    <w:p>
-      <w:r>
-        <w:t xml:space="preserve">  &gt; Your </w:t>
-      </w:r>
-      <w:r>
-        <w:rPr>
-          <w:b/>
-        </w:rPr>
-        <w:t>Recruiting ATS</w:t>
-      </w:r>
-      <w:r>
-        <w:t xml:space="preserve"> subscription for </w:t>
-      </w:r>
-      <w:r>
-        <w:rPr>
-          <w:b/>
-        </w:rPr>
-        <w:t>{orgName}</w:t>
-      </w:r>
-      <w:r>
-        <w:t xml:space="preserve"> ended today.</w:t>
-      </w:r>
-    </w:p>
-    <w:p>
-      <w:r>
-        <w:t xml:space="preserve">  &gt; Your data is safe — we keep it in our DB so you can pick up where you left off. To regain access:</w:t>
-      </w:r>
-    </w:p>
-    <w:p>
-      <w:r>
-        <w:t xml:space="preserve">  &gt; - Resubscribe — same price, your candidates and pipeline come back instantly.</w:t>
-      </w:r>
-    </w:p>
-    <w:p>
-      <w:r>
-        <w:t xml:space="preserve">  &gt; - Reply to this email if you'd like to chat about your experience or ask for a custom plan.</w:t>
-      </w:r>
-    </w:p>
-    <w:p>
-      <w:r>
-        <w:t xml:space="preserve">  &gt; Thanks for using Recruiting ATS, whatever you decide.</w:t>
-      </w:r>
-    </w:p>
-    <w:p>
-      <w:r>
-        <w:t xml:space="preserve">  &gt; [Button: Resubscribe]</w:t>
-      </w:r>
-    </w:p>
-    <w:p/>
-    <w:p>
-      <w:pPr>
-        <w:pStyle w:val="Heading3"/>
-      </w:pPr>
-      <w:r>
-        <w:t>24. Subscription reactivated</w:t>
-      </w:r>
-    </w:p>
-    <w:p>
-      <w:pPr>
-        <w:pStyle w:val="ListBullet"/>
-      </w:pPr>
-      <w:r>
-        <w:t>Cuándo: después de cancelar, el user reactiva antes de que termine el periodo.</w:t>
-      </w:r>
-    </w:p>
-    <w:p>
-      <w:pPr>
-        <w:pStyle w:val="ListBullet"/>
-      </w:pPr>
-      <w:r>
-        <w:t>Subject: Subscription reactivated — welcome back</w:t>
-      </w:r>
-    </w:p>
-    <w:p>
-      <w:pPr>
-        <w:pStyle w:val="ListBullet"/>
-      </w:pPr>
-      <w:r>
-        <w:t>Body:</w:t>
-      </w:r>
-    </w:p>
-    <w:p>
-      <w:r>
-        <w:t xml:space="preserve">  &gt; {firstName}, glad to have you back</w:t>
-      </w:r>
-    </w:p>
-    <w:p>
-      <w:r>
-        <w:t xml:space="preserve">  &gt; Your </w:t>
-      </w:r>
-      <w:r>
-        <w:rPr>
-          <w:b/>
-        </w:rPr>
-        <w:t>Recruiting ATS</w:t>
-      </w:r>
-      <w:r>
-        <w:t xml:space="preserve"> subscription for </w:t>
-      </w:r>
-      <w:r>
-        <w:rPr>
-          <w:b/>
-        </w:rPr>
-        <w:t>{orgName}</w:t>
-      </w:r>
-      <w:r>
-        <w:t xml:space="preserve"> is back on track. No cancellation pending.</w:t>
-      </w:r>
-    </w:p>
-    <w:p>
-      <w:r>
-        <w:t xml:space="preserve">  &gt; Next billing date: </w:t>
-      </w:r>
-      <w:r>
-        <w:rPr>
-          <w:b/>
-        </w:rPr>
-        <w:t>{date}</w:t>
-      </w:r>
-      <w:r>
-        <w:t>. Same plan, same seats — billing continues uninterrupted.</w:t>
-      </w:r>
-    </w:p>
-    <w:p>
-      <w:r>
-        <w:t xml:space="preserve">  &gt; If you reactivated by accident, you can cancel again from Settings → Billing.</w:t>
-      </w:r>
-    </w:p>
-    <w:p>
-      <w:r>
-        <w:t xml:space="preserve">  &gt; [Button: Open Dashboard]</w:t>
-      </w:r>
-    </w:p>
-    <w:p/>
-    <w:p>
-      <w:pPr>
-        <w:pStyle w:val="Heading3"/>
-      </w:pPr>
-      <w:r>
-        <w:t>25. Payment failed</w:t>
-      </w:r>
-    </w:p>
-    <w:p>
-      <w:pPr>
-        <w:pStyle w:val="ListBullet"/>
-      </w:pPr>
-      <w:r>
-        <w:t>Cuándo: Stripe no pudo cobrar la tarjeta (decline, expirada, etc).</w:t>
-      </w:r>
-    </w:p>
-    <w:p>
-      <w:pPr>
-        <w:pStyle w:val="ListBullet"/>
-      </w:pPr>
-      <w:r>
-        <w:t>Subject: Action required: payment failed for Recruiting ATS</w:t>
-      </w:r>
-    </w:p>
-    <w:p>
-      <w:pPr>
-        <w:pStyle w:val="ListBullet"/>
-      </w:pPr>
-      <w:r>
-        <w:t>Body:</w:t>
-      </w:r>
-    </w:p>
-    <w:p>
-      <w:r>
-        <w:t xml:space="preserve">  &gt; {firstName}, your payment didn't go through</w:t>
-      </w:r>
-    </w:p>
-    <w:p>
-      <w:r>
-        <w:t xml:space="preserve">  &gt; We tried to charge your card for </w:t>
-      </w:r>
-      <w:r>
-        <w:rPr>
-          <w:b/>
-        </w:rPr>
-        <w:t>Recruiting ATS</w:t>
-      </w:r>
-      <w:r>
-        <w:t xml:space="preserve"> — </w:t>
-      </w:r>
-      <w:r>
-        <w:rPr>
-          <w:b/>
-        </w:rPr>
-        <w:t>{orgName}</w:t>
-      </w:r>
-      <w:r>
-        <w:t xml:space="preserve"> — and the bank declined it.</w:t>
-      </w:r>
-    </w:p>
-    <w:p>
-      <w:r>
-        <w:t xml:space="preserve">  &gt; To avoid losing access, update your payment method:</w:t>
-      </w:r>
-    </w:p>
-    <w:p>
-      <w:r>
-        <w:t xml:space="preserve">  &gt; [Button: Update payment method]</w:t>
+        <w:t>[Button: Update payment method]</w:t>
       </w:r>
     </w:p>
     <w:p/>

</xml_diff>